<commit_message>
Add RuPac and LaPlas article corrections
</commit_message>
<xml_diff>
--- a/2026/LaPlas'26/Публикация ЯФиИ/Статья LaPlas'26 Proton (corr).docx
+++ b/2026/LaPlas'26/Публикация ЯФиИ/Статья LaPlas'26 Proton (corr).docx
@@ -1,6 +1,6 @@
 
 <file path=word/document.xml><?xml version="1.0" encoding="utf-8"?>
-<w:document xmlns:wpc="http://schemas.microsoft.com/office/word/2010/wordprocessingCanvas" xmlns:cx="http://schemas.microsoft.com/office/drawing/2014/chartex" xmlns:cx1="http://schemas.microsoft.com/office/drawing/2015/9/8/chartex" xmlns:cx2="http://schemas.microsoft.com/office/drawing/2015/10/21/chartex" xmlns:cx3="http://schemas.microsoft.com/office/drawing/2016/5/9/chartex" xmlns:cx4="http://schemas.microsoft.com/office/drawing/2016/5/10/chartex" xmlns:cx5="http://schemas.microsoft.com/office/drawing/2016/5/11/chartex" xmlns:cx6="http://schemas.microsoft.com/office/drawing/2016/5/12/chartex" xmlns:cx7="http://schemas.microsoft.com/office/drawing/2016/5/13/chartex" xmlns:cx8="http://schemas.microsoft.com/office/drawing/2016/5/14/chartex" xmlns:mc="http://schemas.openxmlformats.org/markup-compatibility/2006" xmlns:aink="http://schemas.microsoft.com/office/drawing/2016/ink" xmlns:am3d="http://schemas.microsoft.com/office/drawing/2017/model3d" xmlns:o="urn:schemas-microsoft-com:office:office" xmlns:oel="http://schemas.microsoft.com/office/2019/extlst" xmlns:r="http://schemas.openxmlformats.org/officeDocument/2006/relationships" xmlns:m="http://schemas.openxmlformats.org/officeDocument/2006/math" xmlns:v="urn:schemas-microsoft-com:vml" xmlns:wp14="http://schemas.microsoft.com/office/word/2010/wordprocessingDrawing" xmlns:wp="http://schemas.openxmlformats.org/drawingml/2006/wordprocessingDrawing" xmlns:w10="urn:schemas-microsoft-com:office:word" xmlns:w="http://schemas.openxmlformats.org/wordprocessingml/2006/main" xmlns:w14="http://schemas.microsoft.com/office/word/2010/wordml" xmlns:w15="http://schemas.microsoft.com/office/word/2012/wordml" xmlns:w16cex="http://schemas.microsoft.com/office/word/2018/wordml/cex" xmlns:w16cid="http://schemas.microsoft.com/office/word/2016/wordml/cid" xmlns:w16="http://schemas.microsoft.com/office/word/2018/wordml" xmlns:w16sdtdh="http://schemas.microsoft.com/office/word/2020/wordml/sdtdatahash" xmlns:w16se="http://schemas.microsoft.com/office/word/2015/wordml/symex" xmlns:wpg="http://schemas.microsoft.com/office/word/2010/wordprocessingGroup" xmlns:wpi="http://schemas.microsoft.com/office/word/2010/wordprocessingInk" xmlns:wne="http://schemas.microsoft.com/office/word/2006/wordml" xmlns:wps="http://schemas.microsoft.com/office/word/2010/wordprocessingShape" mc:Ignorable="w14 w15 w16se w16cid w16 w16cex w16sdtdh wp14">
+<w:document xmlns:wpc="http://schemas.microsoft.com/office/word/2010/wordprocessingCanvas" xmlns:cx="http://schemas.microsoft.com/office/drawing/2014/chartex" xmlns:cx1="http://schemas.microsoft.com/office/drawing/2015/9/8/chartex" xmlns:cx2="http://schemas.microsoft.com/office/drawing/2015/10/21/chartex" xmlns:cx3="http://schemas.microsoft.com/office/drawing/2016/5/9/chartex" xmlns:cx4="http://schemas.microsoft.com/office/drawing/2016/5/10/chartex" xmlns:cx5="http://schemas.microsoft.com/office/drawing/2016/5/11/chartex" xmlns:cx6="http://schemas.microsoft.com/office/drawing/2016/5/12/chartex" xmlns:cx7="http://schemas.microsoft.com/office/drawing/2016/5/13/chartex" xmlns:cx8="http://schemas.microsoft.com/office/drawing/2016/5/14/chartex" xmlns:mc="http://schemas.openxmlformats.org/markup-compatibility/2006" xmlns:aink="http://schemas.microsoft.com/office/drawing/2016/ink" xmlns:am3d="http://schemas.microsoft.com/office/drawing/2017/model3d" xmlns:o="urn:schemas-microsoft-com:office:office" xmlns:r="http://schemas.openxmlformats.org/officeDocument/2006/relationships" xmlns:m="http://schemas.openxmlformats.org/officeDocument/2006/math" xmlns:v="urn:schemas-microsoft-com:vml" xmlns:wp14="http://schemas.microsoft.com/office/word/2010/wordprocessingDrawing" xmlns:wp="http://schemas.openxmlformats.org/drawingml/2006/wordprocessingDrawing" xmlns:w10="urn:schemas-microsoft-com:office:word" xmlns:w="http://schemas.openxmlformats.org/wordprocessingml/2006/main" xmlns:w14="http://schemas.microsoft.com/office/word/2010/wordml" xmlns:w15="http://schemas.microsoft.com/office/word/2012/wordml" xmlns:w16cex="http://schemas.microsoft.com/office/word/2018/wordml/cex" xmlns:w16cid="http://schemas.microsoft.com/office/word/2016/wordml/cid" xmlns:w16="http://schemas.microsoft.com/office/word/2018/wordml" xmlns:w16sdtdh="http://schemas.microsoft.com/office/word/2020/wordml/sdtdatahash" xmlns:w16se="http://schemas.microsoft.com/office/word/2015/wordml/symex" xmlns:wpg="http://schemas.microsoft.com/office/word/2010/wordprocessingGroup" xmlns:wpi="http://schemas.microsoft.com/office/word/2010/wordprocessingInk" xmlns:wne="http://schemas.microsoft.com/office/word/2006/wordml" xmlns:wps="http://schemas.microsoft.com/office/word/2010/wordprocessingShape" mc:Ignorable="w14 w15 w16se w16cid w16 w16cex w16sdtdh wp14">
   <w:body>
     <w:p>
       <w:pPr>
@@ -13,7 +13,9 @@
           <w:lang w:val="ru-RU"/>
         </w:rPr>
       </w:pPr>
-      <w:bookmarkStart w:id="0" w:name="_Hlk54000915"/>
+      <w:bookmarkStart w:id="0" w:name="_Hlk226375289"/>
+      <w:bookmarkStart w:id="1" w:name="_Hlk54000915"/>
+      <w:bookmarkEnd w:id="0"/>
       <w:r>
         <w:rPr>
           <w:rFonts w:ascii="Times New Roman" w:hAnsi="Times New Roman"/>
@@ -59,23 +61,19 @@
       <w:pPr>
         <w:pStyle w:val="ac"/>
         <w:rPr>
-          <w:i/>
-          <w:iCs/>
           <w:sz w:val="28"/>
           <w:szCs w:val="28"/>
         </w:rPr>
       </w:pPr>
       <w:r>
         <w:rPr>
-          <w:i/>
-          <w:iCs/>
           <w:sz w:val="28"/>
           <w:szCs w:val="28"/>
         </w:rPr>
         <w:t>УДК 621.384.6</w:t>
       </w:r>
     </w:p>
-    <w:bookmarkEnd w:id="0"/>
+    <w:bookmarkEnd w:id="1"/>
     <w:p>
       <w:pPr>
         <w:pStyle w:val="a3"/>
@@ -706,7 +704,7 @@
           <w:szCs w:val="24"/>
           <w:lang w:val="ru-RU"/>
         </w:rPr>
-        <w:t>Московский инженерно-физический институт, Москва</w:t>
+        <w:t>Национальный исследовательский ядерный университет «МИФИ»</w:t>
       </w:r>
       <w:r>
         <w:rPr>
@@ -736,7 +734,7 @@
           <w:szCs w:val="24"/>
           <w:lang w:val="ru-RU"/>
         </w:rPr>
-        <w:t>Россия</w:t>
+        <w:t>Москва</w:t>
       </w:r>
       <w:r>
         <w:rPr>
@@ -746,7 +744,17 @@
           <w:szCs w:val="24"/>
           <w:lang w:val="ru-RU"/>
         </w:rPr>
-        <w:t>,</w:t>
+        <w:t xml:space="preserve">, </w:t>
+      </w:r>
+      <w:r>
+        <w:rPr>
+          <w:i/>
+          <w:iCs/>
+          <w:sz w:val="24"/>
+          <w:szCs w:val="24"/>
+          <w:lang w:val="ru-RU"/>
+        </w:rPr>
+        <w:t>Россия</w:t>
       </w:r>
     </w:p>
     <w:p>
@@ -963,11 +971,9 @@
     <w:p>
       <w:pPr>
         <w:pStyle w:val="Abstract"/>
-        <w:spacing w:after="0"/>
         <w:ind w:left="0"/>
         <w:rPr>
           <w:rFonts w:ascii="Times New Roman" w:eastAsiaTheme="minorHAnsi" w:hAnsi="Times New Roman"/>
-          <w:color w:val="auto"/>
           <w:sz w:val="24"/>
           <w:szCs w:val="24"/>
           <w:lang w:val="ru-RU"/>
@@ -1052,104 +1058,308 @@
           <w:shd w:val="clear" w:color="auto" w:fill="FFFFFF"/>
           <w:lang w:val="ru-RU"/>
         </w:rPr>
-        <w:t>Реализация проекта коллайдера тяжелых ионов и протонов NICA (Nuclotron-</w:t>
-      </w:r>
-      <w:proofErr w:type="spellStart"/>
+        <w:t>Реализация проекта коллайдера тяжелых ионов и протонов NICA (Nuclotron-based Ion Collider fAcility) направлена на достижение высокой светимости</w:t>
+      </w:r>
       <w:r>
         <w:rPr>
           <w:shd w:val="clear" w:color="auto" w:fill="FFFFFF"/>
           <w:lang w:val="ru-RU"/>
         </w:rPr>
-        <w:t>based</w:t>
-      </w:r>
-      <w:proofErr w:type="spellEnd"/>
+        <w:t xml:space="preserve"> </w:t>
+      </w:r>
+      <m:oMath>
+        <m:r>
+          <w:rPr>
+            <w:rFonts w:ascii="Cambria Math" w:hAnsi="Cambria Math"/>
+            <w:shd w:val="clear" w:color="auto" w:fill="FFFFFF"/>
+            <w:lang w:val="ru-RU"/>
+          </w:rPr>
+          <m:t>L</m:t>
+        </m:r>
+        <m:r>
+          <w:rPr>
+            <w:rFonts w:ascii="Cambria Math" w:hAnsi="Cambria Math"/>
+            <w:shd w:val="clear" w:color="auto" w:fill="FFFFFF"/>
+            <w:lang w:val="ru-RU"/>
+          </w:rPr>
+          <m:t xml:space="preserve"> </m:t>
+        </m:r>
+        <m:r>
+          <w:rPr>
+            <w:rFonts w:ascii="Cambria Math" w:hAnsi="Cambria Math"/>
+            <w:shd w:val="clear" w:color="auto" w:fill="FFFFFF"/>
+            <w:lang w:val="ru-RU"/>
+          </w:rPr>
+          <m:t>~</m:t>
+        </m:r>
+        <m:r>
+          <w:rPr>
+            <w:rFonts w:ascii="Cambria Math" w:hAnsi="Cambria Math"/>
+            <w:shd w:val="clear" w:color="auto" w:fill="FFFFFF"/>
+            <w:lang w:val="ru-RU"/>
+          </w:rPr>
+          <m:t xml:space="preserve"> </m:t>
+        </m:r>
+        <m:r>
+          <w:rPr>
+            <w:rFonts w:ascii="Cambria Math" w:eastAsiaTheme="minorEastAsia" w:hAnsi="Cambria Math" w:cstheme="minorHAnsi"/>
+            <w:lang w:val="ru-RU"/>
+          </w:rPr>
+          <m:t>2×</m:t>
+        </m:r>
+        <m:sSup>
+          <m:sSupPr>
+            <m:ctrlPr>
+              <w:rPr>
+                <w:rFonts w:ascii="Cambria Math" w:eastAsiaTheme="minorEastAsia" w:hAnsi="Cambria Math" w:cstheme="minorHAnsi"/>
+                <w:i/>
+                <w:lang w:val="ru-RU"/>
+              </w:rPr>
+            </m:ctrlPr>
+          </m:sSupPr>
+          <m:e>
+            <m:r>
+              <w:rPr>
+                <w:rFonts w:ascii="Cambria Math" w:eastAsiaTheme="minorEastAsia" w:hAnsi="Cambria Math" w:cstheme="minorHAnsi"/>
+                <w:lang w:val="ru-RU"/>
+              </w:rPr>
+              <m:t>10</m:t>
+            </m:r>
+          </m:e>
+          <m:sup>
+            <m:r>
+              <w:rPr>
+                <w:rFonts w:ascii="Cambria Math" w:eastAsiaTheme="minorEastAsia" w:hAnsi="Cambria Math" w:cstheme="minorHAnsi"/>
+                <w:lang w:val="ru-RU"/>
+              </w:rPr>
+              <m:t>32</m:t>
+            </m:r>
+          </m:sup>
+        </m:sSup>
+        <m:r>
+          <w:rPr>
+            <w:rFonts w:ascii="Cambria Math" w:eastAsiaTheme="minorEastAsia" w:hAnsi="Cambria Math" w:cstheme="minorHAnsi"/>
+            <w:lang w:val="ru-RU"/>
+          </w:rPr>
+          <m:t xml:space="preserve"> </m:t>
+        </m:r>
+        <m:sSup>
+          <m:sSupPr>
+            <m:ctrlPr>
+              <w:rPr>
+                <w:rFonts w:ascii="Cambria Math" w:eastAsiaTheme="minorEastAsia" w:hAnsi="Cambria Math" w:cstheme="minorHAnsi"/>
+                <w:i/>
+                <w:lang w:val="ru-RU"/>
+              </w:rPr>
+            </m:ctrlPr>
+          </m:sSupPr>
+          <m:e>
+            <m:r>
+              <w:rPr>
+                <w:rFonts w:ascii="Cambria Math" w:eastAsiaTheme="minorEastAsia" w:hAnsi="Cambria Math" w:cstheme="minorHAnsi"/>
+                <w:lang w:val="ru-RU"/>
+              </w:rPr>
+              <m:t>см</m:t>
+            </m:r>
+          </m:e>
+          <m:sup>
+            <m:r>
+              <w:rPr>
+                <w:rFonts w:ascii="Cambria Math" w:eastAsiaTheme="minorEastAsia" w:hAnsi="Cambria Math" w:cstheme="minorHAnsi"/>
+                <w:lang w:val="ru-RU"/>
+              </w:rPr>
+              <m:t>-2</m:t>
+            </m:r>
+          </m:sup>
+        </m:sSup>
+        <m:sSup>
+          <m:sSupPr>
+            <m:ctrlPr>
+              <w:rPr>
+                <w:rFonts w:ascii="Cambria Math" w:eastAsiaTheme="minorEastAsia" w:hAnsi="Cambria Math" w:cstheme="minorHAnsi"/>
+                <w:i/>
+                <w:lang w:val="ru-RU"/>
+              </w:rPr>
+            </m:ctrlPr>
+          </m:sSupPr>
+          <m:e>
+            <m:r>
+              <w:rPr>
+                <w:rFonts w:ascii="Cambria Math" w:eastAsiaTheme="minorEastAsia" w:hAnsi="Cambria Math" w:cstheme="minorHAnsi"/>
+                <w:lang w:val="ru-RU"/>
+              </w:rPr>
+              <m:t>с</m:t>
+            </m:r>
+          </m:e>
+          <m:sup>
+            <m:r>
+              <w:rPr>
+                <w:rFonts w:ascii="Cambria Math" w:eastAsiaTheme="minorEastAsia" w:hAnsi="Cambria Math" w:cstheme="minorHAnsi"/>
+                <w:lang w:val="ru-RU"/>
+              </w:rPr>
+              <m:t>-1</m:t>
+            </m:r>
+          </m:sup>
+        </m:sSup>
+      </m:oMath>
+      <w:r>
+        <w:rPr>
+          <w:rFonts w:eastAsiaTheme="minorEastAsia" w:cstheme="minorHAnsi"/>
+          <w:lang w:val="ru-RU"/>
+        </w:rPr>
+        <w:t xml:space="preserve"> </w:t>
+      </w:r>
       <w:r>
         <w:rPr>
           <w:shd w:val="clear" w:color="auto" w:fill="FFFFFF"/>
           <w:lang w:val="ru-RU"/>
         </w:rPr>
+        <w:t xml:space="preserve"> в экспериментах, что накладывает жесткие требования на параметры пучка</w:t>
+      </w:r>
+      <w:r>
+        <w:rPr>
+          <w:shd w:val="clear" w:color="auto" w:fill="FFFFFF"/>
+          <w:lang w:val="ru-RU"/>
+        </w:rPr>
         <w:t xml:space="preserve"> </w:t>
       </w:r>
-      <w:proofErr w:type="spellStart"/>
       <w:r>
         <w:rPr>
           <w:shd w:val="clear" w:color="auto" w:fill="FFFFFF"/>
           <w:lang w:val="ru-RU"/>
         </w:rPr>
-        <w:t>Ion</w:t>
-      </w:r>
-      <w:proofErr w:type="spellEnd"/>
+        <w:t>[1]</w:t>
+      </w:r>
       <w:r>
         <w:rPr>
           <w:shd w:val="clear" w:color="auto" w:fill="FFFFFF"/>
           <w:lang w:val="ru-RU"/>
         </w:rPr>
+        <w:t>.</w:t>
+      </w:r>
+      <w:r>
+        <w:rPr>
+          <w:shd w:val="clear" w:color="auto" w:fill="FFFFFF"/>
+          <w:lang w:val="ru-RU"/>
+        </w:rPr>
         <w:t xml:space="preserve"> </w:t>
       </w:r>
-      <w:proofErr w:type="spellStart"/>
       <w:r>
         <w:rPr>
           <w:shd w:val="clear" w:color="auto" w:fill="FFFFFF"/>
           <w:lang w:val="ru-RU"/>
         </w:rPr>
-        <w:t>Collider</w:t>
-      </w:r>
-      <w:proofErr w:type="spellEnd"/>
+        <w:t xml:space="preserve">Одной из </w:t>
+      </w:r>
       <w:r>
         <w:rPr>
           <w:shd w:val="clear" w:color="auto" w:fill="FFFFFF"/>
           <w:lang w:val="ru-RU"/>
         </w:rPr>
-        <w:t xml:space="preserve"> fAcility) направлена на достижение высокой светимости в экспериментах, что накладывает жесткие требования на параметры пучка</w:t>
+        <w:t>ключевых</w:t>
       </w:r>
       <w:r>
         <w:rPr>
           <w:shd w:val="clear" w:color="auto" w:fill="FFFFFF"/>
           <w:lang w:val="ru-RU"/>
         </w:rPr>
+        <w:t xml:space="preserve"> проблем при ускорении интенсивного протонного пучка</w:t>
+      </w:r>
+      <w:r>
+        <w:rPr>
+          <w:shd w:val="clear" w:color="auto" w:fill="FFFFFF"/>
+          <w:lang w:val="ru-RU"/>
+        </w:rPr>
+        <w:t xml:space="preserve"> (</w:t>
+      </w:r>
+      <m:oMath>
+        <m:r>
+          <w:rPr>
+            <w:rFonts w:ascii="Cambria Math" w:hAnsi="Cambria Math"/>
+            <w:shd w:val="clear" w:color="auto" w:fill="FFFFFF"/>
+            <w:lang w:val="ru-RU"/>
+          </w:rPr>
+          <m:t>N</m:t>
+        </m:r>
+        <m:r>
+          <w:rPr>
+            <w:rFonts w:ascii="Cambria Math" w:hAnsi="Cambria Math"/>
+            <w:shd w:val="clear" w:color="auto" w:fill="FFFFFF"/>
+            <w:lang w:val="ru-RU"/>
+          </w:rPr>
+          <m:t xml:space="preserve"> </m:t>
+        </m:r>
+        <m:r>
+          <w:rPr>
+            <w:rFonts w:ascii="Cambria Math" w:hAnsi="Cambria Math"/>
+            <w:shd w:val="clear" w:color="auto" w:fill="FFFFFF"/>
+            <w:lang w:val="ru-RU"/>
+          </w:rPr>
+          <m:t>~</m:t>
+        </m:r>
+        <m:r>
+          <w:rPr>
+            <w:rFonts w:ascii="Cambria Math" w:hAnsi="Cambria Math"/>
+            <w:shd w:val="clear" w:color="auto" w:fill="FFFFFF"/>
+            <w:lang w:val="ru-RU"/>
+          </w:rPr>
+          <m:t xml:space="preserve"> </m:t>
+        </m:r>
+        <m:sSup>
+          <m:sSupPr>
+            <m:ctrlPr>
+              <w:rPr>
+                <w:rFonts w:ascii="Cambria Math" w:eastAsiaTheme="minorEastAsia" w:hAnsi="Cambria Math" w:cstheme="minorHAnsi"/>
+                <w:i/>
+                <w:lang w:val="ru-RU"/>
+              </w:rPr>
+            </m:ctrlPr>
+          </m:sSupPr>
+          <m:e>
+            <m:r>
+              <w:rPr>
+                <w:rFonts w:ascii="Cambria Math" w:eastAsiaTheme="minorEastAsia" w:hAnsi="Cambria Math" w:cstheme="minorHAnsi"/>
+                <w:lang w:val="ru-RU"/>
+              </w:rPr>
+              <m:t>10</m:t>
+            </m:r>
+          </m:e>
+          <m:sup>
+            <m:r>
+              <w:rPr>
+                <w:rFonts w:ascii="Cambria Math" w:eastAsiaTheme="minorEastAsia" w:hAnsi="Cambria Math" w:cstheme="minorHAnsi"/>
+                <w:lang w:val="ru-RU"/>
+              </w:rPr>
+              <m:t>12</m:t>
+            </m:r>
+          </m:sup>
+        </m:sSup>
+      </m:oMath>
+      <w:r>
+        <w:rPr>
+          <w:lang w:val="ru-RU"/>
+        </w:rPr>
         <w:t xml:space="preserve"> </w:t>
       </w:r>
       <w:r>
         <w:rPr>
+          <w:lang w:val="ru-RU"/>
+        </w:rPr>
+        <w:t>частиц в сгустке</w:t>
+      </w:r>
+      <w:r>
+        <w:rPr>
           <w:shd w:val="clear" w:color="auto" w:fill="FFFFFF"/>
           <w:lang w:val="ru-RU"/>
         </w:rPr>
-        <w:t>[1]</w:t>
+        <w:t>)</w:t>
       </w:r>
       <w:r>
         <w:rPr>
           <w:shd w:val="clear" w:color="auto" w:fill="FFFFFF"/>
           <w:lang w:val="ru-RU"/>
         </w:rPr>
-        <w:t>.</w:t>
-      </w:r>
-      <w:r>
-        <w:rPr>
-          <w:shd w:val="clear" w:color="auto" w:fill="FFFFFF"/>
-          <w:lang w:val="ru-RU"/>
-        </w:rPr>
-        <w:t xml:space="preserve"> </w:t>
-      </w:r>
-      <w:r>
-        <w:rPr>
-          <w:shd w:val="clear" w:color="auto" w:fill="FFFFFF"/>
-          <w:lang w:val="ru-RU"/>
-        </w:rPr>
-        <w:t xml:space="preserve">Одной из </w:t>
-      </w:r>
-      <w:r>
-        <w:rPr>
-          <w:shd w:val="clear" w:color="auto" w:fill="FFFFFF"/>
-          <w:lang w:val="ru-RU"/>
-        </w:rPr>
-        <w:t>ключевых</w:t>
-      </w:r>
-      <w:r>
-        <w:rPr>
-          <w:shd w:val="clear" w:color="auto" w:fill="FFFFFF"/>
-          <w:lang w:val="ru-RU"/>
-        </w:rPr>
-        <w:t xml:space="preserve"> проблем при ускорении интенсивного протонного пучка является прохождение критической энергии</w:t>
+        <w:t xml:space="preserve"> является прохождение критической энергии</w:t>
       </w:r>
       <w:r>
         <w:rPr>
@@ -1187,7 +1397,6 @@
     </w:p>
     <w:p>
       <w:pPr>
-        <w:ind w:firstLine="708"/>
         <w:contextualSpacing/>
         <w:jc w:val="both"/>
         <w:rPr>
@@ -1267,7 +1476,79 @@
         <w:rPr>
           <w:lang w:val="ru-RU"/>
         </w:rPr>
-        <w:t>Внутрипучковое рассеяние (ВПР) выступает доминирующим фактором деградации пучка тяжелых ионов из-за их высокой зарядности, что ведет к быстрому росту эмиттанса. В случае протонного пучка интенсивность рассеяния существенно ниже, однако достижение проектной светимости требует высокой плотности сгустка, что делает учет ВПР необходимым при оценке времени жизни пучка.</w:t>
+        <w:t>Внутрипучковое рассеяние (ВПР) является одним из основных механизмов</w:t>
+      </w:r>
+      <w:r>
+        <w:rPr>
+          <w:lang w:val="ru-RU"/>
+        </w:rPr>
+        <w:t xml:space="preserve"> деградации пучка тяжелых ионов </w:t>
+      </w:r>
+      <w:r>
+        <w:rPr>
+          <w:lang w:val="ru-RU"/>
+        </w:rPr>
+        <w:t>вследствие их</w:t>
+      </w:r>
+      <w:r>
+        <w:rPr>
+          <w:lang w:val="ru-RU"/>
+        </w:rPr>
+        <w:t xml:space="preserve"> </w:t>
+      </w:r>
+      <w:r>
+        <w:rPr>
+          <w:lang w:val="ru-RU"/>
+        </w:rPr>
+        <w:t xml:space="preserve">высокой зарядности, что ведет к </w:t>
+      </w:r>
+      <w:r>
+        <w:rPr>
+          <w:lang w:val="ru-RU"/>
+        </w:rPr>
+        <w:t xml:space="preserve">интенсивному росту </w:t>
+      </w:r>
+      <w:r>
+        <w:rPr>
+          <w:lang w:val="ru-RU"/>
+        </w:rPr>
+        <w:t xml:space="preserve">эмиттанса. </w:t>
+      </w:r>
+      <w:r>
+        <w:rPr>
+          <w:lang w:val="ru-RU"/>
+        </w:rPr>
+        <w:t>Для протонного пучка эффект ВПР существенно слабее, однако при достижении проектной светимости коллайдера</w:t>
+      </w:r>
+      <w:r>
+        <w:rPr>
+          <w:lang w:val="ru-RU"/>
+        </w:rPr>
+        <w:t xml:space="preserve"> </w:t>
+      </w:r>
+      <w:r>
+        <w:rPr>
+          <w:lang w:val="ru-RU"/>
+        </w:rPr>
+        <w:t>требуется высокая плотность сгустка</w:t>
+      </w:r>
+      <w:r>
+        <w:rPr>
+          <w:lang w:val="ru-RU"/>
+        </w:rPr>
+        <w:t>, что делает уч</w:t>
+      </w:r>
+      <w:r>
+        <w:rPr>
+          <w:lang w:val="ru-RU"/>
+        </w:rPr>
+        <w:t>ё</w:t>
+      </w:r>
+      <w:r>
+        <w:rPr>
+          <w:lang w:val="ru-RU"/>
+        </w:rPr>
+        <w:t>т ВПР необходимым при оценке времени жизни пучка.</w:t>
       </w:r>
     </w:p>
     <w:p>
@@ -1291,6 +1572,7 @@
         <w:adjustRightInd w:val="0"/>
         <w:jc w:val="both"/>
         <w:rPr>
+          <w:i/>
           <w:lang w:val="ru-RU"/>
         </w:rPr>
       </w:pPr>
@@ -1298,56 +1580,110 @@
         <w:rPr>
           <w:lang w:val="ru-RU"/>
         </w:rPr>
-        <w:tab/>
-      </w:r>
-      <w:r>
-        <w:rPr>
-          <w:lang w:val="ru-RU"/>
-        </w:rPr>
-        <w:t>Скорость роста эмиттанса напрямую зависит от характеристик магнитооптической структуры — от распределения бета-функций и дисперсии. В регулярной структуре (</w:t>
-      </w:r>
-      <w:r>
-        <w:rPr>
-          <w:lang w:val="ru-RU"/>
-        </w:rPr>
-        <w:t>рис. 1</w:t>
-      </w:r>
-      <w:r>
-        <w:rPr>
-          <w:lang w:val="ru-RU"/>
-        </w:rPr>
-        <w:t xml:space="preserve">) эти параметры распределены равномерно и принимают минимальные значения, что минимизирует интенсивность рассеяния и делает такую конфигурацию оптимальной. </w:t>
+        <w:t>Скорость роста эмиттанса напрямую зависит от характеристик магнитооптической структуры —</w:t>
+      </w:r>
+      <w:r>
+        <w:rPr>
+          <w:lang w:val="ru-RU"/>
+        </w:rPr>
+        <w:t xml:space="preserve"> </w:t>
+      </w:r>
+      <w:r>
+        <w:rPr>
+          <w:lang w:val="ru-RU"/>
+        </w:rPr>
+        <w:t>величины</w:t>
+      </w:r>
+      <w:r>
+        <w:rPr>
+          <w:lang w:val="ru-RU"/>
+        </w:rPr>
+        <w:t xml:space="preserve"> и </w:t>
+      </w:r>
+      <w:r>
+        <w:rPr>
+          <w:lang w:val="ru-RU"/>
+        </w:rPr>
+        <w:t>распределени</w:t>
+      </w:r>
+      <w:r>
+        <w:rPr>
+          <w:lang w:val="ru-RU"/>
+        </w:rPr>
+        <w:t>я</w:t>
+      </w:r>
+      <w:r>
+        <w:rPr>
+          <w:lang w:val="ru-RU"/>
+        </w:rPr>
+        <w:t xml:space="preserve"> бета-функци</w:t>
+      </w:r>
+      <w:r>
+        <w:rPr>
+          <w:lang w:val="ru-RU"/>
+        </w:rPr>
+        <w:t>й</w:t>
+      </w:r>
+      <w:r>
+        <w:rPr>
+          <w:lang w:val="ru-RU"/>
+        </w:rPr>
+        <w:t xml:space="preserve"> и дисперси</w:t>
+      </w:r>
+      <w:r>
+        <w:rPr>
+          <w:lang w:val="ru-RU"/>
+        </w:rPr>
+        <w:t>й</w:t>
+      </w:r>
+      <w:r>
+        <w:rPr>
+          <w:lang w:val="ru-RU"/>
+        </w:rPr>
+        <w:t xml:space="preserve">. </w:t>
+      </w:r>
+      <w:r>
+        <w:rPr>
+          <w:lang w:val="ru-RU"/>
+        </w:rPr>
+        <w:t>Р</w:t>
+      </w:r>
+      <w:r>
+        <w:rPr>
+          <w:lang w:val="ru-RU"/>
+        </w:rPr>
+        <w:t>егулярн</w:t>
+      </w:r>
+      <w:r>
+        <w:rPr>
+          <w:lang w:val="ru-RU"/>
+        </w:rPr>
+        <w:t>ая</w:t>
+      </w:r>
+      <w:r>
+        <w:rPr>
+          <w:lang w:val="ru-RU"/>
+        </w:rPr>
+        <w:t xml:space="preserve"> </w:t>
       </w:r>
       <w:r>
         <w:rPr>
           <w:lang w:val="ru-RU"/>
         </w:rPr>
         <w:lastRenderedPageBreak/>
-        <w:t>Переход к резонансной структуре</w:t>
-      </w:r>
-      <w:r>
-        <w:rPr>
-          <w:lang w:val="ru-RU"/>
-        </w:rPr>
-        <w:t xml:space="preserve"> (рис. 2)</w:t>
-      </w:r>
-      <w:r>
-        <w:rPr>
-          <w:lang w:val="ru-RU"/>
-        </w:rPr>
-        <w:t xml:space="preserve"> необходим для управления критической энергией и её повышения выше энергии эксперимента, что особенно важно для протонного пучка. Концепция дуальной структуры была представлена ранее в работе [</w:t>
-      </w:r>
-      <w:r>
-        <w:rPr>
-          <w:lang w:val="ru-RU"/>
-        </w:rPr>
-        <w:t>2</w:t>
-      </w:r>
-      <w:r>
-        <w:rPr>
-          <w:lang w:val="ru-RU"/>
-        </w:rPr>
-        <w:t>].</w:t>
+        <w:t>структур</w:t>
+      </w:r>
+      <w:r>
+        <w:rPr>
+          <w:lang w:val="ru-RU"/>
+        </w:rPr>
+        <w:t xml:space="preserve">а поворотной арки коллайдера </w:t>
+      </w:r>
+      <w:r>
+        <w:rPr>
+          <w:lang w:val="en-US"/>
+        </w:rPr>
+        <w:t>NICA</w:t>
       </w:r>
       <w:r>
         <w:rPr>
@@ -1355,37 +1691,373 @@
         </w:rPr>
         <w:t xml:space="preserve"> </w:t>
       </w:r>
-      <w:proofErr w:type="spellStart"/>
-      <w:r>
-        <w:rPr>
-          <w:lang w:val="ru-RU"/>
-        </w:rPr>
-        <w:t>Твисс</w:t>
-      </w:r>
-      <w:proofErr w:type="spellEnd"/>
-      <w:r>
-        <w:rPr>
-          <w:lang w:val="ru-RU"/>
-        </w:rPr>
-        <w:t xml:space="preserve">-функции рассчитаны в </w:t>
+      <w:r>
+        <w:rPr>
+          <w:lang w:val="ru-RU"/>
+        </w:rPr>
+        <w:t>состоит из 12 ФОДО</w:t>
+      </w:r>
+      <w:r>
+        <w:rPr>
+          <w:lang w:val="ru-RU"/>
+        </w:rPr>
+        <w:t>-</w:t>
+      </w:r>
+      <w:r>
+        <w:rPr>
+          <w:lang w:val="ru-RU"/>
+        </w:rPr>
+        <w:t>ячеек.</w:t>
+      </w:r>
+      <w:r>
+        <w:rPr>
+          <w:lang w:val="ru-RU"/>
+        </w:rPr>
+        <w:t xml:space="preserve"> </w:t>
+      </w:r>
+      <w:r>
+        <w:rPr>
+          <w:lang w:val="ru-RU"/>
+        </w:rPr>
+        <w:t xml:space="preserve">Показанные </w:t>
+      </w:r>
+      <w:r>
+        <w:rPr>
+          <w:lang w:val="ru-RU"/>
+        </w:rPr>
+        <w:t>н</w:t>
+      </w:r>
+      <w:r>
+        <w:rPr>
+          <w:lang w:val="ru-RU"/>
+        </w:rPr>
+        <w:t>а рис. 1</w:t>
+      </w:r>
+      <w:r>
+        <w:rPr>
+          <w:lang w:val="ru-RU"/>
+        </w:rPr>
+        <w:t xml:space="preserve"> </w:t>
+      </w:r>
+      <w:r>
+        <w:rPr>
+          <w:lang w:val="ru-RU"/>
+        </w:rPr>
+        <w:t>п</w:t>
+      </w:r>
+      <w:r>
+        <w:rPr>
+          <w:lang w:val="ru-RU"/>
+        </w:rPr>
+        <w:t>араметры</w:t>
+      </w:r>
+      <w:r>
+        <w:rPr>
+          <w:lang w:val="ru-RU"/>
+        </w:rPr>
+        <w:t xml:space="preserve"> Твисса</w:t>
+      </w:r>
+      <w:r>
+        <w:rPr>
+          <w:lang w:val="ru-RU"/>
+        </w:rPr>
+        <w:t xml:space="preserve"> распределены равномерно и принимают минимальные значения, что минимизирует интенсивность рассеяния и делает такую конфигурацию оптимальной</w:t>
+      </w:r>
+      <w:r>
+        <w:rPr>
+          <w:lang w:val="ru-RU"/>
+        </w:rPr>
+        <w:t xml:space="preserve"> </w:t>
+      </w:r>
+      <w:r>
+        <w:rPr>
+          <w:lang w:val="ru-RU"/>
+        </w:rPr>
+        <w:t>[2]</w:t>
+      </w:r>
+      <w:r>
+        <w:rPr>
+          <w:lang w:val="ru-RU"/>
+        </w:rPr>
+        <w:t>.</w:t>
+      </w:r>
+      <w:r>
+        <w:rPr>
+          <w:lang w:val="ru-RU"/>
+        </w:rPr>
+        <w:t xml:space="preserve"> </w:t>
+      </w:r>
+      <w:r>
+        <w:rPr>
+          <w:lang w:val="ru-RU"/>
+        </w:rPr>
+        <w:t>Для данной конфигурации</w:t>
+      </w:r>
+      <w:r>
+        <w:rPr>
+          <w:lang w:val="ru-RU"/>
+        </w:rPr>
+        <w:t xml:space="preserve"> </w:t>
+      </w:r>
+      <w:r>
+        <w:rPr>
+          <w:lang w:val="ru-RU"/>
+        </w:rPr>
+        <w:t>время ВПР составляет</w:t>
+      </w:r>
+      <w:r>
+        <w:rPr>
+          <w:lang w:val="ru-RU"/>
+        </w:rPr>
+        <w:t xml:space="preserve"> </w:t>
+      </w:r>
+      <m:oMath>
+        <m:sSub>
+          <m:sSubPr>
+            <m:ctrlPr>
+              <w:rPr>
+                <w:rFonts w:ascii="Cambria Math" w:hAnsi="Cambria Math"/>
+                <w:i/>
+                <w:lang w:val="ru-RU"/>
+              </w:rPr>
+            </m:ctrlPr>
+          </m:sSubPr>
+          <m:e>
+            <m:r>
+              <w:rPr>
+                <w:rFonts w:ascii="Cambria Math" w:hAnsi="Cambria Math"/>
+                <w:lang w:val="ru-RU"/>
+              </w:rPr>
+              <m:t>τ</m:t>
+            </m:r>
+          </m:e>
+          <m:sub>
+            <m:r>
+              <w:rPr>
+                <w:rFonts w:ascii="Cambria Math" w:hAnsi="Cambria Math"/>
+                <w:lang w:val="en-US"/>
+              </w:rPr>
+              <m:t>IBS</m:t>
+            </m:r>
+          </m:sub>
+        </m:sSub>
+        <m:r>
+          <w:rPr>
+            <w:rFonts w:ascii="Cambria Math" w:hAnsi="Cambria Math"/>
+            <w:lang w:val="ru-RU"/>
+          </w:rPr>
+          <m:t>=1.4×</m:t>
+        </m:r>
+        <m:sSup>
+          <m:sSupPr>
+            <m:ctrlPr>
+              <w:rPr>
+                <w:rFonts w:ascii="Cambria Math" w:hAnsi="Cambria Math"/>
+                <w:i/>
+                <w:lang w:val="ru-RU"/>
+              </w:rPr>
+            </m:ctrlPr>
+          </m:sSupPr>
+          <m:e>
+            <m:r>
+              <w:rPr>
+                <w:rFonts w:ascii="Cambria Math" w:hAnsi="Cambria Math"/>
+                <w:lang w:val="ru-RU"/>
+              </w:rPr>
+              <m:t>10</m:t>
+            </m:r>
+          </m:e>
+          <m:sup>
+            <m:r>
+              <w:rPr>
+                <w:rFonts w:ascii="Cambria Math" w:hAnsi="Cambria Math"/>
+                <w:lang w:val="ru-RU"/>
+              </w:rPr>
+              <m:t>4</m:t>
+            </m:r>
+          </m:sup>
+        </m:sSup>
+      </m:oMath>
+      <w:r>
+        <w:rPr>
+          <w:lang w:val="ru-RU"/>
+        </w:rPr>
+        <w:t xml:space="preserve"> с</w:t>
+      </w:r>
+      <w:r>
+        <w:rPr>
+          <w:lang w:val="ru-RU"/>
+        </w:rPr>
+        <w:t xml:space="preserve"> </w:t>
+      </w:r>
+      <w:r>
+        <w:rPr>
+          <w:lang w:val="ru-RU"/>
+        </w:rPr>
+        <w:t>при энергии</w:t>
+      </w:r>
+      <w:r>
+        <w:rPr>
+          <w:lang w:val="ru-RU"/>
+        </w:rPr>
+        <w:t xml:space="preserve"> </w:t>
+      </w:r>
+      <w:r>
+        <w:rPr>
+          <w:lang w:val="ru-RU"/>
+        </w:rPr>
+        <w:t xml:space="preserve">эксперимента </w:t>
+      </w:r>
+      <m:oMath>
+        <m:sSub>
+          <m:sSubPr>
+            <m:ctrlPr>
+              <w:rPr>
+                <w:rFonts w:ascii="Cambria Math" w:hAnsi="Cambria Math"/>
+                <w:i/>
+                <w:lang w:val="ru-RU"/>
+              </w:rPr>
+            </m:ctrlPr>
+          </m:sSubPr>
+          <m:e>
+            <m:r>
+              <w:rPr>
+                <w:rFonts w:ascii="Cambria Math" w:hAnsi="Cambria Math"/>
+                <w:lang w:val="ru-RU"/>
+              </w:rPr>
+              <m:t>E</m:t>
+            </m:r>
+          </m:e>
+          <m:sub>
+            <m:r>
+              <m:rPr>
+                <m:nor/>
+              </m:rPr>
+              <w:rPr>
+                <w:rFonts w:ascii="Cambria Math" w:hAnsi="Cambria Math"/>
+                <w:lang w:val="en-US"/>
+              </w:rPr>
+              <m:t>exp</m:t>
+            </m:r>
+          </m:sub>
+        </m:sSub>
+        <m:r>
+          <w:rPr>
+            <w:rFonts w:ascii="Cambria Math" w:hAnsi="Cambria Math"/>
+            <w:lang w:val="ru-RU"/>
+          </w:rPr>
+          <m:t>=12.4</m:t>
+        </m:r>
+      </m:oMath>
+      <w:r>
+        <w:rPr>
+          <w:lang w:val="ru-RU"/>
+        </w:rPr>
+        <w:t xml:space="preserve"> </w:t>
+      </w:r>
+      <w:r>
+        <w:rPr>
+          <w:lang w:val="ru-RU"/>
+        </w:rPr>
+        <w:t>ГэВ</w:t>
+      </w:r>
+      <w:r>
+        <w:rPr>
+          <w:lang w:val="ru-RU"/>
+        </w:rPr>
+        <w:t xml:space="preserve"> и интенсивности сгустка </w:t>
+      </w:r>
+      <m:oMath>
+        <m:r>
+          <w:rPr>
+            <w:rFonts w:ascii="Cambria Math" w:hAnsi="Cambria Math"/>
+            <w:lang w:val="ru-RU"/>
+          </w:rPr>
+          <m:t>1.2×</m:t>
+        </m:r>
+        <m:sSup>
+          <m:sSupPr>
+            <m:ctrlPr>
+              <w:rPr>
+                <w:rFonts w:ascii="Cambria Math" w:hAnsi="Cambria Math"/>
+                <w:i/>
+                <w:lang w:val="ru-RU"/>
+              </w:rPr>
+            </m:ctrlPr>
+          </m:sSupPr>
+          <m:e>
+            <m:r>
+              <w:rPr>
+                <w:rFonts w:ascii="Cambria Math" w:hAnsi="Cambria Math"/>
+                <w:lang w:val="ru-RU"/>
+              </w:rPr>
+              <m:t>10</m:t>
+            </m:r>
+          </m:e>
+          <m:sup>
+            <m:r>
+              <w:rPr>
+                <w:rFonts w:ascii="Cambria Math" w:hAnsi="Cambria Math"/>
+                <w:lang w:val="ru-RU"/>
+              </w:rPr>
+              <m:t>12</m:t>
+            </m:r>
+          </m:sup>
+        </m:sSup>
+      </m:oMath>
+      <w:r>
+        <w:rPr>
+          <w:lang w:val="ru-RU"/>
+        </w:rPr>
+        <w:t xml:space="preserve"> </w:t>
       </w:r>
       <w:r>
         <w:rPr>
           <w:lang w:val="en-US"/>
         </w:rPr>
-        <w:t>OptiM</w:t>
-      </w:r>
-      <w:r>
-        <w:rPr>
-          <w:lang w:val="ru-RU"/>
-        </w:rPr>
-        <w:t xml:space="preserve"> [3].</w:t>
+        <w:t>ppb</w:t>
+      </w:r>
+      <w:r>
+        <w:rPr>
+          <w:lang w:val="ru-RU"/>
+        </w:rPr>
+        <w:t xml:space="preserve"> (</w:t>
+      </w:r>
+      <w:r>
+        <w:rPr>
+          <w:lang w:val="en-US"/>
+        </w:rPr>
+        <w:t>particles</w:t>
       </w:r>
       <w:r>
         <w:rPr>
           <w:lang w:val="ru-RU"/>
         </w:rPr>
         <w:t xml:space="preserve"> </w:t>
+      </w:r>
+      <w:r>
+        <w:rPr>
+          <w:lang w:val="en-US"/>
+        </w:rPr>
+        <w:t>per</w:t>
+      </w:r>
+      <w:r>
+        <w:rPr>
+          <w:lang w:val="ru-RU"/>
+        </w:rPr>
+        <w:t xml:space="preserve"> </w:t>
+      </w:r>
+      <w:r>
+        <w:rPr>
+          <w:lang w:val="en-US"/>
+        </w:rPr>
+        <w:t>bunch</w:t>
+      </w:r>
+      <w:r>
+        <w:rPr>
+          <w:lang w:val="ru-RU"/>
+        </w:rPr>
+        <w:t>).</w:t>
       </w:r>
     </w:p>
     <w:p>
@@ -1414,15 +2086,144 @@
       </w:pPr>
       <w:r>
         <w:rPr>
-          <w:lang w:val="ru-RU"/>
-        </w:rPr>
-        <w:tab/>
-      </w:r>
-      <w:r>
-        <w:rPr>
-          <w:lang w:val="ru-RU"/>
-        </w:rPr>
-        <w:t xml:space="preserve">Формирование резонансной структуры сопровождается глубокой модуляцией </w:t>
+          <w:iCs/>
+          <w:lang w:val="ru-RU"/>
+        </w:rPr>
+        <w:t>Введение суперпериодической модуляции приводи</w:t>
+      </w:r>
+      <w:r>
+        <w:rPr>
+          <w:iCs/>
+          <w:lang w:val="ru-RU"/>
+        </w:rPr>
+        <w:t>т</w:t>
+      </w:r>
+      <w:r>
+        <w:rPr>
+          <w:iCs/>
+          <w:lang w:val="ru-RU"/>
+        </w:rPr>
+        <w:t xml:space="preserve"> к изменению дисперсионной функции и</w:t>
+      </w:r>
+      <w:r>
+        <w:rPr>
+          <w:iCs/>
+          <w:lang w:val="ru-RU"/>
+        </w:rPr>
+        <w:t>,</w:t>
+      </w:r>
+      <w:r>
+        <w:rPr>
+          <w:iCs/>
+          <w:lang w:val="ru-RU"/>
+        </w:rPr>
+        <w:t xml:space="preserve"> как следствие</w:t>
+      </w:r>
+      <w:r>
+        <w:rPr>
+          <w:iCs/>
+          <w:lang w:val="ru-RU"/>
+        </w:rPr>
+        <w:t>,</w:t>
+      </w:r>
+      <w:r>
+        <w:rPr>
+          <w:iCs/>
+          <w:lang w:val="ru-RU"/>
+        </w:rPr>
+        <w:t xml:space="preserve"> вариации критической энергии. </w:t>
+      </w:r>
+      <w:r>
+        <w:rPr>
+          <w:lang w:val="ru-RU"/>
+        </w:rPr>
+        <w:t>Р</w:t>
+      </w:r>
+      <w:r>
+        <w:rPr>
+          <w:lang w:val="ru-RU"/>
+        </w:rPr>
+        <w:t>езонансн</w:t>
+      </w:r>
+      <w:r>
+        <w:rPr>
+          <w:lang w:val="ru-RU"/>
+        </w:rPr>
+        <w:t>ая</w:t>
+      </w:r>
+      <w:r>
+        <w:rPr>
+          <w:lang w:val="ru-RU"/>
+        </w:rPr>
+        <w:t xml:space="preserve"> структур</w:t>
+      </w:r>
+      <w:r>
+        <w:rPr>
+          <w:lang w:val="ru-RU"/>
+        </w:rPr>
+        <w:t xml:space="preserve">а </w:t>
+      </w:r>
+      <w:r>
+        <w:rPr>
+          <w:lang w:val="ru-RU"/>
+        </w:rPr>
+        <w:t>необходим</w:t>
+      </w:r>
+      <w:r>
+        <w:rPr>
+          <w:lang w:val="ru-RU"/>
+        </w:rPr>
+        <w:t>а</w:t>
+      </w:r>
+      <w:r>
+        <w:rPr>
+          <w:lang w:val="ru-RU"/>
+        </w:rPr>
+        <w:t xml:space="preserve"> для управления критической энергией и её повышения выше энергии эксперимента, что особенно важно для протонного пучка. Концепция дуальной структуры была представлена ранее в работе [</w:t>
+      </w:r>
+      <w:r>
+        <w:rPr>
+          <w:lang w:val="ru-RU"/>
+        </w:rPr>
+        <w:t>3</w:t>
+      </w:r>
+      <w:r>
+        <w:rPr>
+          <w:lang w:val="ru-RU"/>
+        </w:rPr>
+        <w:t>].</w:t>
+      </w:r>
+      <w:r>
+        <w:rPr>
+          <w:lang w:val="ru-RU"/>
+        </w:rPr>
+        <w:t xml:space="preserve"> </w:t>
+      </w:r>
+      <w:r>
+        <w:rPr>
+          <w:lang w:val="ru-RU"/>
+        </w:rPr>
+        <w:t>Однако</w:t>
+      </w:r>
+      <w:r>
+        <w:rPr>
+          <w:iCs/>
+          <w:lang w:val="ru-RU"/>
+        </w:rPr>
+        <w:t xml:space="preserve"> п</w:t>
+      </w:r>
+      <w:r>
+        <w:rPr>
+          <w:iCs/>
+          <w:lang w:val="ru-RU"/>
+        </w:rPr>
+        <w:t xml:space="preserve">ереход от регулярной структуры к резонансной </w:t>
+      </w:r>
+      <w:r>
+        <w:rPr>
+          <w:lang w:val="ru-RU"/>
+        </w:rPr>
+        <w:t xml:space="preserve">сопровождается глубокой модуляцией </w:t>
       </w:r>
       <w:r>
         <w:rPr>
@@ -1434,21 +2235,49 @@
         <w:rPr>
           <w:lang w:val="ru-RU"/>
         </w:rPr>
-        <w:t xml:space="preserve">градиентов квадрупольных линз. Это приводит к возникновению локальных максимумов функций </w:t>
-      </w:r>
-      <w:proofErr w:type="spellStart"/>
-      <w:r>
-        <w:rPr>
-          <w:lang w:val="ru-RU"/>
-        </w:rPr>
-        <w:t>Твисса</w:t>
-      </w:r>
-      <w:proofErr w:type="spellEnd"/>
-      <w:r>
-        <w:rPr>
-          <w:lang w:val="ru-RU"/>
-        </w:rPr>
-        <w:t>, что сокращает</w:t>
+        <w:t>градиентов квадрупольных линз</w:t>
+      </w:r>
+      <w:r>
+        <w:rPr>
+          <w:lang w:val="ru-RU"/>
+        </w:rPr>
+        <w:t xml:space="preserve">, </w:t>
+      </w:r>
+      <w:r>
+        <w:rPr>
+          <w:lang w:val="ru-RU"/>
+        </w:rPr>
+        <w:t>привод</w:t>
+      </w:r>
+      <w:r>
+        <w:rPr>
+          <w:lang w:val="ru-RU"/>
+        </w:rPr>
+        <w:t>ящей</w:t>
+      </w:r>
+      <w:r>
+        <w:rPr>
+          <w:lang w:val="ru-RU"/>
+        </w:rPr>
+        <w:t xml:space="preserve"> к возникновению локальных максимумов функций Твисса</w:t>
+      </w:r>
+      <w:r>
+        <w:rPr>
+          <w:lang w:val="ru-RU"/>
+        </w:rPr>
+        <w:t xml:space="preserve"> и </w:t>
+      </w:r>
+      <w:r>
+        <w:rPr>
+          <w:lang w:val="ru-RU"/>
+        </w:rPr>
+        <w:t>усилению внутрипучкового рассеяния</w:t>
+      </w:r>
+      <w:r>
+        <w:rPr>
+          <w:lang w:val="ru-RU"/>
+        </w:rPr>
+        <w:t>. В результате</w:t>
       </w:r>
       <w:r>
         <w:rPr>
@@ -1460,19 +2289,98 @@
         <w:rPr>
           <w:lang w:val="ru-RU"/>
         </w:rPr>
-        <w:t xml:space="preserve">время ВПР по сравнению с регулярным случаем. Таким образом, несмотря на меньшую интенсивность рассеяния протонов в сравнении с ионами, введение модуляции параметров структуры создает дополнительные ограничения для времени жизни пучка. </w:t>
-      </w:r>
-      <w:r>
-        <w:rPr>
-          <w:lang w:val="ru-RU"/>
-        </w:rPr>
-        <w:t>Сравнительный анализ показал, что для протонной опции использование резонансной структуры ведет к сокращению времени ВПР по сравнению с регулярным случаем</w:t>
-      </w:r>
-      <w:r>
-        <w:rPr>
-          <w:lang w:val="ru-RU"/>
-        </w:rPr>
-        <w:t>, что показано на рис.</w:t>
+        <w:t xml:space="preserve">время ВПР сокращается до </w:t>
+      </w:r>
+      <m:oMath>
+        <m:sSub>
+          <m:sSubPr>
+            <m:ctrlPr>
+              <w:rPr>
+                <w:rFonts w:ascii="Cambria Math" w:hAnsi="Cambria Math"/>
+                <w:i/>
+                <w:lang w:val="ru-RU"/>
+              </w:rPr>
+            </m:ctrlPr>
+          </m:sSubPr>
+          <m:e>
+            <m:r>
+              <w:rPr>
+                <w:rFonts w:ascii="Cambria Math" w:hAnsi="Cambria Math"/>
+                <w:lang w:val="ru-RU"/>
+              </w:rPr>
+              <m:t>τ</m:t>
+            </m:r>
+          </m:e>
+          <m:sub>
+            <m:r>
+              <w:rPr>
+                <w:rFonts w:ascii="Cambria Math" w:hAnsi="Cambria Math"/>
+                <w:lang w:val="en-US"/>
+              </w:rPr>
+              <m:t>IBS</m:t>
+            </m:r>
+          </m:sub>
+        </m:sSub>
+        <m:r>
+          <w:rPr>
+            <w:rFonts w:ascii="Cambria Math" w:hAnsi="Cambria Math"/>
+            <w:lang w:val="ru-RU"/>
+          </w:rPr>
+          <m:t>=4×</m:t>
+        </m:r>
+        <m:sSup>
+          <m:sSupPr>
+            <m:ctrlPr>
+              <w:rPr>
+                <w:rFonts w:ascii="Cambria Math" w:hAnsi="Cambria Math"/>
+                <w:i/>
+                <w:lang w:val="ru-RU"/>
+              </w:rPr>
+            </m:ctrlPr>
+          </m:sSupPr>
+          <m:e>
+            <m:r>
+              <w:rPr>
+                <w:rFonts w:ascii="Cambria Math" w:hAnsi="Cambria Math"/>
+                <w:lang w:val="ru-RU"/>
+              </w:rPr>
+              <m:t>10</m:t>
+            </m:r>
+          </m:e>
+          <m:sup>
+            <m:r>
+              <w:rPr>
+                <w:rFonts w:ascii="Cambria Math" w:hAnsi="Cambria Math"/>
+                <w:lang w:val="ru-RU"/>
+              </w:rPr>
+              <m:t>3</m:t>
+            </m:r>
+          </m:sup>
+        </m:sSup>
+      </m:oMath>
+      <w:r>
+        <w:rPr>
+          <w:lang w:val="ru-RU"/>
+        </w:rPr>
+        <w:t xml:space="preserve"> с</w:t>
+      </w:r>
+      <w:r>
+        <w:rPr>
+          <w:lang w:val="ru-RU"/>
+        </w:rPr>
+        <w:t xml:space="preserve">, что </w:t>
+      </w:r>
+      <w:r>
+        <w:rPr>
+          <w:lang w:val="ru-RU"/>
+        </w:rPr>
+        <w:t>в 3.5 раза меньше по сравнению с регулярной структурой</w:t>
+      </w:r>
+      <w:r>
+        <w:rPr>
+          <w:lang w:val="ru-RU"/>
+        </w:rPr>
+        <w:t>.</w:t>
       </w:r>
       <w:r>
         <w:rPr>
@@ -1484,63 +2392,7 @@
         <w:rPr>
           <w:lang w:val="ru-RU"/>
         </w:rPr>
-        <w:t>3</w:t>
-      </w:r>
-      <w:r>
-        <w:rPr>
-          <w:lang w:val="ru-RU"/>
-        </w:rPr>
-        <w:t xml:space="preserve">. </w:t>
-      </w:r>
-      <w:r>
-        <w:rPr>
-          <w:lang w:val="ru-RU"/>
-        </w:rPr>
-        <w:t xml:space="preserve">Расчёты времени ВПР выполнены в </w:t>
-      </w:r>
-      <w:r>
-        <w:rPr>
-          <w:lang w:val="en-US"/>
-        </w:rPr>
-        <w:t>MADX</w:t>
-      </w:r>
-      <w:r>
-        <w:rPr>
-          <w:lang w:val="ru-RU"/>
-        </w:rPr>
-        <w:t xml:space="preserve"> [</w:t>
-      </w:r>
-      <w:r>
-        <w:rPr>
-          <w:lang w:val="ru-RU"/>
-        </w:rPr>
-        <w:t>4</w:t>
-      </w:r>
-      <w:r>
-        <w:rPr>
-          <w:lang w:val="ru-RU"/>
-        </w:rPr>
-        <w:t>].</w:t>
-      </w:r>
-    </w:p>
-    <w:p>
-      <w:pPr>
-        <w:pStyle w:val="Heading"/>
-        <w:suppressAutoHyphens/>
-        <w:spacing w:line="276" w:lineRule="auto"/>
-        <w:rPr>
-          <w:rFonts w:asciiTheme="majorBidi" w:hAnsiTheme="majorBidi" w:cstheme="majorBidi"/>
-          <w:sz w:val="24"/>
-          <w:szCs w:val="24"/>
-        </w:rPr>
-      </w:pPr>
-      <w:r>
-        <w:rPr>
-          <w:rFonts w:asciiTheme="majorBidi" w:hAnsiTheme="majorBidi" w:cstheme="majorBidi"/>
-          <w:sz w:val="24"/>
-          <w:szCs w:val="24"/>
-        </w:rPr>
-        <w:t>стОХАСТИЧЕСКОЕ ОХЛАЖДЕНИЕ</w:t>
+        <w:t>Таким образом, несмотря на относительно слабое внутрипучковое рассеяние протонов, введение модуляции параметров магнитооптической структуры создаёт дополнительное ограничение на время жизни пучка.</w:t>
       </w:r>
     </w:p>
     <w:p>
@@ -1564,51 +2416,107 @@
         <w:adjustRightInd w:val="0"/>
         <w:jc w:val="both"/>
         <w:rPr>
-          <w:rFonts w:eastAsiaTheme="minorEastAsia" w:cstheme="minorHAnsi"/>
+          <w:i/>
           <w:lang w:val="ru-RU"/>
         </w:rPr>
       </w:pPr>
       <w:r>
         <w:rPr>
-          <w:rFonts w:eastAsiaTheme="minorEastAsia" w:cstheme="minorHAnsi"/>
-          <w:lang w:val="ru-RU"/>
-        </w:rPr>
-        <w:tab/>
-      </w:r>
-      <w:r>
-        <w:rPr>
-          <w:rFonts w:eastAsiaTheme="minorEastAsia" w:cstheme="minorHAnsi"/>
-          <w:lang w:val="ru-RU"/>
-        </w:rPr>
-        <w:t xml:space="preserve">Для компенсации эффектов внутрипучкового рассеяния и увеличения времени жизни </w:t>
-      </w:r>
-      <w:r>
-        <w:rPr>
-          <w:rFonts w:eastAsiaTheme="minorEastAsia" w:cstheme="minorHAnsi"/>
-          <w:lang w:val="ru-RU"/>
-        </w:rPr>
-        <w:t>пучка</w:t>
-      </w:r>
-      <w:r>
-        <w:rPr>
-          <w:rFonts w:eastAsiaTheme="minorEastAsia" w:cstheme="minorHAnsi"/>
-          <w:lang w:val="ru-RU"/>
-        </w:rPr>
-        <w:t xml:space="preserve"> применяются метод</w:t>
-      </w:r>
-      <w:r>
-        <w:rPr>
-          <w:rFonts w:eastAsiaTheme="minorEastAsia" w:cstheme="minorHAnsi"/>
-          <w:lang w:val="ru-RU"/>
-        </w:rPr>
-        <w:t xml:space="preserve">ы </w:t>
-      </w:r>
-      <w:r>
-        <w:rPr>
-          <w:rFonts w:eastAsiaTheme="minorEastAsia" w:cstheme="minorHAnsi"/>
-          <w:lang w:val="ru-RU"/>
-        </w:rPr>
-        <w:t>охлаждения пучка. На низких энергиях эффективно использование электронного охлаждения, однако с ростом энергии более эффективным становится стохастическое охлаждение.</w:t>
+          <w:lang w:val="ru-RU"/>
+        </w:rPr>
+        <w:t xml:space="preserve">Зависимость времени ВПР от энергии </w:t>
+      </w:r>
+      <w:r>
+        <w:rPr>
+          <w:lang w:val="ru-RU"/>
+        </w:rPr>
+        <w:t>показан</w:t>
+      </w:r>
+      <w:r>
+        <w:rPr>
+          <w:lang w:val="ru-RU"/>
+        </w:rPr>
+        <w:t>а</w:t>
+      </w:r>
+      <w:r>
+        <w:rPr>
+          <w:lang w:val="ru-RU"/>
+        </w:rPr>
+        <w:t xml:space="preserve"> на рис.</w:t>
+      </w:r>
+      <w:r>
+        <w:rPr>
+          <w:lang w:val="ru-RU"/>
+        </w:rPr>
+        <w:t xml:space="preserve"> </w:t>
+      </w:r>
+      <w:r>
+        <w:rPr>
+          <w:lang w:val="ru-RU"/>
+        </w:rPr>
+        <w:t>3</w:t>
+      </w:r>
+      <w:r>
+        <w:rPr>
+          <w:lang w:val="ru-RU"/>
+        </w:rPr>
+        <w:t>а</w:t>
+      </w:r>
+      <w:r>
+        <w:rPr>
+          <w:lang w:val="ru-RU"/>
+        </w:rPr>
+        <w:t xml:space="preserve">. </w:t>
+      </w:r>
+      <w:r>
+        <w:rPr>
+          <w:lang w:val="ru-RU"/>
+        </w:rPr>
+        <w:t xml:space="preserve">Расчёты времени ВПР выполнены в </w:t>
+      </w:r>
+      <w:r>
+        <w:rPr>
+          <w:lang w:val="en-US"/>
+        </w:rPr>
+        <w:t>MADX</w:t>
+      </w:r>
+      <w:r>
+        <w:rPr>
+          <w:lang w:val="ru-RU"/>
+        </w:rPr>
+        <w:t xml:space="preserve"> [</w:t>
+      </w:r>
+      <w:r>
+        <w:rPr>
+          <w:lang w:val="ru-RU"/>
+        </w:rPr>
+        <w:t>4</w:t>
+      </w:r>
+      <w:r>
+        <w:rPr>
+          <w:lang w:val="ru-RU"/>
+        </w:rPr>
+        <w:t>].</w:t>
+      </w:r>
+    </w:p>
+    <w:p>
+      <w:pPr>
+        <w:pStyle w:val="Heading"/>
+        <w:suppressAutoHyphens/>
+        <w:spacing w:line="276" w:lineRule="auto"/>
+        <w:rPr>
+          <w:rFonts w:asciiTheme="majorBidi" w:hAnsiTheme="majorBidi" w:cstheme="majorBidi"/>
+          <w:sz w:val="24"/>
+          <w:szCs w:val="24"/>
+        </w:rPr>
+      </w:pPr>
+      <w:r>
+        <w:rPr>
+          <w:rFonts w:asciiTheme="majorBidi" w:hAnsiTheme="majorBidi" w:cstheme="majorBidi"/>
+          <w:sz w:val="24"/>
+          <w:szCs w:val="24"/>
+        </w:rPr>
+        <w:t>стОХАСТИЧЕСКОЕ ОХЛАЖДЕНИЕ</w:t>
       </w:r>
     </w:p>
     <w:p>
@@ -1642,6 +2550,73 @@
           <w:lang w:val="ru-RU"/>
         </w:rPr>
         <w:tab/>
+      </w:r>
+      <w:r>
+        <w:rPr>
+          <w:rFonts w:eastAsiaTheme="minorEastAsia" w:cstheme="minorHAnsi"/>
+          <w:lang w:val="ru-RU"/>
+        </w:rPr>
+        <w:t xml:space="preserve">Для компенсации эффектов внутрипучкового рассеяния и увеличения времени жизни </w:t>
+      </w:r>
+      <w:r>
+        <w:rPr>
+          <w:rFonts w:eastAsiaTheme="minorEastAsia" w:cstheme="minorHAnsi"/>
+          <w:lang w:val="ru-RU"/>
+        </w:rPr>
+        <w:t>пучка</w:t>
+      </w:r>
+      <w:r>
+        <w:rPr>
+          <w:rFonts w:eastAsiaTheme="minorEastAsia" w:cstheme="minorHAnsi"/>
+          <w:lang w:val="ru-RU"/>
+        </w:rPr>
+        <w:t xml:space="preserve"> применяются метод</w:t>
+      </w:r>
+      <w:r>
+        <w:rPr>
+          <w:rFonts w:eastAsiaTheme="minorEastAsia" w:cstheme="minorHAnsi"/>
+          <w:lang w:val="ru-RU"/>
+        </w:rPr>
+        <w:t xml:space="preserve">ы </w:t>
+      </w:r>
+      <w:r>
+        <w:rPr>
+          <w:rFonts w:eastAsiaTheme="minorEastAsia" w:cstheme="minorHAnsi"/>
+          <w:lang w:val="ru-RU"/>
+        </w:rPr>
+        <w:t>охлаждения пучка. На низких энергиях эффективно использование электронного охлаждения, однако с ростом энергии более эффективным становится стохастическое охлаждение.</w:t>
+      </w:r>
+    </w:p>
+    <w:p>
+      <w:pPr>
+        <w:tabs>
+          <w:tab w:val="left" w:pos="560"/>
+          <w:tab w:val="left" w:pos="1120"/>
+          <w:tab w:val="left" w:pos="1680"/>
+          <w:tab w:val="left" w:pos="2240"/>
+          <w:tab w:val="left" w:pos="2800"/>
+          <w:tab w:val="left" w:pos="3360"/>
+          <w:tab w:val="left" w:pos="3920"/>
+          <w:tab w:val="left" w:pos="4480"/>
+          <w:tab w:val="left" w:pos="5040"/>
+          <w:tab w:val="left" w:pos="5600"/>
+          <w:tab w:val="left" w:pos="6160"/>
+          <w:tab w:val="left" w:pos="6720"/>
+        </w:tabs>
+        <w:autoSpaceDE w:val="0"/>
+        <w:autoSpaceDN w:val="0"/>
+        <w:adjustRightInd w:val="0"/>
+        <w:jc w:val="both"/>
+        <w:rPr>
+          <w:rFonts w:eastAsiaTheme="minorEastAsia" w:cstheme="minorHAnsi"/>
+          <w:lang w:val="ru-RU"/>
+        </w:rPr>
+      </w:pPr>
+      <w:r>
+        <w:rPr>
+          <w:rFonts w:eastAsiaTheme="minorEastAsia" w:cstheme="minorHAnsi"/>
+          <w:lang w:val="ru-RU"/>
+        </w:rPr>
         <w:t>Для д</w:t>
       </w:r>
       <w:r>
@@ -1794,7 +2769,21 @@
           <w:rFonts w:eastAsiaTheme="minorEastAsia" w:cstheme="minorHAnsi"/>
           <w:lang w:val="ru-RU"/>
         </w:rPr>
-        <w:t xml:space="preserve"> в эксперименте NICA требует поддержани</w:t>
+        <w:t xml:space="preserve"> в эксперименте NICA требует</w:t>
+      </w:r>
+      <w:r>
+        <w:rPr>
+          <w:rFonts w:eastAsiaTheme="minorEastAsia" w:cstheme="minorHAnsi"/>
+          <w:lang w:val="ru-RU"/>
+        </w:rPr>
+        <w:t>ся</w:t>
+      </w:r>
+      <w:r>
+        <w:rPr>
+          <w:rFonts w:eastAsiaTheme="minorEastAsia" w:cstheme="minorHAnsi"/>
+          <w:lang w:val="ru-RU"/>
+        </w:rPr>
+        <w:t xml:space="preserve"> поддержани</w:t>
       </w:r>
       <w:r>
         <w:rPr>
@@ -1853,7 +2842,7 @@
           <w:rFonts w:eastAsiaTheme="minorEastAsia" w:cstheme="minorHAnsi"/>
           <w:lang w:val="ru-RU"/>
         </w:rPr>
-        <w:t xml:space="preserve"> частиц в сгустке (ppb).</w:t>
+        <w:t xml:space="preserve"> частиц в сгустке.</w:t>
       </w:r>
       <w:r>
         <w:rPr>
@@ -1864,73 +2853,132 @@
       </w:r>
       <w:r>
         <w:rPr>
+          <w:lang w:val="ru-RU"/>
+        </w:rPr>
+        <w:t>Аналитическая оценка, представленная на рис. 3</w:t>
+      </w:r>
+      <w:r>
+        <w:rPr>
+          <w:lang w:val="ru-RU"/>
+        </w:rPr>
+        <w:t>(</w:t>
+      </w:r>
+      <w:r>
+        <w:rPr>
+          <w:lang w:val="ru-RU"/>
+        </w:rPr>
+        <w:t>а-б</w:t>
+      </w:r>
+      <w:r>
+        <w:rPr>
+          <w:lang w:val="ru-RU"/>
+        </w:rPr>
+        <w:t>)</w:t>
+      </w:r>
+      <w:r>
+        <w:rPr>
+          <w:lang w:val="ru-RU"/>
+        </w:rPr>
+        <w:t>, показывает, что</w:t>
+      </w:r>
+      <w:r>
+        <w:rPr>
           <w:rFonts w:eastAsiaTheme="minorEastAsia" w:cstheme="minorHAnsi"/>
           <w:lang w:val="ru-RU"/>
         </w:rPr>
-        <w:t>Аналитическая оценка показала, что при такой интенсивности стохастическое охлаждение не способно полностью сбалансировать ВПР при ускорении до энергии эксперимента.</w:t>
+        <w:t xml:space="preserve"> при такой интенсивности </w:t>
+      </w:r>
+      <w:r>
+        <w:rPr>
+          <w:lang w:val="ru-RU"/>
+        </w:rPr>
+        <w:t xml:space="preserve">время стохастического охлаждения превышает время </w:t>
+      </w:r>
+      <w:r>
+        <w:rPr>
+          <w:lang w:val="ru-RU"/>
+        </w:rPr>
+        <w:t xml:space="preserve">ВПР </w:t>
+      </w:r>
+      <m:oMath>
+        <m:sSub>
+          <m:sSubPr>
+            <m:ctrlPr>
+              <w:rPr>
+                <w:rFonts w:ascii="Cambria Math" w:hAnsi="Cambria Math"/>
+                <w:i/>
+                <w:lang w:val="ru-RU"/>
+              </w:rPr>
+            </m:ctrlPr>
+          </m:sSubPr>
+          <m:e>
+            <m:r>
+              <w:rPr>
+                <w:rFonts w:ascii="Cambria Math" w:hAnsi="Cambria Math"/>
+                <w:lang w:val="ru-RU"/>
+              </w:rPr>
+              <m:t>τ</m:t>
+            </m:r>
+          </m:e>
+          <m:sub>
+            <m:r>
+              <w:rPr>
+                <w:rFonts w:ascii="Cambria Math" w:hAnsi="Cambria Math"/>
+                <w:lang w:val="en-US"/>
+              </w:rPr>
+              <m:t>cool</m:t>
+            </m:r>
+          </m:sub>
+        </m:sSub>
+        <m:r>
+          <w:rPr>
+            <w:rFonts w:ascii="Cambria Math" w:hAnsi="Cambria Math"/>
+            <w:lang w:val="ru-RU"/>
+          </w:rPr>
+          <m:t>&gt;</m:t>
+        </m:r>
+        <m:sSub>
+          <m:sSubPr>
+            <m:ctrlPr>
+              <w:rPr>
+                <w:rFonts w:ascii="Cambria Math" w:hAnsi="Cambria Math"/>
+                <w:i/>
+                <w:lang w:val="ru-RU"/>
+              </w:rPr>
+            </m:ctrlPr>
+          </m:sSubPr>
+          <m:e>
+            <m:r>
+              <w:rPr>
+                <w:rFonts w:ascii="Cambria Math" w:hAnsi="Cambria Math"/>
+                <w:lang w:val="ru-RU"/>
+              </w:rPr>
+              <m:t>τ</m:t>
+            </m:r>
+          </m:e>
+          <m:sub>
+            <m:r>
+              <w:rPr>
+                <w:rFonts w:ascii="Cambria Math" w:hAnsi="Cambria Math"/>
+                <w:lang w:val="en-US"/>
+              </w:rPr>
+              <m:t>IBS</m:t>
+            </m:r>
+          </m:sub>
+        </m:sSub>
+      </m:oMath>
+      <w:r>
+        <w:rPr>
+          <w:lang w:val="ru-RU"/>
+        </w:rPr>
+        <w:t>, что не позволяет полностью компенсировать рост эмиттанса при ускорении до энергии эксперимента</w:t>
       </w:r>
       <w:r>
         <w:rPr>
           <w:rFonts w:eastAsiaTheme="minorEastAsia" w:cstheme="minorHAnsi"/>
           <w:lang w:val="ru-RU"/>
         </w:rPr>
-        <w:t xml:space="preserve"> </w:t>
-      </w:r>
-      <w:r>
-        <w:rPr>
-          <w:rFonts w:eastAsiaTheme="minorEastAsia" w:cstheme="minorHAnsi"/>
-          <w:lang w:val="ru-RU"/>
-        </w:rPr>
-        <w:t>Этот вывод справедлив даже для наиболее эффективной (с точки зрения охлаждения) комбинированной структуры, концепция которой была представлена ранее в [</w:t>
-      </w:r>
-      <w:r>
-        <w:rPr>
-          <w:rFonts w:eastAsiaTheme="minorEastAsia" w:cstheme="minorHAnsi"/>
-          <w:lang w:val="ru-RU"/>
-        </w:rPr>
-        <w:t>2</w:t>
-      </w:r>
-      <w:r>
-        <w:rPr>
-          <w:rFonts w:eastAsiaTheme="minorEastAsia" w:cstheme="minorHAnsi"/>
-          <w:lang w:val="ru-RU"/>
-        </w:rPr>
-        <w:t>]</w:t>
-      </w:r>
-      <w:r>
-        <w:rPr>
-          <w:rFonts w:eastAsiaTheme="minorEastAsia" w:cstheme="minorHAnsi"/>
-          <w:lang w:val="ru-RU"/>
-        </w:rPr>
-        <w:t xml:space="preserve">. </w:t>
-      </w:r>
-      <w:r>
-        <w:rPr>
-          <w:rFonts w:eastAsiaTheme="minorEastAsia" w:cstheme="minorHAnsi"/>
-          <w:lang w:val="ru-RU"/>
-        </w:rPr>
-        <w:t>В</w:t>
-      </w:r>
-      <w:r>
-        <w:rPr>
-          <w:rFonts w:eastAsiaTheme="minorEastAsia" w:cstheme="minorHAnsi"/>
-          <w:lang w:val="ru-RU"/>
-        </w:rPr>
-        <w:t xml:space="preserve">ремя </w:t>
-      </w:r>
-      <w:r>
-        <w:rPr>
-          <w:rFonts w:eastAsiaTheme="minorEastAsia" w:cstheme="minorHAnsi"/>
-          <w:lang w:val="ru-RU"/>
-        </w:rPr>
-        <w:t>внутрипучкового рассеяния</w:t>
-      </w:r>
-      <w:r>
-        <w:rPr>
-          <w:rFonts w:eastAsiaTheme="minorEastAsia" w:cstheme="minorHAnsi"/>
-          <w:lang w:val="ru-RU"/>
-        </w:rPr>
-        <w:t xml:space="preserve"> и стохастического охлаждения представлены на рис. 4.</w:t>
+        <w:t>.</w:t>
       </w:r>
     </w:p>
     <w:p>
@@ -1955,7 +3003,6 @@
         <w:jc w:val="both"/>
         <w:rPr>
           <w:rFonts w:eastAsiaTheme="minorEastAsia" w:cstheme="minorHAnsi"/>
-          <w:i/>
           <w:lang w:val="ru-RU"/>
         </w:rPr>
       </w:pPr>
@@ -1964,20 +3011,73 @@
           <w:rFonts w:eastAsiaTheme="minorEastAsia" w:cstheme="minorHAnsi"/>
           <w:lang w:val="ru-RU"/>
         </w:rPr>
-        <w:tab/>
+        <w:t xml:space="preserve">Этот вывод справедлив даже для наиболее эффективной (с точки зрения охлаждения) комбинированной структуры, </w:t>
+      </w:r>
+      <w:r>
+        <w:rPr>
+          <w:lang w:val="ru-RU"/>
+        </w:rPr>
+        <w:t xml:space="preserve">в которой </w:t>
+      </w:r>
+      <w:r>
+        <w:rPr>
+          <w:lang w:val="ru-RU"/>
+        </w:rPr>
+        <w:t>одна поворотная арка является регулярной, а другая — резонансной</w:t>
+      </w:r>
+      <w:r>
+        <w:rPr>
+          <w:lang w:val="ru-RU"/>
+        </w:rPr>
+        <w:t xml:space="preserve"> </w:t>
       </w:r>
       <w:r>
         <w:rPr>
           <w:rFonts w:eastAsiaTheme="minorEastAsia" w:cstheme="minorHAnsi"/>
           <w:lang w:val="ru-RU"/>
         </w:rPr>
-        <w:t xml:space="preserve">Дополнительно для </w:t>
+        <w:t>[</w:t>
       </w:r>
       <w:r>
         <w:rPr>
           <w:rFonts w:eastAsiaTheme="minorEastAsia" w:cstheme="minorHAnsi"/>
           <w:lang w:val="ru-RU"/>
         </w:rPr>
+        <w:t>2</w:t>
+      </w:r>
+      <w:r>
+        <w:rPr>
+          <w:rFonts w:eastAsiaTheme="minorEastAsia" w:cstheme="minorHAnsi"/>
+          <w:lang w:val="ru-RU"/>
+        </w:rPr>
+        <w:t>]</w:t>
+      </w:r>
+      <w:r>
+        <w:rPr>
+          <w:rFonts w:eastAsiaTheme="minorEastAsia" w:cstheme="minorHAnsi"/>
+          <w:lang w:val="ru-RU"/>
+        </w:rPr>
+        <w:t xml:space="preserve">. </w:t>
+      </w:r>
+      <w:r>
+        <w:rPr>
+          <w:rFonts w:eastAsiaTheme="minorEastAsia" w:cstheme="minorHAnsi"/>
+          <w:lang w:val="ru-RU"/>
+        </w:rPr>
+        <w:t xml:space="preserve"> Д</w:t>
+      </w:r>
+      <w:r>
+        <w:rPr>
+          <w:rFonts w:eastAsiaTheme="minorEastAsia" w:cstheme="minorHAnsi"/>
+          <w:lang w:val="ru-RU"/>
+        </w:rPr>
+        <w:t xml:space="preserve">ополнительно для </w:t>
+      </w:r>
+      <w:r>
+        <w:rPr>
+          <w:rFonts w:eastAsiaTheme="minorEastAsia" w:cstheme="minorHAnsi"/>
+          <w:lang w:val="ru-RU"/>
+        </w:rPr>
         <w:t>комбинированной структуры</w:t>
       </w:r>
       <w:r>
@@ -2020,13 +3120,72 @@
           <w:rFonts w:eastAsiaTheme="minorEastAsia" w:cstheme="minorHAnsi"/>
           <w:lang w:val="ru-RU"/>
         </w:rPr>
-        <w:t xml:space="preserve"> частиц в сгустке. </w:t>
-      </w:r>
+        <w:t xml:space="preserve"> </w:t>
+      </w:r>
+      <m:oMath>
+        <m:r>
+          <w:rPr>
+            <w:rFonts w:ascii="Cambria Math" w:hAnsi="Cambria Math"/>
+            <w:lang w:val="ru-RU"/>
+          </w:rPr>
+          <m:t>5×</m:t>
+        </m:r>
+        <m:sSup>
+          <m:sSupPr>
+            <m:ctrlPr>
+              <w:rPr>
+                <w:rFonts w:ascii="Cambria Math" w:hAnsi="Cambria Math"/>
+                <w:i/>
+                <w:lang w:val="ru-RU"/>
+              </w:rPr>
+            </m:ctrlPr>
+          </m:sSupPr>
+          <m:e>
+            <m:r>
+              <w:rPr>
+                <w:rFonts w:ascii="Cambria Math" w:hAnsi="Cambria Math"/>
+                <w:lang w:val="ru-RU"/>
+              </w:rPr>
+              <m:t>10</m:t>
+            </m:r>
+          </m:e>
+          <m:sup>
+            <m:r>
+              <w:rPr>
+                <w:rFonts w:ascii="Cambria Math" w:hAnsi="Cambria Math"/>
+                <w:lang w:val="ru-RU"/>
+              </w:rPr>
+              <m:t>10</m:t>
+            </m:r>
+          </m:sup>
+        </m:sSup>
+      </m:oMath>
       <w:r>
         <w:rPr>
           <w:rFonts w:eastAsiaTheme="minorEastAsia" w:cstheme="minorHAnsi"/>
           <w:lang w:val="ru-RU"/>
         </w:rPr>
+        <w:t xml:space="preserve"> </w:t>
+      </w:r>
+      <w:r>
+        <w:rPr>
+          <w:rFonts w:eastAsiaTheme="minorEastAsia" w:cstheme="minorHAnsi"/>
+          <w:lang w:val="en-US"/>
+        </w:rPr>
+        <w:t>ppb</w:t>
+      </w:r>
+      <w:r>
+        <w:rPr>
+          <w:rFonts w:eastAsiaTheme="minorEastAsia" w:cstheme="minorHAnsi"/>
+          <w:lang w:val="ru-RU"/>
+        </w:rPr>
+        <w:t xml:space="preserve">. </w:t>
+      </w:r>
+      <w:r>
+        <w:rPr>
+          <w:rFonts w:eastAsiaTheme="minorEastAsia" w:cstheme="minorHAnsi"/>
+          <w:lang w:val="ru-RU"/>
+        </w:rPr>
         <w:t>На рис. 5 п</w:t>
       </w:r>
       <w:r>
@@ -2034,7 +3193,7 @@
           <w:rFonts w:eastAsiaTheme="minorEastAsia" w:cstheme="minorHAnsi"/>
           <w:lang w:val="ru-RU"/>
         </w:rPr>
-        <w:t>оказано, что при меньшем количестве частиц система охлаждения подавляет эффекты ВПР, что увеличивает эффективное время жизни</w:t>
+        <w:t>оказано, что при меньшем количестве частиц система охлаждения подавляет эффекты ВПР, что увеличивает время жизни</w:t>
       </w:r>
       <w:r>
         <w:rPr>
@@ -2119,33 +3278,25 @@
         <w:rPr>
           <w:lang w:val="ru-RU" w:eastAsia="ru-RU"/>
         </w:rPr>
-        <w:t xml:space="preserve">Для подавления натуральной хроматичности в магнитной структуре коллайдера применяется </w:t>
-      </w:r>
-      <w:proofErr w:type="spellStart"/>
+        <w:t>Для подавления натуральной хроматичности в магнитной структуре коллайдера применяется секступольная коррекция. Введение нелинейных полей секступолей неизбежно приводит к ограничению области устойчивого движения частиц — динамической апертуры</w:t>
+      </w:r>
       <w:r>
         <w:rPr>
           <w:lang w:val="ru-RU" w:eastAsia="ru-RU"/>
         </w:rPr>
-        <w:t>секступольная</w:t>
-      </w:r>
-      <w:proofErr w:type="spellEnd"/>
+        <w:t xml:space="preserve">. </w:t>
+      </w:r>
+      <w:r>
+        <w:rPr>
+          <w:lang w:val="ru-RU"/>
+        </w:rPr>
+        <w:t>При оптимальной расстановке секступольных семейств в регулярной структуре удаётся добиться эффективной компенсации нелинейных эффектов, что обеспечивает максимальные значения динамической апертуры</w:t>
+      </w:r>
       <w:r>
         <w:rPr>
           <w:lang w:val="ru-RU" w:eastAsia="ru-RU"/>
         </w:rPr>
-        <w:t xml:space="preserve"> коррекция. Введение нелинейных полей секступолей неизбежно приводит к ограничению области устойчивого движения частиц — динамической апертуры</w:t>
-      </w:r>
-      <w:r>
-        <w:rPr>
-          <w:lang w:val="ru-RU" w:eastAsia="ru-RU"/>
-        </w:rPr>
-        <w:t xml:space="preserve">. </w:t>
-      </w:r>
-      <w:r>
-        <w:rPr>
-          <w:lang w:val="ru-RU" w:eastAsia="ru-RU"/>
-        </w:rPr>
-        <w:t>При оптимальной расстановке секступольных семейств в регулярной структуре удается добиться эффективной компенсации нелинейных эффектов, что обеспечивает максимальные значения ДА</w:t>
+        <w:t xml:space="preserve"> (рис. 6а)</w:t>
       </w:r>
       <w:r>
         <w:rPr>
@@ -2182,7 +3333,14 @@
         <w:rPr>
           <w:lang w:val="ru-RU" w:eastAsia="ru-RU"/>
         </w:rPr>
-        <w:t>Однако переход к специализированным структурам требует введения модуляции градиентов квадрупольных линз (</w:t>
+        <w:lastRenderedPageBreak/>
+        <w:t>П</w:t>
+      </w:r>
+      <w:r>
+        <w:rPr>
+          <w:lang w:val="ru-RU" w:eastAsia="ru-RU"/>
+        </w:rPr>
+        <w:t xml:space="preserve">ереход к специализированным структурам требует введения модуляции градиентов квадрупольных линз </w:t>
       </w:r>
       <m:oMath>
         <m:r>
@@ -2197,7 +3355,7 @@
         <w:rPr>
           <w:lang w:val="ru-RU" w:eastAsia="ru-RU"/>
         </w:rPr>
-        <w:t>), что нарушает симметрию распределения</w:t>
+        <w:t>, что нарушает симметрию распределения</w:t>
       </w:r>
       <w:r>
         <w:rPr>
@@ -2205,31 +3363,35 @@
         </w:rPr>
         <w:t xml:space="preserve"> </w:t>
       </w:r>
-      <w:proofErr w:type="spellStart"/>
       <w:r>
         <w:rPr>
           <w:lang w:val="ru-RU" w:eastAsia="ru-RU"/>
         </w:rPr>
-        <w:t>Твисс</w:t>
-      </w:r>
-      <w:proofErr w:type="spellEnd"/>
+        <w:t>Твисс-</w:t>
+      </w:r>
       <w:r>
         <w:rPr>
           <w:lang w:val="ru-RU" w:eastAsia="ru-RU"/>
         </w:rPr>
-        <w:t>-</w:t>
+        <w:t>функций</w:t>
       </w:r>
       <w:r>
         <w:rPr>
           <w:lang w:val="ru-RU" w:eastAsia="ru-RU"/>
         </w:rPr>
-        <w:t>функций</w:t>
+        <w:t>. Для резонансной структуры</w:t>
       </w:r>
       <w:r>
         <w:rPr>
           <w:lang w:val="ru-RU" w:eastAsia="ru-RU"/>
         </w:rPr>
-        <w:t>. Для резонансной структуры (</w:t>
+        <w:t xml:space="preserve"> при</w:t>
+      </w:r>
+      <w:r>
+        <w:rPr>
+          <w:lang w:val="ru-RU" w:eastAsia="ru-RU"/>
+        </w:rPr>
+        <w:t xml:space="preserve"> </w:t>
       </w:r>
       <m:oMath>
         <m:r>
@@ -2244,7 +3406,31 @@
         <w:rPr>
           <w:lang w:val="ru-RU" w:eastAsia="ru-RU"/>
         </w:rPr>
-        <w:t>) наблюдается сокращение ДА по сравнению с регулярным случаем. Наименьшая динамическая апертура зафиксирована для комбинированной структуры, где требуется наиболее глубокая модуляция градиентов (</w:t>
+        <w:t xml:space="preserve"> наблюдается сокращение </w:t>
+      </w:r>
+      <w:r>
+        <w:rPr>
+          <w:lang w:val="ru-RU"/>
+        </w:rPr>
+        <w:t>динамической апертуры</w:t>
+      </w:r>
+      <w:r>
+        <w:rPr>
+          <w:lang w:val="ru-RU" w:eastAsia="ru-RU"/>
+        </w:rPr>
+        <w:t xml:space="preserve"> по сравнению с регулярным случаем</w:t>
+      </w:r>
+      <w:r>
+        <w:rPr>
+          <w:lang w:val="ru-RU" w:eastAsia="ru-RU"/>
+        </w:rPr>
+        <w:t xml:space="preserve"> (рис. 6б)</w:t>
+      </w:r>
+      <w:r>
+        <w:rPr>
+          <w:lang w:val="ru-RU" w:eastAsia="ru-RU"/>
+        </w:rPr>
+        <w:t xml:space="preserve">. Наименьшая динамическая апертура зафиксирована для комбинированной структуры, где требуется наиболее глубокая модуляция градиентов </w:t>
       </w:r>
       <m:oMath>
         <m:r>
@@ -2252,45 +3438,43 @@
             <w:rFonts w:ascii="Cambria Math" w:eastAsiaTheme="minorEastAsia" w:hAnsi="Cambria Math" w:cstheme="minorHAnsi"/>
             <w:lang w:val="ru-RU"/>
           </w:rPr>
-          <m:t>M=</m:t>
-        </m:r>
-        <m:r>
-          <w:rPr>
-            <w:rFonts w:ascii="Cambria Math" w:eastAsiaTheme="minorEastAsia" w:hAnsi="Cambria Math" w:cstheme="minorHAnsi"/>
-            <w:lang w:val="ru-RU"/>
-          </w:rPr>
-          <m:t>4</m:t>
-        </m:r>
-        <m:r>
-          <w:rPr>
-            <w:rFonts w:ascii="Cambria Math" w:eastAsiaTheme="minorEastAsia" w:hAnsi="Cambria Math" w:cstheme="minorHAnsi"/>
-            <w:lang w:val="ru-RU"/>
-          </w:rPr>
-          <m:t>5%</m:t>
+          <m:t>M=45%</m:t>
         </m:r>
       </m:oMath>
       <w:r>
         <w:rPr>
           <w:lang w:val="ru-RU" w:eastAsia="ru-RU"/>
         </w:rPr>
-        <w:t>).</w:t>
+        <w:t xml:space="preserve"> (рис. 6в)</w:t>
       </w:r>
       <w:r>
         <w:rPr>
           <w:lang w:val="ru-RU" w:eastAsia="ru-RU"/>
         </w:rPr>
+        <w:t>.</w:t>
+      </w:r>
+      <w:r>
+        <w:rPr>
+          <w:lang w:val="ru-RU" w:eastAsia="ru-RU"/>
+        </w:rPr>
         <w:t xml:space="preserve"> </w:t>
       </w:r>
       <w:r>
         <w:rPr>
           <w:lang w:val="ru-RU" w:eastAsia="ru-RU"/>
         </w:rPr>
-        <w:t>Такая глубокая модуляция существенно искажает бета-функции и дисперсию, что препятствует эффективн</w:t>
+        <w:t>Г</w:t>
       </w:r>
       <w:r>
         <w:rPr>
           <w:lang w:val="ru-RU" w:eastAsia="ru-RU"/>
         </w:rPr>
+        <w:t>лубокая модуляция существенно искажает бета-функции и дисперсию, что препятствует эффективн</w:t>
+      </w:r>
+      <w:r>
+        <w:rPr>
+          <w:lang w:val="ru-RU" w:eastAsia="ru-RU"/>
+        </w:rPr>
         <w:t>ой</w:t>
       </w:r>
       <w:r>
@@ -2315,14 +3499,7 @@
         <w:rPr>
           <w:lang w:val="ru-RU" w:eastAsia="ru-RU"/>
         </w:rPr>
-        <w:t xml:space="preserve">В конечном счете это приводит к ограничению динамической апертуры, что обуславливает </w:t>
-      </w:r>
-      <w:r>
-        <w:rPr>
-          <w:lang w:val="ru-RU" w:eastAsia="ru-RU"/>
-        </w:rPr>
-        <w:lastRenderedPageBreak/>
-        <w:t>необходимость оптимизации расположения секступольных линз для обеспечения стабильной работы в режиме комбинированной оптики.</w:t>
+        <w:t>В конечном счете это приводит к ограничению динамической апертуры, что обуславливает необходимость оптимизации расположения секступольных линз для обеспечения стабильной работы в режиме комбинированной оптики.</w:t>
       </w:r>
     </w:p>
     <w:p>
@@ -2378,7 +3555,13 @@
           <w:rFonts w:eastAsiaTheme="minorEastAsia"/>
           <w:lang w:val="ru-RU"/>
         </w:rPr>
-        <w:t>. Ранее проведенные исследования продольного движения</w:t>
+        <w:t xml:space="preserve">. Ранее проведенные исследования </w:t>
+      </w:r>
+      <w:r>
+        <w:rPr>
+          <w:lang w:val="ru-RU"/>
+        </w:rPr>
+        <w:t>продольной динамики</w:t>
       </w:r>
       <w:r>
         <w:rPr>
@@ -2413,7 +3596,7 @@
           <w:rFonts w:eastAsiaTheme="minorEastAsia"/>
           <w:lang w:val="ru-RU"/>
         </w:rPr>
-        <w:t xml:space="preserve"> показали необходимость применения барьерного ВЧ-напряжения</w:t>
+        <w:t xml:space="preserve"> показали необходимость применения барьерного ВЧ</w:t>
       </w:r>
       <w:r>
         <w:rPr>
@@ -2590,7 +3773,14 @@
           <w:rFonts w:eastAsiaTheme="minorEastAsia"/>
           <w:lang w:val="ru-RU"/>
         </w:rPr>
-        <w:t xml:space="preserve"> [6]</w:t>
+        <w:t xml:space="preserve"> </w:t>
+      </w:r>
+      <w:r>
+        <w:rPr>
+          <w:rFonts w:eastAsiaTheme="minorEastAsia"/>
+          <w:lang w:val="ru-RU"/>
+        </w:rPr>
+        <w:t>[6]</w:t>
       </w:r>
       <w:r>
         <w:rPr>
@@ -2662,94 +3852,92 @@
           <w:rFonts w:eastAsiaTheme="minorEastAsia"/>
           <w:lang w:val="ru-RU"/>
         </w:rPr>
-        <w:t xml:space="preserve">. При расчёте скачка изначально предполагалось избежать попадания на резонансы, </w:t>
+        <w:t>.</w:t>
+      </w:r>
+      <w:r>
+        <w:rPr>
+          <w:lang w:val="ru-RU"/>
+        </w:rPr>
+        <w:t xml:space="preserve"> </w:t>
+      </w:r>
+      <w:r>
+        <w:rPr>
+          <w:lang w:val="ru-RU"/>
+        </w:rPr>
+        <w:t xml:space="preserve">Расчёт проводился с целью </w:t>
+      </w:r>
+      <w:r>
+        <w:rPr>
+          <w:lang w:val="ru-RU"/>
+        </w:rPr>
+        <w:t>изучения</w:t>
+      </w:r>
+      <w:r>
+        <w:rPr>
+          <w:lang w:val="ru-RU"/>
+        </w:rPr>
+        <w:t xml:space="preserve"> </w:t>
+      </w:r>
+      <w:r>
+        <w:rPr>
+          <w:lang w:val="ru-RU"/>
+        </w:rPr>
+        <w:t xml:space="preserve">влияния </w:t>
+      </w:r>
+      <w:r>
+        <w:rPr>
+          <w:lang w:val="ru-RU"/>
+        </w:rPr>
+        <w:t>резонансов, способных привести к деградации пучка.</w:t>
       </w:r>
       <w:r>
         <w:rPr>
           <w:rFonts w:eastAsiaTheme="minorEastAsia"/>
           <w:lang w:val="ru-RU"/>
         </w:rPr>
-        <w:t>способные привести к</w:t>
+        <w:t xml:space="preserve"> </w:t>
       </w:r>
       <w:r>
         <w:rPr>
           <w:rFonts w:eastAsiaTheme="minorEastAsia"/>
           <w:lang w:val="ru-RU"/>
         </w:rPr>
-        <w:t xml:space="preserve"> </w:t>
+        <w:t>Полученные результаты</w:t>
       </w:r>
       <w:r>
         <w:rPr>
           <w:rFonts w:eastAsiaTheme="minorEastAsia"/>
           <w:lang w:val="ru-RU"/>
         </w:rPr>
-        <w:t>деградации</w:t>
+        <w:t xml:space="preserve"> на рис. </w:t>
       </w:r>
       <w:r>
         <w:rPr>
           <w:rFonts w:eastAsiaTheme="minorEastAsia"/>
           <w:lang w:val="ru-RU"/>
         </w:rPr>
-        <w:t xml:space="preserve"> пучка. </w:t>
+        <w:t>7</w:t>
       </w:r>
       <w:r>
         <w:rPr>
           <w:rFonts w:eastAsiaTheme="minorEastAsia"/>
           <w:lang w:val="ru-RU"/>
         </w:rPr>
-        <w:t>Полученные результаты</w:t>
+        <w:t xml:space="preserve"> подтверждают, что при импульсном изменении градиентов квадруполей траектория движения частот остается в допустимых пределах диаграмм</w:t>
       </w:r>
       <w:r>
         <w:rPr>
           <w:rFonts w:eastAsiaTheme="minorEastAsia"/>
           <w:lang w:val="ru-RU"/>
         </w:rPr>
-        <w:t xml:space="preserve"> на рис. 6</w:t>
+        <w:t>ы</w:t>
       </w:r>
       <w:r>
         <w:rPr>
           <w:rFonts w:eastAsiaTheme="minorEastAsia"/>
           <w:lang w:val="ru-RU"/>
         </w:rPr>
-        <w:t xml:space="preserve"> подтверждают, что при импульсном изменении градиентов квадруполей траектория движения частот остается в допустимых пределах диаграмм</w:t>
-      </w:r>
-      <w:r>
-        <w:rPr>
-          <w:rFonts w:eastAsiaTheme="minorEastAsia"/>
-          <w:lang w:val="ru-RU"/>
-        </w:rPr>
-        <w:t>ы</w:t>
-      </w:r>
-      <w:r>
-        <w:rPr>
-          <w:rFonts w:eastAsiaTheme="minorEastAsia"/>
-          <w:lang w:val="ru-RU"/>
-        </w:rPr>
         <w:t>.</w:t>
-      </w:r>
-    </w:p>
-    <w:p>
-      <w:pPr>
-        <w:jc w:val="both"/>
-        <w:rPr>
-          <w:rFonts w:eastAsiaTheme="minorEastAsia" w:cstheme="minorHAnsi"/>
-          <w:iCs/>
-          <w:lang w:val="ru-RU"/>
-        </w:rPr>
-      </w:pPr>
-      <w:r>
-        <w:rPr>
-          <w:lang w:val="ru-RU" w:eastAsia="en-US"/>
-        </w:rPr>
-        <w:tab/>
-      </w:r>
-      <w:r>
-        <w:rPr>
-          <w:rFonts w:eastAsiaTheme="minorEastAsia" w:cstheme="minorHAnsi"/>
-          <w:iCs/>
-          <w:lang w:val="ru-RU"/>
-        </w:rPr>
-        <w:t xml:space="preserve"> </w:t>
       </w:r>
     </w:p>
     <w:p>
@@ -2813,79 +4001,70 @@
           <w:rFonts w:eastAsiaTheme="minorEastAsia" w:cstheme="minorHAnsi"/>
           <w:lang w:val="ru-RU"/>
         </w:rPr>
-        <w:t xml:space="preserve">В работе проведено исследование факторов, ограничивающих параметры протонного пучка в коллайдере NICA для различных конфигураций магнитооптической структуры. Установлено, что время внутрипучкового рассеяния в резонансной и комбинированной структурах меньше, чем в регулярной, из-за модуляции функций </w:t>
-      </w:r>
-      <w:proofErr w:type="spellStart"/>
+        <w:t>В работе проведено исследование факторов, ограничивающих параметры протонного пучка в коллайдере NICA для различных конфигураций магнитооптической структуры. Установлено, что время внутрипучкового рассеяния в резонансной и комбинированной структурах меньше, чем в регулярной, из-за модуляции функций Твисса. Аналитическая оценка</w:t>
+      </w:r>
       <w:r>
         <w:rPr>
           <w:rFonts w:eastAsiaTheme="minorEastAsia" w:cstheme="minorHAnsi"/>
           <w:lang w:val="ru-RU"/>
         </w:rPr>
-        <w:t>Твисса</w:t>
-      </w:r>
-      <w:proofErr w:type="spellEnd"/>
+        <w:t xml:space="preserve"> параметров пучка при</w:t>
+      </w:r>
       <w:r>
         <w:rPr>
           <w:rFonts w:eastAsiaTheme="minorEastAsia" w:cstheme="minorHAnsi"/>
           <w:lang w:val="ru-RU"/>
         </w:rPr>
-        <w:t>. Аналитическая оценка</w:t>
+        <w:t xml:space="preserve"> стохастическ</w:t>
       </w:r>
       <w:r>
         <w:rPr>
           <w:rFonts w:eastAsiaTheme="minorEastAsia" w:cstheme="minorHAnsi"/>
           <w:lang w:val="ru-RU"/>
         </w:rPr>
-        <w:t xml:space="preserve"> параметров пучка при</w:t>
+        <w:t xml:space="preserve">ом </w:t>
       </w:r>
       <w:r>
         <w:rPr>
           <w:rFonts w:eastAsiaTheme="minorEastAsia" w:cstheme="minorHAnsi"/>
           <w:lang w:val="ru-RU"/>
         </w:rPr>
-        <w:t xml:space="preserve"> стохастическ</w:t>
+        <w:t>охлаждени</w:t>
       </w:r>
       <w:r>
         <w:rPr>
           <w:rFonts w:eastAsiaTheme="minorEastAsia" w:cstheme="minorHAnsi"/>
           <w:lang w:val="ru-RU"/>
         </w:rPr>
-        <w:t xml:space="preserve">ом </w:t>
+        <w:t>и</w:t>
       </w:r>
       <w:r>
         <w:rPr>
           <w:rFonts w:eastAsiaTheme="minorEastAsia" w:cstheme="minorHAnsi"/>
           <w:lang w:val="ru-RU"/>
         </w:rPr>
-        <w:t>охлаждени</w:t>
+        <w:t xml:space="preserve"> показала, что при</w:t>
       </w:r>
       <w:r>
         <w:rPr>
           <w:rFonts w:eastAsiaTheme="minorEastAsia" w:cstheme="minorHAnsi"/>
           <w:lang w:val="ru-RU"/>
         </w:rPr>
-        <w:t>и</w:t>
+        <w:t xml:space="preserve"> </w:t>
       </w:r>
       <w:r>
         <w:rPr>
           <w:rFonts w:eastAsiaTheme="minorEastAsia" w:cstheme="minorHAnsi"/>
           <w:lang w:val="ru-RU"/>
         </w:rPr>
-        <w:t xml:space="preserve"> показала, что при</w:t>
+        <w:t>интенсивности</w:t>
       </w:r>
       <w:r>
         <w:rPr>
           <w:rFonts w:eastAsiaTheme="minorEastAsia" w:cstheme="minorHAnsi"/>
           <w:lang w:val="ru-RU"/>
         </w:rPr>
-        <w:t xml:space="preserve"> </w:t>
-      </w:r>
-      <w:r>
-        <w:rPr>
-          <w:rFonts w:eastAsiaTheme="minorEastAsia" w:cstheme="minorHAnsi"/>
-          <w:lang w:val="ru-RU"/>
-        </w:rPr>
-        <w:t>интенсивности</w:t>
+        <w:t xml:space="preserve"> порядка</w:t>
       </w:r>
       <w:r>
         <w:rPr>
@@ -3007,7 +4186,7 @@
           <w:rFonts w:eastAsiaTheme="minorEastAsia" w:cstheme="minorHAnsi"/>
           <w:lang w:val="ru-RU"/>
         </w:rPr>
-        <w:t xml:space="preserve"> в регулярной структуре позволяет успешно избегать попадания рабочей точки на опасные резонансы на диаграмме частот.</w:t>
+        <w:t xml:space="preserve"> в регулярной структуре позволяет избегать попадания рабочей точки на опасные резонансы на диаграмме частот.</w:t>
       </w:r>
     </w:p>
     <w:p>
@@ -3115,8 +4294,8 @@
           <w:lang w:val="en-US"/>
         </w:rPr>
       </w:pPr>
-      <w:bookmarkStart w:id="1" w:name="_bookmark27"/>
-      <w:bookmarkEnd w:id="1"/>
+      <w:bookmarkStart w:id="2" w:name="_bookmark27"/>
+      <w:bookmarkEnd w:id="2"/>
       <w:r>
         <w:rPr>
           <w:rFonts w:asciiTheme="majorBidi" w:hAnsiTheme="majorBidi" w:cstheme="majorBidi"/>
@@ -3124,6 +4303,7 @@
           <w:sz w:val="24"/>
           <w:szCs w:val="24"/>
         </w:rPr>
+        <w:lastRenderedPageBreak/>
         <w:t>СПИСОК</w:t>
       </w:r>
       <w:r>
@@ -3335,44 +4515,24 @@
           <w:color w:val="000000"/>
           <w:lang w:val="en-US"/>
         </w:rPr>
-        <w:t xml:space="preserve">Complex // Phys. Part. </w:t>
-      </w:r>
-      <w:proofErr w:type="spellStart"/>
+        <w:t>Complex // Phys. Part. Nucl. 2021. V. 52. P</w:t>
+      </w:r>
       <w:r>
         <w:rPr>
           <w:rFonts w:cstheme="minorHAnsi"/>
           <w:color w:val="000000"/>
           <w:lang w:val="en-US"/>
         </w:rPr>
-        <w:t>Nucl</w:t>
-      </w:r>
-      <w:proofErr w:type="spellEnd"/>
+        <w:t xml:space="preserve">. 997–1017; </w:t>
+      </w:r>
       <w:r>
         <w:rPr>
           <w:rFonts w:cstheme="minorHAnsi"/>
           <w:color w:val="000000"/>
           <w:lang w:val="en-US"/>
         </w:rPr>
-        <w:t>. 2021. V. 52. P</w:t>
-      </w:r>
-      <w:r>
-        <w:rPr>
-          <w:rFonts w:cstheme="minorHAnsi"/>
-          <w:color w:val="000000"/>
-          <w:lang w:val="en-US"/>
-        </w:rPr>
-        <w:t xml:space="preserve">. 997–1017; </w:t>
-      </w:r>
-      <w:proofErr w:type="spellStart"/>
-      <w:r>
-        <w:rPr>
-          <w:rFonts w:cstheme="minorHAnsi"/>
-          <w:color w:val="000000"/>
-          <w:lang w:val="en-US"/>
-        </w:rPr>
         <w:t>doi</w:t>
       </w:r>
-      <w:proofErr w:type="spellEnd"/>
       <w:r>
         <w:rPr>
           <w:rFonts w:cstheme="minorHAnsi"/>
@@ -3484,7 +4644,6 @@
           <w:lang w:val="en-US"/>
         </w:rPr>
         <w:tab/>
-        <w:t xml:space="preserve">Kolokolchikov, S.D., Senichev, Y.V., Aksentyev, A.E. et al. </w:t>
       </w:r>
       <w:r>
         <w:rPr>
@@ -3492,7 +4651,23 @@
           <w:color w:val="000000"/>
           <w:lang w:val="en-US"/>
         </w:rPr>
-        <w:t xml:space="preserve">Features of dual-purpose structure for heavy ion and light particles. NUCL SCI TECH 36, 210 (2025). </w:t>
+        <w:t>V. Lebedev, OptiM code, Private communication</w:t>
+      </w:r>
+      <w:r>
+        <w:rPr>
+          <w:rFonts w:cstheme="minorHAnsi"/>
+          <w:color w:val="000000"/>
+          <w:lang w:val="en-US"/>
+        </w:rPr>
+        <w:t>, URL:</w:t>
+      </w:r>
+      <w:r>
+        <w:rPr>
+          <w:rFonts w:cstheme="minorHAnsi"/>
+          <w:color w:val="000000"/>
+          <w:lang w:val="en-US"/>
+        </w:rPr>
+        <w:t xml:space="preserve"> </w:t>
       </w:r>
       <w:hyperlink r:id="rId7" w:history="1">
         <w:r>
@@ -3501,7 +4676,7 @@
             <w:rFonts w:cstheme="minorHAnsi"/>
             <w:lang w:val="en-US"/>
           </w:rPr>
-          <w:t>https://doi.org/10.1007/s41365-025-01791-4</w:t>
+          <w:t>www-bdnew.fnal.gov/pbar/organizationalchart/lebedev/OptiM/optim.htm</w:t>
         </w:r>
       </w:hyperlink>
       <w:r>
@@ -3510,7 +4685,7 @@
           <w:color w:val="000000"/>
           <w:lang w:val="en-US"/>
         </w:rPr>
-        <w:t>.</w:t>
+        <w:t xml:space="preserve">l </w:t>
       </w:r>
     </w:p>
     <w:p>
@@ -3589,7 +4764,6 @@
           <w:color w:val="000000"/>
           <w:lang w:val="en-US"/>
         </w:rPr>
-        <w:lastRenderedPageBreak/>
         <w:t>3</w:t>
       </w:r>
       <w:r>
@@ -3614,7 +4788,7 @@
           <w:color w:val="000000"/>
           <w:lang w:val="en-US"/>
         </w:rPr>
-        <w:t>V. Lebedev, OptiM code, Private communication</w:t>
+        <w:t xml:space="preserve">Kolokolchikov, S.D., Senichev, Y.V., Aksentyev, A.E. et al. </w:t>
       </w:r>
       <w:r>
         <w:rPr>
@@ -3622,15 +4796,7 @@
           <w:color w:val="000000"/>
           <w:lang w:val="en-US"/>
         </w:rPr>
-        <w:t>, URL:</w:t>
-      </w:r>
-      <w:r>
-        <w:rPr>
-          <w:rFonts w:cstheme="minorHAnsi"/>
-          <w:color w:val="000000"/>
-          <w:lang w:val="en-US"/>
-        </w:rPr>
-        <w:t xml:space="preserve"> </w:t>
+        <w:t xml:space="preserve">Features of dual-purpose structure for heavy ion and light particles. NUCL SCI TECH 36, 210 (2025). </w:t>
       </w:r>
       <w:hyperlink r:id="rId8" w:history="1">
         <w:r>
@@ -3639,7 +4805,7 @@
             <w:rFonts w:cstheme="minorHAnsi"/>
             <w:lang w:val="en-US"/>
           </w:rPr>
-          <w:t>www-bdnew.fnal.gov/pbar/organizationalchart/lebedev/OptiM/optim.htm</w:t>
+          <w:t>https://doi.org/10.1007/s41365-025-01791-4</w:t>
         </w:r>
       </w:hyperlink>
       <w:r>
@@ -3648,7 +4814,7 @@
           <w:color w:val="000000"/>
           <w:lang w:val="en-US"/>
         </w:rPr>
-        <w:t>l</w:t>
+        <w:t>.</w:t>
       </w:r>
     </w:p>
     <w:p>
@@ -3722,6 +4888,108 @@
           <w:lang w:val="en-US"/>
         </w:rPr>
       </w:pPr>
+      <w:r>
+        <w:rPr>
+          <w:rFonts w:cstheme="minorHAnsi"/>
+          <w:color w:val="000000"/>
+          <w:lang w:val="en-US"/>
+        </w:rPr>
+        <w:t>4</w:t>
+      </w:r>
+      <w:r>
+        <w:rPr>
+          <w:rFonts w:cstheme="minorHAnsi"/>
+          <w:color w:val="000000"/>
+          <w:lang w:val="en-US"/>
+        </w:rPr>
+        <w:t xml:space="preserve">. </w:t>
+      </w:r>
+      <w:r>
+        <w:rPr>
+          <w:rFonts w:cstheme="minorHAnsi"/>
+          <w:color w:val="000000"/>
+          <w:lang w:val="en-US"/>
+        </w:rPr>
+        <w:tab/>
+      </w:r>
+      <w:r>
+        <w:rPr>
+          <w:rFonts w:cstheme="minorHAnsi"/>
+          <w:color w:val="000000"/>
+          <w:lang w:val="en-US"/>
+        </w:rPr>
+        <w:t>Fanouria Antoniou and Frank Zimmermann</w:t>
+      </w:r>
+      <w:r>
+        <w:rPr>
+          <w:rFonts w:cstheme="minorHAnsi"/>
+          <w:color w:val="000000"/>
+          <w:lang w:val="en-US"/>
+        </w:rPr>
+        <w:t xml:space="preserve">, </w:t>
+      </w:r>
+      <w:r>
+        <w:rPr>
+          <w:rFonts w:cstheme="minorHAnsi"/>
+          <w:color w:val="000000"/>
+          <w:lang w:val="en-US"/>
+        </w:rPr>
+        <w:t>Revision of Intrabeam Scattering with</w:t>
+      </w:r>
+      <w:r>
+        <w:rPr>
+          <w:rFonts w:cstheme="minorHAnsi"/>
+          <w:color w:val="000000"/>
+          <w:lang w:val="en-US"/>
+        </w:rPr>
+        <w:t xml:space="preserve"> </w:t>
+      </w:r>
+      <w:r>
+        <w:rPr>
+          <w:rFonts w:cstheme="minorHAnsi"/>
+          <w:color w:val="000000"/>
+          <w:lang w:val="en-US"/>
+        </w:rPr>
+        <w:t>Non-Ultrarelativistic Corrections and Vertical</w:t>
+      </w:r>
+      <w:r>
+        <w:rPr>
+          <w:rFonts w:cstheme="minorHAnsi"/>
+          <w:color w:val="000000"/>
+          <w:lang w:val="en-US"/>
+        </w:rPr>
+        <w:t xml:space="preserve"> D</w:t>
+      </w:r>
+      <w:r>
+        <w:rPr>
+          <w:rFonts w:cstheme="minorHAnsi"/>
+          <w:color w:val="000000"/>
+          <w:lang w:val="en-US"/>
+        </w:rPr>
+        <w:t>ispersion for MAD-X</w:t>
+      </w:r>
+      <w:r>
+        <w:rPr>
+          <w:rFonts w:cstheme="minorHAnsi"/>
+          <w:color w:val="000000"/>
+          <w:lang w:val="en-US"/>
+        </w:rPr>
+        <w:t xml:space="preserve">, </w:t>
+      </w:r>
+      <w:r>
+        <w:rPr>
+          <w:rFonts w:eastAsia="SimSun"/>
+          <w:lang w:val="en-US" w:eastAsia="en-US"/>
+        </w:rPr>
+        <w:t>CERN-ATS-2012-066</w:t>
+      </w:r>
+      <w:r>
+        <w:rPr>
+          <w:rFonts w:eastAsia="SimSun"/>
+          <w:lang w:val="en-US" w:eastAsia="en-US"/>
+        </w:rPr>
+        <w:t>.</w:t>
+      </w:r>
     </w:p>
     <w:p>
       <w:pPr>
@@ -3798,9 +5066,68 @@
         <w:rPr>
           <w:rFonts w:cstheme="minorHAnsi"/>
           <w:color w:val="000000"/>
-          <w:lang w:val="en-US"/>
-        </w:rPr>
-        <w:t>4</w:t>
+          <w:lang w:val="ru-RU"/>
+        </w:rPr>
+        <w:t>5.</w:t>
+      </w:r>
+      <w:r>
+        <w:rPr>
+          <w:rFonts w:cstheme="minorHAnsi"/>
+          <w:color w:val="000000"/>
+          <w:lang w:val="ru-RU"/>
+        </w:rPr>
+        <w:tab/>
+      </w:r>
+      <w:r>
+        <w:rPr>
+          <w:rFonts w:eastAsia="SimSun"/>
+          <w:lang w:val="ru-RU" w:eastAsia="en-US"/>
+        </w:rPr>
+        <w:t>С.</w:t>
+      </w:r>
+      <w:r>
+        <w:rPr>
+          <w:rFonts w:eastAsia="SimSun"/>
+          <w:lang w:val="ru-RU" w:eastAsia="en-US"/>
+        </w:rPr>
+        <w:t xml:space="preserve"> </w:t>
+      </w:r>
+      <w:r>
+        <w:rPr>
+          <w:rFonts w:eastAsia="SimSun"/>
+          <w:lang w:val="ru-RU" w:eastAsia="en-US"/>
+        </w:rPr>
+        <w:t>Колокольчиков</w:t>
+      </w:r>
+      <w:r>
+        <w:rPr>
+          <w:rFonts w:eastAsia="SimSun"/>
+          <w:lang w:val="ru-RU" w:eastAsia="en-US"/>
+        </w:rPr>
+        <w:t xml:space="preserve"> </w:t>
+      </w:r>
+      <w:r>
+        <w:rPr>
+          <w:rFonts w:eastAsia="SimSun"/>
+          <w:lang w:val="ru-RU" w:eastAsia="en-US"/>
+        </w:rPr>
+        <w:t xml:space="preserve">и др., </w:t>
+      </w:r>
+      <w:r>
+        <w:rPr>
+          <w:rFonts w:cstheme="minorHAnsi"/>
+          <w:color w:val="000000"/>
+          <w:lang w:val="ru-RU"/>
+        </w:rPr>
+        <w:t>П</w:t>
+      </w:r>
+      <w:r>
+        <w:rPr>
+          <w:rFonts w:cstheme="minorHAnsi"/>
+          <w:color w:val="000000"/>
+          <w:lang w:val="ru-RU"/>
+        </w:rPr>
+        <w:t xml:space="preserve">родольная динамика </w:t>
       </w:r>
       <w:r>
         <w:rPr>
@@ -3808,7 +5135,31 @@
           <w:color w:val="000000"/>
           <w:lang w:val="en-US"/>
         </w:rPr>
-        <w:t xml:space="preserve">. </w:t>
+        <w:t>NICA</w:t>
+      </w:r>
+      <w:r>
+        <w:rPr>
+          <w:rFonts w:cstheme="minorHAnsi"/>
+          <w:color w:val="000000"/>
+          <w:lang w:val="ru-RU"/>
+        </w:rPr>
+        <w:t xml:space="preserve"> в </w:t>
+      </w:r>
+      <w:r>
+        <w:rPr>
+          <w:rFonts w:cstheme="minorHAnsi"/>
+          <w:color w:val="000000"/>
+          <w:lang w:val="ru-RU"/>
+        </w:rPr>
+        <w:t>ВЧ</w:t>
+      </w:r>
+      <w:r>
+        <w:rPr>
+          <w:rFonts w:cstheme="minorHAnsi"/>
+          <w:color w:val="000000"/>
+          <w:lang w:val="ru-RU"/>
+        </w:rPr>
+        <w:t xml:space="preserve">-системе барьерного типа при критической энергии, включая импедансы в </w:t>
       </w:r>
       <w:r>
         <w:rPr>
@@ -3816,41 +5167,56 @@
           <w:color w:val="000000"/>
           <w:lang w:val="en-US"/>
         </w:rPr>
-        <w:tab/>
-      </w:r>
-      <w:proofErr w:type="spellStart"/>
+        <w:t>BLonD</w:t>
+      </w:r>
+      <w:r>
+        <w:rPr>
+          <w:rFonts w:cstheme="minorHAnsi"/>
+          <w:color w:val="000000"/>
+          <w:lang w:val="ru-RU"/>
+        </w:rPr>
+        <w:t>, Письма в ЭЧАЯ. 2024. Т</w:t>
+      </w:r>
       <w:r>
         <w:rPr>
           <w:rFonts w:cstheme="minorHAnsi"/>
           <w:color w:val="000000"/>
           <w:lang w:val="en-US"/>
         </w:rPr>
-        <w:t>Fanouria</w:t>
-      </w:r>
-      <w:proofErr w:type="spellEnd"/>
+        <w:t xml:space="preserve">. 21, № 3(254). </w:t>
+      </w:r>
+      <w:r>
+        <w:rPr>
+          <w:rFonts w:cstheme="minorHAnsi"/>
+          <w:color w:val="000000"/>
+          <w:lang w:val="ru-RU"/>
+        </w:rPr>
+        <w:t>С</w:t>
+      </w:r>
       <w:r>
         <w:rPr>
           <w:rFonts w:cstheme="minorHAnsi"/>
           <w:color w:val="000000"/>
           <w:lang w:val="en-US"/>
         </w:rPr>
-        <w:t xml:space="preserve"> Antoniou and Frank Zimmermann</w:t>
-      </w:r>
-      <w:r>
+        <w:t>. 549–556</w:t>
+      </w:r>
+    </w:p>
+    <w:p>
+      <w:pPr>
         <w:rPr>
           <w:rFonts w:cstheme="minorHAnsi"/>
           <w:color w:val="000000"/>
           <w:lang w:val="en-US"/>
         </w:rPr>
-        <w:t xml:space="preserve">, </w:t>
-      </w:r>
+      </w:pPr>
       <w:r>
         <w:rPr>
           <w:rFonts w:cstheme="minorHAnsi"/>
           <w:color w:val="000000"/>
           <w:lang w:val="en-US"/>
         </w:rPr>
-        <w:t>Revision of Intrabeam Scattering with</w:t>
+        <w:t>6</w:t>
       </w:r>
       <w:r>
         <w:rPr>
@@ -3858,7 +5224,7 @@
           <w:color w:val="000000"/>
           <w:lang w:val="en-US"/>
         </w:rPr>
-        <w:t xml:space="preserve"> </w:t>
+        <w:t>.</w:t>
       </w:r>
       <w:r>
         <w:rPr>
@@ -3866,63 +5232,15 @@
           <w:color w:val="000000"/>
           <w:lang w:val="en-US"/>
         </w:rPr>
-        <w:t>Non-</w:t>
-      </w:r>
-      <w:proofErr w:type="spellStart"/>
+        <w:tab/>
+      </w:r>
       <w:r>
         <w:rPr>
           <w:rFonts w:cstheme="minorHAnsi"/>
           <w:color w:val="000000"/>
           <w:lang w:val="en-US"/>
         </w:rPr>
-        <w:t>Ultrarelativistic</w:t>
-      </w:r>
-      <w:proofErr w:type="spellEnd"/>
-      <w:r>
-        <w:rPr>
-          <w:rFonts w:cstheme="minorHAnsi"/>
-          <w:color w:val="000000"/>
-          <w:lang w:val="en-US"/>
-        </w:rPr>
-        <w:t xml:space="preserve"> Corrections and Vertical</w:t>
-      </w:r>
-      <w:r>
-        <w:rPr>
-          <w:rFonts w:cstheme="minorHAnsi"/>
-          <w:color w:val="000000"/>
-          <w:lang w:val="en-US"/>
-        </w:rPr>
-        <w:t xml:space="preserve"> D</w:t>
-      </w:r>
-      <w:r>
-        <w:rPr>
-          <w:rFonts w:cstheme="minorHAnsi"/>
-          <w:color w:val="000000"/>
-          <w:lang w:val="en-US"/>
-        </w:rPr>
-        <w:t>ispersion for MAD-X</w:t>
-      </w:r>
-      <w:r>
-        <w:rPr>
-          <w:rFonts w:cstheme="minorHAnsi"/>
-          <w:color w:val="000000"/>
-          <w:lang w:val="en-US"/>
-        </w:rPr>
-        <w:t xml:space="preserve">, </w:t>
-      </w:r>
-      <w:r>
-        <w:rPr>
-          <w:rFonts w:eastAsia="SimSun"/>
-          <w:lang w:val="en-US" w:eastAsia="en-US"/>
-        </w:rPr>
-        <w:t>CERN-ATS-2012-066</w:t>
-      </w:r>
-      <w:r>
-        <w:rPr>
-          <w:rFonts w:eastAsia="SimSun"/>
-          <w:lang w:val="en-US" w:eastAsia="en-US"/>
-        </w:rPr>
-        <w:t>.</w:t>
+        <w:t>G. Iadarola, R. De Maria, S. Łopaciuk, A. Abramov, X. Buffat, D. Demetriadou, L. Deniau, P. Hermes, P. Kicsiny, P. Kruyt, A. Latina, L. Mether, K. Paraschou, G. Sterbini, F. F. Van Der Veken, P. Belanger, P. Niedermayer, D. Di Croce, T. Pieloni, L. Van Riesen-Haupt, M. Seidel. “Xsuite: An Integrated Beam Physics Simulation Framework,” JACoW HB2023 (2024), TUA2I1.</w:t>
       </w:r>
     </w:p>
     <w:p>
@@ -3989,512 +5307,6 @@
         <w:autoSpaceDN w:val="0"/>
         <w:adjustRightInd w:val="0"/>
         <w:spacing w:line="360" w:lineRule="auto"/>
-        <w:jc w:val="both"/>
-        <w:rPr>
-          <w:rFonts w:cstheme="minorHAnsi"/>
-          <w:color w:val="000000"/>
-          <w:lang w:val="en-US"/>
-        </w:rPr>
-      </w:pPr>
-      <w:r>
-        <w:rPr>
-          <w:rFonts w:cstheme="minorHAnsi"/>
-          <w:color w:val="000000"/>
-          <w:lang w:val="ru-RU"/>
-        </w:rPr>
-        <w:t>5.</w:t>
-      </w:r>
-      <w:r>
-        <w:rPr>
-          <w:rFonts w:cstheme="minorHAnsi"/>
-          <w:color w:val="000000"/>
-          <w:lang w:val="ru-RU"/>
-        </w:rPr>
-        <w:tab/>
-      </w:r>
-      <w:r>
-        <w:rPr>
-          <w:rFonts w:eastAsia="SimSun"/>
-          <w:lang w:val="ru-RU" w:eastAsia="en-US"/>
-        </w:rPr>
-        <w:t>С.</w:t>
-      </w:r>
-      <w:r>
-        <w:rPr>
-          <w:rFonts w:eastAsia="SimSun"/>
-          <w:lang w:val="ru-RU" w:eastAsia="en-US"/>
-        </w:rPr>
-        <w:t xml:space="preserve"> </w:t>
-      </w:r>
-      <w:r>
-        <w:rPr>
-          <w:rFonts w:eastAsia="SimSun"/>
-          <w:lang w:val="ru-RU" w:eastAsia="en-US"/>
-        </w:rPr>
-        <w:t>Колокольчиков</w:t>
-      </w:r>
-      <w:r>
-        <w:rPr>
-          <w:rFonts w:eastAsia="SimSun"/>
-          <w:lang w:val="ru-RU" w:eastAsia="en-US"/>
-        </w:rPr>
-        <w:t xml:space="preserve"> </w:t>
-      </w:r>
-      <w:r>
-        <w:rPr>
-          <w:rFonts w:eastAsia="SimSun"/>
-          <w:lang w:val="ru-RU" w:eastAsia="en-US"/>
-        </w:rPr>
-        <w:t xml:space="preserve">и др., </w:t>
-      </w:r>
-      <w:r>
-        <w:rPr>
-          <w:rFonts w:cstheme="minorHAnsi"/>
-          <w:color w:val="000000"/>
-          <w:lang w:val="ru-RU"/>
-        </w:rPr>
-        <w:t>П</w:t>
-      </w:r>
-      <w:r>
-        <w:rPr>
-          <w:rFonts w:cstheme="minorHAnsi"/>
-          <w:color w:val="000000"/>
-          <w:lang w:val="ru-RU"/>
-        </w:rPr>
-        <w:t xml:space="preserve">родольная динамика </w:t>
-      </w:r>
-      <w:r>
-        <w:rPr>
-          <w:rFonts w:cstheme="minorHAnsi"/>
-          <w:color w:val="000000"/>
-          <w:lang w:val="en-US"/>
-        </w:rPr>
-        <w:t>NICA</w:t>
-      </w:r>
-      <w:r>
-        <w:rPr>
-          <w:rFonts w:cstheme="minorHAnsi"/>
-          <w:color w:val="000000"/>
-          <w:lang w:val="ru-RU"/>
-        </w:rPr>
-        <w:t xml:space="preserve"> в </w:t>
-      </w:r>
-      <w:r>
-        <w:rPr>
-          <w:rFonts w:cstheme="minorHAnsi"/>
-          <w:color w:val="000000"/>
-          <w:lang w:val="ru-RU"/>
-        </w:rPr>
-        <w:t>ВЧ</w:t>
-      </w:r>
-      <w:r>
-        <w:rPr>
-          <w:rFonts w:cstheme="minorHAnsi"/>
-          <w:color w:val="000000"/>
-          <w:lang w:val="ru-RU"/>
-        </w:rPr>
-        <w:t xml:space="preserve">-системе барьерного типа при критической энергии, включая импедансы в </w:t>
-      </w:r>
-      <w:r>
-        <w:rPr>
-          <w:rFonts w:cstheme="minorHAnsi"/>
-          <w:color w:val="000000"/>
-          <w:lang w:val="en-US"/>
-        </w:rPr>
-        <w:t>BLonD</w:t>
-      </w:r>
-      <w:r>
-        <w:rPr>
-          <w:rFonts w:cstheme="minorHAnsi"/>
-          <w:color w:val="000000"/>
-          <w:lang w:val="ru-RU"/>
-        </w:rPr>
-        <w:t>, Письма в ЭЧАЯ. 2024. Т. 21, № 3(254). С</w:t>
-      </w:r>
-      <w:r>
-        <w:rPr>
-          <w:rFonts w:cstheme="minorHAnsi"/>
-          <w:color w:val="000000"/>
-          <w:lang w:val="en-US"/>
-        </w:rPr>
-        <w:t>. 549–556</w:t>
-      </w:r>
-    </w:p>
-    <w:p>
-      <w:pPr>
-        <w:rPr>
-          <w:rFonts w:cstheme="minorHAnsi"/>
-          <w:color w:val="000000"/>
-          <w:lang w:val="en-US"/>
-        </w:rPr>
-      </w:pPr>
-      <w:r>
-        <w:rPr>
-          <w:rFonts w:cstheme="minorHAnsi"/>
-          <w:color w:val="000000"/>
-          <w:lang w:val="en-US"/>
-        </w:rPr>
-        <w:t>6</w:t>
-      </w:r>
-      <w:r>
-        <w:rPr>
-          <w:rFonts w:cstheme="minorHAnsi"/>
-          <w:color w:val="000000"/>
-          <w:lang w:val="en-US"/>
-        </w:rPr>
-        <w:t>.</w:t>
-      </w:r>
-      <w:r>
-        <w:rPr>
-          <w:rFonts w:cstheme="minorHAnsi"/>
-          <w:color w:val="000000"/>
-          <w:lang w:val="en-US"/>
-        </w:rPr>
-        <w:tab/>
-      </w:r>
-      <w:r>
-        <w:rPr>
-          <w:rFonts w:cstheme="minorHAnsi"/>
-          <w:color w:val="000000"/>
-          <w:lang w:val="en-US"/>
-        </w:rPr>
-        <w:t xml:space="preserve">G. </w:t>
-      </w:r>
-      <w:proofErr w:type="spellStart"/>
-      <w:r>
-        <w:rPr>
-          <w:rFonts w:cstheme="minorHAnsi"/>
-          <w:color w:val="000000"/>
-          <w:lang w:val="en-US"/>
-        </w:rPr>
-        <w:t>Iadarola</w:t>
-      </w:r>
-      <w:proofErr w:type="spellEnd"/>
-      <w:r>
-        <w:rPr>
-          <w:rFonts w:cstheme="minorHAnsi"/>
-          <w:color w:val="000000"/>
-          <w:lang w:val="en-US"/>
-        </w:rPr>
-        <w:t xml:space="preserve">, R. De Maria, S. </w:t>
-      </w:r>
-      <w:proofErr w:type="spellStart"/>
-      <w:r>
-        <w:rPr>
-          <w:rFonts w:cstheme="minorHAnsi"/>
-          <w:color w:val="000000"/>
-          <w:lang w:val="en-US"/>
-        </w:rPr>
-        <w:t>Łopaciuk</w:t>
-      </w:r>
-      <w:proofErr w:type="spellEnd"/>
-      <w:r>
-        <w:rPr>
-          <w:rFonts w:cstheme="minorHAnsi"/>
-          <w:color w:val="000000"/>
-          <w:lang w:val="en-US"/>
-        </w:rPr>
-        <w:t xml:space="preserve">, A. Abramov, X. </w:t>
-      </w:r>
-      <w:proofErr w:type="spellStart"/>
-      <w:r>
-        <w:rPr>
-          <w:rFonts w:cstheme="minorHAnsi"/>
-          <w:color w:val="000000"/>
-          <w:lang w:val="en-US"/>
-        </w:rPr>
-        <w:t>Buffat</w:t>
-      </w:r>
-      <w:proofErr w:type="spellEnd"/>
-      <w:r>
-        <w:rPr>
-          <w:rFonts w:cstheme="minorHAnsi"/>
-          <w:color w:val="000000"/>
-          <w:lang w:val="en-US"/>
-        </w:rPr>
-        <w:t xml:space="preserve">, D. </w:t>
-      </w:r>
-      <w:proofErr w:type="spellStart"/>
-      <w:r>
-        <w:rPr>
-          <w:rFonts w:cstheme="minorHAnsi"/>
-          <w:color w:val="000000"/>
-          <w:lang w:val="en-US"/>
-        </w:rPr>
-        <w:t>Demetriadou</w:t>
-      </w:r>
-      <w:proofErr w:type="spellEnd"/>
-      <w:r>
-        <w:rPr>
-          <w:rFonts w:cstheme="minorHAnsi"/>
-          <w:color w:val="000000"/>
-          <w:lang w:val="en-US"/>
-        </w:rPr>
-        <w:t xml:space="preserve">, L. </w:t>
-      </w:r>
-      <w:proofErr w:type="spellStart"/>
-      <w:r>
-        <w:rPr>
-          <w:rFonts w:cstheme="minorHAnsi"/>
-          <w:color w:val="000000"/>
-          <w:lang w:val="en-US"/>
-        </w:rPr>
-        <w:t>Deniau</w:t>
-      </w:r>
-      <w:proofErr w:type="spellEnd"/>
-      <w:r>
-        <w:rPr>
-          <w:rFonts w:cstheme="minorHAnsi"/>
-          <w:color w:val="000000"/>
-          <w:lang w:val="en-US"/>
-        </w:rPr>
-        <w:t xml:space="preserve">, P. Hermes, P. </w:t>
-      </w:r>
-      <w:proofErr w:type="spellStart"/>
-      <w:r>
-        <w:rPr>
-          <w:rFonts w:cstheme="minorHAnsi"/>
-          <w:color w:val="000000"/>
-          <w:lang w:val="en-US"/>
-        </w:rPr>
-        <w:t>Kicsiny</w:t>
-      </w:r>
-      <w:proofErr w:type="spellEnd"/>
-      <w:r>
-        <w:rPr>
-          <w:rFonts w:cstheme="minorHAnsi"/>
-          <w:color w:val="000000"/>
-          <w:lang w:val="en-US"/>
-        </w:rPr>
-        <w:t xml:space="preserve">, P. </w:t>
-      </w:r>
-      <w:proofErr w:type="spellStart"/>
-      <w:r>
-        <w:rPr>
-          <w:rFonts w:cstheme="minorHAnsi"/>
-          <w:color w:val="000000"/>
-          <w:lang w:val="en-US"/>
-        </w:rPr>
-        <w:t>Kruyt</w:t>
-      </w:r>
-      <w:proofErr w:type="spellEnd"/>
-      <w:r>
-        <w:rPr>
-          <w:rFonts w:cstheme="minorHAnsi"/>
-          <w:color w:val="000000"/>
-          <w:lang w:val="en-US"/>
-        </w:rPr>
-        <w:t xml:space="preserve">, A. Latina, L. </w:t>
-      </w:r>
-      <w:proofErr w:type="spellStart"/>
-      <w:r>
-        <w:rPr>
-          <w:rFonts w:cstheme="minorHAnsi"/>
-          <w:color w:val="000000"/>
-          <w:lang w:val="en-US"/>
-        </w:rPr>
-        <w:t>Mether</w:t>
-      </w:r>
-      <w:proofErr w:type="spellEnd"/>
-      <w:r>
-        <w:rPr>
-          <w:rFonts w:cstheme="minorHAnsi"/>
-          <w:color w:val="000000"/>
-          <w:lang w:val="en-US"/>
-        </w:rPr>
-        <w:t xml:space="preserve">, K. </w:t>
-      </w:r>
-      <w:proofErr w:type="spellStart"/>
-      <w:r>
-        <w:rPr>
-          <w:rFonts w:cstheme="minorHAnsi"/>
-          <w:color w:val="000000"/>
-          <w:lang w:val="en-US"/>
-        </w:rPr>
-        <w:t>Paraschou</w:t>
-      </w:r>
-      <w:proofErr w:type="spellEnd"/>
-      <w:r>
-        <w:rPr>
-          <w:rFonts w:cstheme="minorHAnsi"/>
-          <w:color w:val="000000"/>
-          <w:lang w:val="en-US"/>
-        </w:rPr>
-        <w:t xml:space="preserve">, G. </w:t>
-      </w:r>
-      <w:proofErr w:type="spellStart"/>
-      <w:r>
-        <w:rPr>
-          <w:rFonts w:cstheme="minorHAnsi"/>
-          <w:color w:val="000000"/>
-          <w:lang w:val="en-US"/>
-        </w:rPr>
-        <w:t>Sterbini</w:t>
-      </w:r>
-      <w:proofErr w:type="spellEnd"/>
-      <w:r>
-        <w:rPr>
-          <w:rFonts w:cstheme="minorHAnsi"/>
-          <w:color w:val="000000"/>
-          <w:lang w:val="en-US"/>
-        </w:rPr>
-        <w:t xml:space="preserve">, F. F. Van Der </w:t>
-      </w:r>
-      <w:proofErr w:type="spellStart"/>
-      <w:r>
-        <w:rPr>
-          <w:rFonts w:cstheme="minorHAnsi"/>
-          <w:color w:val="000000"/>
-          <w:lang w:val="en-US"/>
-        </w:rPr>
-        <w:t>Veken</w:t>
-      </w:r>
-      <w:proofErr w:type="spellEnd"/>
-      <w:r>
-        <w:rPr>
-          <w:rFonts w:cstheme="minorHAnsi"/>
-          <w:color w:val="000000"/>
-          <w:lang w:val="en-US"/>
-        </w:rPr>
-        <w:t xml:space="preserve">, P. Belanger, P. </w:t>
-      </w:r>
-      <w:proofErr w:type="spellStart"/>
-      <w:r>
-        <w:rPr>
-          <w:rFonts w:cstheme="minorHAnsi"/>
-          <w:color w:val="000000"/>
-          <w:lang w:val="en-US"/>
-        </w:rPr>
-        <w:t>Niedermayer</w:t>
-      </w:r>
-      <w:proofErr w:type="spellEnd"/>
-      <w:r>
-        <w:rPr>
-          <w:rFonts w:cstheme="minorHAnsi"/>
-          <w:color w:val="000000"/>
-          <w:lang w:val="en-US"/>
-        </w:rPr>
-        <w:t xml:space="preserve">, D. Di Croce, T. </w:t>
-      </w:r>
-      <w:proofErr w:type="spellStart"/>
-      <w:r>
-        <w:rPr>
-          <w:rFonts w:cstheme="minorHAnsi"/>
-          <w:color w:val="000000"/>
-          <w:lang w:val="en-US"/>
-        </w:rPr>
-        <w:t>Pieloni</w:t>
-      </w:r>
-      <w:proofErr w:type="spellEnd"/>
-      <w:r>
-        <w:rPr>
-          <w:rFonts w:cstheme="minorHAnsi"/>
-          <w:color w:val="000000"/>
-          <w:lang w:val="en-US"/>
-        </w:rPr>
-        <w:t xml:space="preserve">, L. Van </w:t>
-      </w:r>
-      <w:proofErr w:type="spellStart"/>
-      <w:r>
-        <w:rPr>
-          <w:rFonts w:cstheme="minorHAnsi"/>
-          <w:color w:val="000000"/>
-          <w:lang w:val="en-US"/>
-        </w:rPr>
-        <w:t>Riesen</w:t>
-      </w:r>
-      <w:proofErr w:type="spellEnd"/>
-      <w:r>
-        <w:rPr>
-          <w:rFonts w:cstheme="minorHAnsi"/>
-          <w:color w:val="000000"/>
-          <w:lang w:val="en-US"/>
-        </w:rPr>
-        <w:t xml:space="preserve">-Haupt, M. Seidel. “Xsuite: An Integrated Beam Physics Simulation Framework,” </w:t>
-      </w:r>
-      <w:proofErr w:type="spellStart"/>
-      <w:r>
-        <w:rPr>
-          <w:rFonts w:cstheme="minorHAnsi"/>
-          <w:color w:val="000000"/>
-          <w:lang w:val="en-US"/>
-        </w:rPr>
-        <w:t>JACoW</w:t>
-      </w:r>
-      <w:proofErr w:type="spellEnd"/>
-      <w:r>
-        <w:rPr>
-          <w:rFonts w:cstheme="minorHAnsi"/>
-          <w:color w:val="000000"/>
-          <w:lang w:val="en-US"/>
-        </w:rPr>
-        <w:t xml:space="preserve"> HB2023 (2024), TUA2I1.</w:t>
-      </w:r>
-    </w:p>
-    <w:p>
-      <w:pPr>
-        <w:tabs>
-          <w:tab w:val="left" w:pos="560"/>
-          <w:tab w:val="left" w:pos="1121"/>
-          <w:tab w:val="left" w:pos="1681"/>
-          <w:tab w:val="left" w:pos="2242"/>
-          <w:tab w:val="left" w:pos="2803"/>
-          <w:tab w:val="left" w:pos="3363"/>
-          <w:tab w:val="left" w:pos="3924"/>
-          <w:tab w:val="left" w:pos="4485"/>
-          <w:tab w:val="left" w:pos="5045"/>
-          <w:tab w:val="left" w:pos="5606"/>
-          <w:tab w:val="left" w:pos="6166"/>
-          <w:tab w:val="left" w:pos="6727"/>
-          <w:tab w:val="left" w:pos="7288"/>
-          <w:tab w:val="left" w:pos="7848"/>
-          <w:tab w:val="left" w:pos="8409"/>
-          <w:tab w:val="left" w:pos="8970"/>
-          <w:tab w:val="left" w:pos="9530"/>
-          <w:tab w:val="left" w:pos="10091"/>
-          <w:tab w:val="left" w:pos="10651"/>
-          <w:tab w:val="left" w:pos="11212"/>
-          <w:tab w:val="left" w:pos="11773"/>
-          <w:tab w:val="left" w:pos="12333"/>
-          <w:tab w:val="left" w:pos="12894"/>
-          <w:tab w:val="left" w:pos="13455"/>
-          <w:tab w:val="left" w:pos="14015"/>
-          <w:tab w:val="left" w:pos="14576"/>
-          <w:tab w:val="left" w:pos="15136"/>
-          <w:tab w:val="left" w:pos="15697"/>
-          <w:tab w:val="left" w:pos="16258"/>
-          <w:tab w:val="left" w:pos="16818"/>
-          <w:tab w:val="left" w:pos="17379"/>
-          <w:tab w:val="left" w:pos="17940"/>
-          <w:tab w:val="left" w:pos="18500"/>
-          <w:tab w:val="left" w:pos="19061"/>
-          <w:tab w:val="left" w:pos="19621"/>
-          <w:tab w:val="left" w:pos="20182"/>
-          <w:tab w:val="left" w:pos="20743"/>
-          <w:tab w:val="left" w:pos="21303"/>
-          <w:tab w:val="left" w:pos="21864"/>
-          <w:tab w:val="left" w:pos="22425"/>
-          <w:tab w:val="left" w:pos="22985"/>
-          <w:tab w:val="left" w:pos="23546"/>
-          <w:tab w:val="left" w:pos="24106"/>
-          <w:tab w:val="left" w:pos="24667"/>
-          <w:tab w:val="left" w:pos="25228"/>
-          <w:tab w:val="left" w:pos="25788"/>
-          <w:tab w:val="left" w:pos="26349"/>
-          <w:tab w:val="left" w:pos="26910"/>
-          <w:tab w:val="left" w:pos="27470"/>
-          <w:tab w:val="left" w:pos="28031"/>
-          <w:tab w:val="left" w:pos="28591"/>
-          <w:tab w:val="left" w:pos="29152"/>
-          <w:tab w:val="left" w:pos="29713"/>
-          <w:tab w:val="left" w:pos="30273"/>
-          <w:tab w:val="left" w:pos="30834"/>
-          <w:tab w:val="left" w:pos="31395"/>
-        </w:tabs>
-        <w:autoSpaceDE w:val="0"/>
-        <w:autoSpaceDN w:val="0"/>
-        <w:adjustRightInd w:val="0"/>
-        <w:spacing w:line="360" w:lineRule="auto"/>
         <w:rPr>
           <w:rStyle w:val="ab"/>
           <w:rFonts w:cstheme="minorHAnsi"/>
@@ -4902,21 +5714,7 @@
           <w:szCs w:val="24"/>
           <w:lang w:val="ru-RU"/>
         </w:rPr>
-        <w:t>Твисс</w:t>
-      </w:r>
-      <w:r>
-        <w:rPr>
-          <w:rFonts w:asciiTheme="majorBidi" w:eastAsia="PMingLiU" w:hAnsiTheme="majorBidi" w:cstheme="majorBidi"/>
-          <w:bCs/>
-          <w:i w:val="0"/>
-          <w:iCs w:val="0"/>
-          <w:noProof/>
-          <w:color w:val="auto"/>
-          <w:sz w:val="24"/>
-          <w:szCs w:val="24"/>
-          <w:lang w:val="ru-RU"/>
-        </w:rPr>
-        <w:t xml:space="preserve">-функции комбинированной структуры коллайдера </w:t>
+        <w:t xml:space="preserve">Зависимость времени (а) внутрипучкового рассеяния и (б) стохастического охлаждения от энергии пучка для различных структур для проектной светимости коллайдера </w:t>
       </w:r>
       <w:r>
         <w:rPr>
@@ -5045,7 +5843,7 @@
           <w:szCs w:val="24"/>
           <w:lang w:val="ru-RU"/>
         </w:rPr>
-        <w:t>Зависимость времени внутрипучкового рассеяния и стохастического охлаждения от энергии пучка для различных структур</w:t>
+        <w:t>Твисс</w:t>
       </w:r>
       <w:r>
         <w:rPr>
@@ -5059,7 +5857,7 @@
           <w:szCs w:val="24"/>
           <w:lang w:val="ru-RU"/>
         </w:rPr>
-        <w:t xml:space="preserve"> для проектной светимости коллайдера </w:t>
+        <w:t xml:space="preserve">-функции комбинированной структуры коллайдера </w:t>
       </w:r>
       <w:r>
         <w:rPr>
@@ -5135,7 +5933,21 @@
           <w:szCs w:val="24"/>
           <w:lang w:val="ru-RU"/>
         </w:rPr>
-        <w:t xml:space="preserve">. </w:t>
+        <w:t>.</w:t>
+      </w:r>
+      <w:r>
+        <w:rPr>
+          <w:rFonts w:asciiTheme="majorBidi" w:eastAsia="PMingLiU" w:hAnsiTheme="majorBidi" w:cstheme="majorBidi"/>
+          <w:b/>
+          <w:i w:val="0"/>
+          <w:iCs w:val="0"/>
+          <w:noProof/>
+          <w:color w:val="auto"/>
+          <w:sz w:val="24"/>
+          <w:szCs w:val="24"/>
+          <w:lang w:val="ru-RU"/>
+        </w:rPr>
+        <w:t xml:space="preserve"> </w:t>
       </w:r>
       <w:r>
         <w:rPr>
@@ -5253,7 +6065,7 @@
           <w:szCs w:val="24"/>
           <w:lang w:val="ru-RU"/>
         </w:rPr>
-        <w:t>Рис</w:t>
+        <w:t xml:space="preserve">Рис. </w:t>
       </w:r>
       <w:r>
         <w:rPr>
@@ -5262,12 +6074,11 @@
           <w:i w:val="0"/>
           <w:iCs w:val="0"/>
           <w:noProof/>
-          <w:color w:val="auto"/>
-          <w:sz w:val="24"/>
-          <w:szCs w:val="24"/>
-          <w:lang w:val="ru-RU"/>
-        </w:rPr>
-        <w:t xml:space="preserve">. </w:t>
+          <w:sz w:val="24"/>
+          <w:szCs w:val="24"/>
+          <w:lang w:val="ru-RU"/>
+        </w:rPr>
+        <w:t>6</w:t>
       </w:r>
       <w:r>
         <w:rPr>
@@ -5281,7 +6092,181 @@
           <w:szCs w:val="24"/>
           <w:lang w:val="ru-RU"/>
         </w:rPr>
-        <w:t>6</w:t>
+        <w:t>.</w:t>
+      </w:r>
+      <w:r>
+        <w:rPr>
+          <w:rFonts w:asciiTheme="majorBidi" w:eastAsia="PMingLiU" w:hAnsiTheme="majorBidi" w:cstheme="majorBidi"/>
+          <w:b/>
+          <w:i w:val="0"/>
+          <w:iCs w:val="0"/>
+          <w:noProof/>
+          <w:color w:val="auto"/>
+          <w:sz w:val="24"/>
+          <w:szCs w:val="24"/>
+          <w:lang w:val="ru-RU"/>
+        </w:rPr>
+        <w:t xml:space="preserve"> </w:t>
+      </w:r>
+      <w:r>
+        <w:rPr>
+          <w:rFonts w:asciiTheme="majorBidi" w:eastAsia="PMingLiU" w:hAnsiTheme="majorBidi" w:cstheme="majorBidi"/>
+          <w:bCs/>
+          <w:i w:val="0"/>
+          <w:iCs w:val="0"/>
+          <w:noProof/>
+          <w:color w:val="auto"/>
+          <w:sz w:val="24"/>
+          <w:szCs w:val="24"/>
+          <w:lang w:val="ru-RU"/>
+        </w:rPr>
+        <w:t>Динамическая апертура</w:t>
+      </w:r>
+      <w:r>
+        <w:rPr>
+          <w:rFonts w:asciiTheme="majorBidi" w:eastAsia="PMingLiU" w:hAnsiTheme="majorBidi" w:cstheme="majorBidi"/>
+          <w:bCs/>
+          <w:i w:val="0"/>
+          <w:iCs w:val="0"/>
+          <w:noProof/>
+          <w:color w:val="auto"/>
+          <w:sz w:val="24"/>
+          <w:szCs w:val="24"/>
+          <w:lang w:val="ru-RU"/>
+        </w:rPr>
+        <w:t xml:space="preserve"> для </w:t>
+      </w:r>
+      <w:r>
+        <w:rPr>
+          <w:rFonts w:asciiTheme="majorBidi" w:eastAsia="PMingLiU" w:hAnsiTheme="majorBidi" w:cstheme="majorBidi"/>
+          <w:bCs/>
+          <w:i w:val="0"/>
+          <w:iCs w:val="0"/>
+          <w:noProof/>
+          <w:color w:val="auto"/>
+          <w:sz w:val="24"/>
+          <w:szCs w:val="24"/>
+          <w:lang w:val="ru-RU"/>
+        </w:rPr>
+        <w:t>(</w:t>
+      </w:r>
+      <w:r>
+        <w:rPr>
+          <w:rFonts w:asciiTheme="majorBidi" w:eastAsia="PMingLiU" w:hAnsiTheme="majorBidi" w:cstheme="majorBidi"/>
+          <w:bCs/>
+          <w:i w:val="0"/>
+          <w:iCs w:val="0"/>
+          <w:noProof/>
+          <w:color w:val="auto"/>
+          <w:sz w:val="24"/>
+          <w:szCs w:val="24"/>
+          <w:lang w:val="en-US"/>
+        </w:rPr>
+        <w:t>a</w:t>
+      </w:r>
+      <w:r>
+        <w:rPr>
+          <w:rFonts w:asciiTheme="majorBidi" w:eastAsia="PMingLiU" w:hAnsiTheme="majorBidi" w:cstheme="majorBidi"/>
+          <w:bCs/>
+          <w:i w:val="0"/>
+          <w:iCs w:val="0"/>
+          <w:noProof/>
+          <w:color w:val="auto"/>
+          <w:sz w:val="24"/>
+          <w:szCs w:val="24"/>
+          <w:lang w:val="ru-RU"/>
+        </w:rPr>
+        <w:t>)</w:t>
+      </w:r>
+      <w:r>
+        <w:rPr>
+          <w:rFonts w:asciiTheme="majorBidi" w:eastAsia="PMingLiU" w:hAnsiTheme="majorBidi" w:cstheme="majorBidi"/>
+          <w:bCs/>
+          <w:i w:val="0"/>
+          <w:iCs w:val="0"/>
+          <w:noProof/>
+          <w:color w:val="auto"/>
+          <w:sz w:val="24"/>
+          <w:szCs w:val="24"/>
+          <w:lang w:val="ru-RU"/>
+        </w:rPr>
+        <w:t xml:space="preserve"> </w:t>
+      </w:r>
+      <w:r>
+        <w:rPr>
+          <w:rFonts w:asciiTheme="majorBidi" w:eastAsia="PMingLiU" w:hAnsiTheme="majorBidi" w:cstheme="majorBidi"/>
+          <w:bCs/>
+          <w:i w:val="0"/>
+          <w:iCs w:val="0"/>
+          <w:noProof/>
+          <w:color w:val="auto"/>
+          <w:sz w:val="24"/>
+          <w:szCs w:val="24"/>
+          <w:lang w:val="ru-RU"/>
+        </w:rPr>
+        <w:t>регулярной, (б) резонансной, (в) комбинированной структур.</w:t>
+      </w:r>
+    </w:p>
+    <w:p>
+      <w:pPr>
+        <w:pStyle w:val="aa"/>
+        <w:suppressAutoHyphens/>
+        <w:spacing w:after="120" w:line="276" w:lineRule="auto"/>
+        <w:ind w:firstLine="567"/>
+        <w:jc w:val="both"/>
+        <w:rPr>
+          <w:rFonts w:asciiTheme="majorBidi" w:eastAsia="PMingLiU" w:hAnsiTheme="majorBidi" w:cstheme="majorBidi"/>
+          <w:bCs/>
+          <w:i w:val="0"/>
+          <w:iCs w:val="0"/>
+          <w:noProof/>
+          <w:color w:val="auto"/>
+          <w:sz w:val="24"/>
+          <w:szCs w:val="24"/>
+          <w:lang w:val="ru-RU"/>
+        </w:rPr>
+      </w:pPr>
+      <w:r>
+        <w:rPr>
+          <w:rFonts w:asciiTheme="majorBidi" w:eastAsia="PMingLiU" w:hAnsiTheme="majorBidi" w:cstheme="majorBidi"/>
+          <w:b/>
+          <w:i w:val="0"/>
+          <w:iCs w:val="0"/>
+          <w:noProof/>
+          <w:color w:val="auto"/>
+          <w:sz w:val="24"/>
+          <w:szCs w:val="24"/>
+          <w:lang w:val="ru-RU"/>
+        </w:rPr>
+        <w:t>Рис</w:t>
+      </w:r>
+      <w:r>
+        <w:rPr>
+          <w:rFonts w:asciiTheme="majorBidi" w:eastAsia="PMingLiU" w:hAnsiTheme="majorBidi" w:cstheme="majorBidi"/>
+          <w:b/>
+          <w:i w:val="0"/>
+          <w:iCs w:val="0"/>
+          <w:noProof/>
+          <w:color w:val="auto"/>
+          <w:sz w:val="24"/>
+          <w:szCs w:val="24"/>
+          <w:lang w:val="ru-RU"/>
+        </w:rPr>
+        <w:t xml:space="preserve">. </w:t>
+      </w:r>
+      <w:r>
+        <w:rPr>
+          <w:rFonts w:asciiTheme="majorBidi" w:eastAsia="PMingLiU" w:hAnsiTheme="majorBidi" w:cstheme="majorBidi"/>
+          <w:b/>
+          <w:i w:val="0"/>
+          <w:iCs w:val="0"/>
+          <w:noProof/>
+          <w:color w:val="auto"/>
+          <w:sz w:val="24"/>
+          <w:szCs w:val="24"/>
+          <w:lang w:val="ru-RU"/>
+        </w:rPr>
+        <w:t>7</w:t>
       </w:r>
       <w:r>
         <w:rPr>
@@ -5612,22 +6597,23 @@
       <w:r>
         <w:rPr>
           <w:rFonts w:asciiTheme="majorBidi" w:hAnsiTheme="majorBidi" w:cstheme="majorBidi"/>
+          <w:noProof/>
           <w:lang w:val="ru-RU"/>
         </w:rPr>
         <w:lastRenderedPageBreak/>
-        <w:t>Рисунок 3.</w:t>
-      </w:r>
-      <w:r>
-        <w:rPr>
-          <w:rFonts w:asciiTheme="majorBidi" w:hAnsiTheme="majorBidi" w:cstheme="majorBidi"/>
-          <w:noProof/>
-          <w:lang w:val="ru-RU"/>
-        </w:rPr>
         <w:drawing>
-          <wp:inline distT="0" distB="0" distL="0" distR="0" wp14:anchorId="447C5F29" wp14:editId="5AF9B510">
-            <wp:extent cx="5821680" cy="2948940"/>
-            <wp:effectExtent l="0" t="0" r="7620" b="3810"/>
-            <wp:docPr id="4" name="Рисунок 4"/>
+          <wp:anchor distT="0" distB="0" distL="114300" distR="114300" simplePos="0" relativeHeight="251659264" behindDoc="0" locked="0" layoutInCell="1" allowOverlap="1" wp14:anchorId="05ABCA20" wp14:editId="7D0A65C0">
+            <wp:simplePos x="0" y="0"/>
+            <wp:positionH relativeFrom="column">
+              <wp:posOffset>-1905</wp:posOffset>
+            </wp:positionH>
+            <wp:positionV relativeFrom="paragraph">
+              <wp:posOffset>238760</wp:posOffset>
+            </wp:positionV>
+            <wp:extent cx="2968625" cy="2392680"/>
+            <wp:effectExtent l="0" t="0" r="3175" b="7620"/>
+            <wp:wrapTopAndBottom/>
+            <wp:docPr id="5" name="Рисунок 5"/>
             <wp:cNvGraphicFramePr>
               <a:graphicFrameLocks xmlns:a="http://schemas.openxmlformats.org/drawingml/2006/main" noChangeAspect="1"/>
             </wp:cNvGraphicFramePr>
@@ -5635,13 +6621,13 @@
               <a:graphicData uri="http://schemas.openxmlformats.org/drawingml/2006/picture">
                 <pic:pic xmlns:pic="http://schemas.openxmlformats.org/drawingml/2006/picture">
                   <pic:nvPicPr>
-                    <pic:cNvPr id="0" name="Picture 4"/>
+                    <pic:cNvPr id="0" name="Picture 5"/>
                     <pic:cNvPicPr>
                       <a:picLocks noChangeAspect="1" noChangeArrowheads="1"/>
                     </pic:cNvPicPr>
                   </pic:nvPicPr>
                   <pic:blipFill>
-                    <a:blip r:embed="rId11">
+                    <a:blip r:embed="rId11" cstate="print">
                       <a:extLst>
                         <a:ext uri="{28A0092B-C50C-407E-A947-70E740481C1C}">
                           <a14:useLocalDpi xmlns:a14="http://schemas.microsoft.com/office/drawing/2010/main" val="0"/>
@@ -5656,7 +6642,7 @@
                   <pic:spPr bwMode="auto">
                     <a:xfrm>
                       <a:off x="0" y="0"/>
-                      <a:ext cx="5821680" cy="2948940"/>
+                      <a:ext cx="2968625" cy="2392680"/>
                     </a:xfrm>
                     <a:prstGeom prst="rect">
                       <a:avLst/>
@@ -5669,46 +6655,15 @@
                 </pic:pic>
               </a:graphicData>
             </a:graphic>
-          </wp:inline>
+            <wp14:sizeRelH relativeFrom="page">
+              <wp14:pctWidth>0</wp14:pctWidth>
+            </wp14:sizeRelH>
+            <wp14:sizeRelV relativeFrom="page">
+              <wp14:pctHeight>0</wp14:pctHeight>
+            </wp14:sizeRelV>
+          </wp:anchor>
         </w:drawing>
       </w:r>
-    </w:p>
-    <w:p>
-      <w:pPr>
-        <w:suppressAutoHyphens/>
-        <w:spacing w:line="276" w:lineRule="auto"/>
-        <w:rPr>
-          <w:rFonts w:asciiTheme="majorBidi" w:hAnsiTheme="majorBidi" w:cstheme="majorBidi"/>
-          <w:noProof/>
-          <w:lang w:val="ru-RU"/>
-        </w:rPr>
-      </w:pPr>
-      <w:r>
-        <w:rPr>
-          <w:rFonts w:asciiTheme="majorBidi" w:hAnsiTheme="majorBidi" w:cstheme="majorBidi"/>
-          <w:lang w:val="ru-RU"/>
-        </w:rPr>
-        <w:t>Рисунок 4.</w:t>
-      </w:r>
-      <w:r>
-        <w:rPr>
-          <w:rFonts w:asciiTheme="majorBidi" w:hAnsiTheme="majorBidi" w:cstheme="majorBidi"/>
-          <w:noProof/>
-          <w:lang w:val="ru-RU"/>
-        </w:rPr>
-        <w:t xml:space="preserve"> </w:t>
-      </w:r>
-    </w:p>
-    <w:p>
-      <w:pPr>
-        <w:suppressAutoHyphens/>
-        <w:spacing w:line="276" w:lineRule="auto"/>
-        <w:rPr>
-          <w:rFonts w:asciiTheme="majorBidi" w:hAnsiTheme="majorBidi" w:cstheme="majorBidi"/>
-          <w:noProof/>
-          <w:lang w:val="ru-RU"/>
-        </w:rPr>
-      </w:pPr>
       <w:r>
         <w:rPr>
           <w:rFonts w:asciiTheme="majorBidi" w:hAnsiTheme="majorBidi" w:cstheme="majorBidi"/>
@@ -5716,13 +6671,13 @@
           <w:lang w:val="ru-RU"/>
         </w:rPr>
         <w:drawing>
-          <wp:anchor distT="0" distB="0" distL="114300" distR="114300" simplePos="0" relativeHeight="251658240" behindDoc="0" locked="0" layoutInCell="1" allowOverlap="1" wp14:anchorId="2A8B7F29" wp14:editId="2B3DB096">
+          <wp:anchor distT="0" distB="0" distL="114300" distR="114300" simplePos="0" relativeHeight="251658240" behindDoc="0" locked="0" layoutInCell="1" allowOverlap="1" wp14:anchorId="2A8B7F29" wp14:editId="1969706B">
             <wp:simplePos x="0" y="0"/>
             <wp:positionH relativeFrom="column">
-              <wp:posOffset>3002280</wp:posOffset>
+              <wp:posOffset>3064625</wp:posOffset>
             </wp:positionH>
             <wp:positionV relativeFrom="paragraph">
-              <wp:posOffset>327660</wp:posOffset>
+              <wp:posOffset>239107</wp:posOffset>
             </wp:positionV>
             <wp:extent cx="2868017" cy="2394000"/>
             <wp:effectExtent l="0" t="0" r="8890" b="6350"/>
@@ -5781,22 +6736,128 @@
       <w:r>
         <w:rPr>
           <w:rFonts w:asciiTheme="majorBidi" w:hAnsiTheme="majorBidi" w:cstheme="majorBidi"/>
+          <w:lang w:val="ru-RU"/>
+        </w:rPr>
+        <w:t>Рисунок 3.</w:t>
+      </w:r>
+    </w:p>
+    <w:p>
+      <w:pPr>
+        <w:suppressAutoHyphens/>
+        <w:spacing w:line="276" w:lineRule="auto"/>
+        <w:rPr>
+          <w:rFonts w:asciiTheme="majorBidi" w:hAnsiTheme="majorBidi" w:cstheme="majorBidi"/>
+          <w:lang w:val="ru-RU"/>
+        </w:rPr>
+      </w:pPr>
+      <w:r>
+        <w:rPr>
+          <w:rFonts w:asciiTheme="majorBidi" w:hAnsiTheme="majorBidi" w:cstheme="majorBidi"/>
+          <w:lang w:val="ru-RU"/>
+        </w:rPr>
+        <w:t>(</w:t>
+      </w:r>
+      <w:r>
+        <w:rPr>
+          <w:rFonts w:asciiTheme="majorBidi" w:hAnsiTheme="majorBidi" w:cstheme="majorBidi"/>
+          <w:lang w:val="ru-RU"/>
+        </w:rPr>
+        <w:t>а</w:t>
+      </w:r>
+      <w:r>
+        <w:rPr>
+          <w:rFonts w:asciiTheme="majorBidi" w:hAnsiTheme="majorBidi" w:cstheme="majorBidi"/>
+          <w:lang w:val="ru-RU"/>
+        </w:rPr>
+        <w:t>)</w:t>
+      </w:r>
+      <w:r>
+        <w:rPr>
+          <w:rFonts w:asciiTheme="majorBidi" w:hAnsiTheme="majorBidi" w:cstheme="majorBidi"/>
+          <w:lang w:val="ru-RU"/>
+        </w:rPr>
+        <w:tab/>
+      </w:r>
+      <w:r>
+        <w:rPr>
+          <w:rFonts w:asciiTheme="majorBidi" w:hAnsiTheme="majorBidi" w:cstheme="majorBidi"/>
+          <w:lang w:val="ru-RU"/>
+        </w:rPr>
+        <w:tab/>
+      </w:r>
+      <w:r>
+        <w:rPr>
+          <w:rFonts w:asciiTheme="majorBidi" w:hAnsiTheme="majorBidi" w:cstheme="majorBidi"/>
+          <w:lang w:val="ru-RU"/>
+        </w:rPr>
+        <w:tab/>
+      </w:r>
+      <w:r>
+        <w:rPr>
+          <w:rFonts w:asciiTheme="majorBidi" w:hAnsiTheme="majorBidi" w:cstheme="majorBidi"/>
+          <w:lang w:val="ru-RU"/>
+        </w:rPr>
+        <w:tab/>
+      </w:r>
+      <w:r>
+        <w:rPr>
+          <w:rFonts w:asciiTheme="majorBidi" w:hAnsiTheme="majorBidi" w:cstheme="majorBidi"/>
+          <w:lang w:val="ru-RU"/>
+        </w:rPr>
+        <w:tab/>
+      </w:r>
+      <w:r>
+        <w:rPr>
+          <w:rFonts w:asciiTheme="majorBidi" w:hAnsiTheme="majorBidi" w:cstheme="majorBidi"/>
+          <w:lang w:val="ru-RU"/>
+        </w:rPr>
+        <w:tab/>
+      </w:r>
+      <w:r>
+        <w:rPr>
+          <w:rFonts w:asciiTheme="majorBidi" w:hAnsiTheme="majorBidi" w:cstheme="majorBidi"/>
+          <w:lang w:val="ru-RU"/>
+        </w:rPr>
+        <w:tab/>
+        <w:t>(б)</w:t>
+      </w:r>
+    </w:p>
+    <w:p>
+      <w:pPr>
+        <w:suppressAutoHyphens/>
+        <w:spacing w:line="276" w:lineRule="auto"/>
+        <w:rPr>
+          <w:rFonts w:asciiTheme="majorBidi" w:hAnsiTheme="majorBidi" w:cstheme="majorBidi"/>
+          <w:noProof/>
+          <w:lang w:val="ru-RU"/>
+        </w:rPr>
+      </w:pPr>
+      <w:r>
+        <w:rPr>
+          <w:rFonts w:asciiTheme="majorBidi" w:hAnsiTheme="majorBidi" w:cstheme="majorBidi"/>
+          <w:lang w:val="ru-RU"/>
+        </w:rPr>
+        <w:t>Рисунок 4.</w:t>
+      </w:r>
+      <w:r>
+        <w:rPr>
+          <w:rFonts w:asciiTheme="majorBidi" w:hAnsiTheme="majorBidi" w:cstheme="majorBidi"/>
+          <w:noProof/>
+          <w:lang w:val="ru-RU"/>
+        </w:rPr>
+        <w:t xml:space="preserve"> </w:t>
+      </w:r>
+      <w:r>
+        <w:rPr>
+          <w:rFonts w:asciiTheme="majorBidi" w:hAnsiTheme="majorBidi" w:cstheme="majorBidi"/>
           <w:noProof/>
           <w:lang w:val="ru-RU"/>
         </w:rPr>
         <w:drawing>
-          <wp:anchor distT="0" distB="0" distL="114300" distR="114300" simplePos="0" relativeHeight="251659264" behindDoc="0" locked="0" layoutInCell="1" allowOverlap="1" wp14:anchorId="05ABCA20" wp14:editId="6A5344A8">
-            <wp:simplePos x="0" y="0"/>
-            <wp:positionH relativeFrom="column">
-              <wp:posOffset>-64135</wp:posOffset>
-            </wp:positionH>
-            <wp:positionV relativeFrom="paragraph">
-              <wp:posOffset>327978</wp:posOffset>
-            </wp:positionV>
-            <wp:extent cx="2969019" cy="2392680"/>
-            <wp:effectExtent l="0" t="0" r="3175" b="7620"/>
-            <wp:wrapTopAndBottom/>
-            <wp:docPr id="5" name="Рисунок 5"/>
+          <wp:inline distT="0" distB="0" distL="0" distR="0" wp14:anchorId="60EA2F6C" wp14:editId="132A309B">
+            <wp:extent cx="5821680" cy="2948940"/>
+            <wp:effectExtent l="0" t="0" r="7620" b="3810"/>
+            <wp:docPr id="4" name="Рисунок 4"/>
             <wp:cNvGraphicFramePr>
               <a:graphicFrameLocks xmlns:a="http://schemas.openxmlformats.org/drawingml/2006/main" noChangeAspect="1"/>
             </wp:cNvGraphicFramePr>
@@ -5804,13 +6865,13 @@
               <a:graphicData uri="http://schemas.openxmlformats.org/drawingml/2006/picture">
                 <pic:pic xmlns:pic="http://schemas.openxmlformats.org/drawingml/2006/picture">
                   <pic:nvPicPr>
-                    <pic:cNvPr id="0" name="Picture 5"/>
+                    <pic:cNvPr id="0" name="Picture 4"/>
                     <pic:cNvPicPr>
                       <a:picLocks noChangeAspect="1" noChangeArrowheads="1"/>
                     </pic:cNvPicPr>
                   </pic:nvPicPr>
                   <pic:blipFill>
-                    <a:blip r:embed="rId13" cstate="print">
+                    <a:blip r:embed="rId13">
                       <a:extLst>
                         <a:ext uri="{28A0092B-C50C-407E-A947-70E740481C1C}">
                           <a14:useLocalDpi xmlns:a14="http://schemas.microsoft.com/office/drawing/2010/main" val="0"/>
@@ -5825,7 +6886,7 @@
                   <pic:spPr bwMode="auto">
                     <a:xfrm>
                       <a:off x="0" y="0"/>
-                      <a:ext cx="2969019" cy="2392680"/>
+                      <a:ext cx="5821680" cy="2948940"/>
                     </a:xfrm>
                     <a:prstGeom prst="rect">
                       <a:avLst/>
@@ -5838,13 +6899,7 @@
                 </pic:pic>
               </a:graphicData>
             </a:graphic>
-            <wp14:sizeRelH relativeFrom="page">
-              <wp14:pctWidth>0</wp14:pctWidth>
-            </wp14:sizeRelH>
-            <wp14:sizeRelV relativeFrom="page">
-              <wp14:pctHeight>0</wp14:pctHeight>
-            </wp14:sizeRelV>
-          </wp:anchor>
+          </wp:inline>
         </w:drawing>
       </w:r>
     </w:p>
@@ -5858,18 +6913,30 @@
           <w:lang w:val="ru-RU"/>
         </w:rPr>
       </w:pPr>
-      <w:r>
-        <w:rPr>
-          <w:noProof/>
-        </w:rPr>
+    </w:p>
+    <w:p>
+      <w:pPr>
+        <w:suppressAutoHyphens/>
+        <w:spacing w:line="276" w:lineRule="auto"/>
+        <w:rPr>
+          <w:rFonts w:asciiTheme="majorBidi" w:hAnsiTheme="majorBidi" w:cstheme="majorBidi"/>
+          <w:noProof/>
+          <w:lang w:val="ru-RU"/>
+        </w:rPr>
+      </w:pPr>
+      <w:r>
+        <w:rPr>
+          <w:noProof/>
+        </w:rPr>
+        <w:lastRenderedPageBreak/>
         <w:drawing>
-          <wp:anchor distT="0" distB="0" distL="114300" distR="114300" simplePos="0" relativeHeight="251660288" behindDoc="0" locked="0" layoutInCell="1" allowOverlap="1" wp14:anchorId="3FC28A9B" wp14:editId="7F408F47">
+          <wp:anchor distT="0" distB="0" distL="114300" distR="114300" simplePos="0" relativeHeight="251660288" behindDoc="0" locked="0" layoutInCell="1" allowOverlap="1" wp14:anchorId="3FC28A9B" wp14:editId="504957D8">
             <wp:simplePos x="0" y="0"/>
             <wp:positionH relativeFrom="column">
-              <wp:posOffset>-8255</wp:posOffset>
+              <wp:posOffset>1905</wp:posOffset>
             </wp:positionH>
             <wp:positionV relativeFrom="paragraph">
-              <wp:posOffset>2796540</wp:posOffset>
+              <wp:posOffset>262890</wp:posOffset>
             </wp:positionV>
             <wp:extent cx="3011805" cy="2393950"/>
             <wp:effectExtent l="0" t="0" r="0" b="6350"/>
@@ -5947,6 +7014,422 @@
         <w:suppressAutoHyphens/>
         <w:spacing w:line="276" w:lineRule="auto"/>
         <w:rPr>
+          <w:lang w:val="ru-RU"/>
+        </w:rPr>
+      </w:pPr>
+      <w:r>
+        <w:rPr>
+          <w:noProof/>
+        </w:rPr>
+        <w:drawing>
+          <wp:anchor distT="0" distB="0" distL="114300" distR="114300" simplePos="0" relativeHeight="251662336" behindDoc="1" locked="0" layoutInCell="1" allowOverlap="1" wp14:anchorId="5AE2EE01" wp14:editId="2CE63474">
+            <wp:simplePos x="0" y="0"/>
+            <wp:positionH relativeFrom="column">
+              <wp:posOffset>2929255</wp:posOffset>
+            </wp:positionH>
+            <wp:positionV relativeFrom="paragraph">
+              <wp:posOffset>2763520</wp:posOffset>
+            </wp:positionV>
+            <wp:extent cx="2886710" cy="2167255"/>
+            <wp:effectExtent l="0" t="0" r="8890" b="4445"/>
+            <wp:wrapTight wrapText="bothSides">
+              <wp:wrapPolygon edited="0">
+                <wp:start x="0" y="0"/>
+                <wp:lineTo x="0" y="21454"/>
+                <wp:lineTo x="21524" y="21454"/>
+                <wp:lineTo x="21524" y="0"/>
+                <wp:lineTo x="0" y="0"/>
+              </wp:wrapPolygon>
+            </wp:wrapTight>
+            <wp:docPr id="10" name="Рисунок 10"/>
+            <wp:cNvGraphicFramePr>
+              <a:graphicFrameLocks xmlns:a="http://schemas.openxmlformats.org/drawingml/2006/main" noChangeAspect="1"/>
+            </wp:cNvGraphicFramePr>
+            <a:graphic xmlns:a="http://schemas.openxmlformats.org/drawingml/2006/main">
+              <a:graphicData uri="http://schemas.openxmlformats.org/drawingml/2006/picture">
+                <pic:pic xmlns:pic="http://schemas.openxmlformats.org/drawingml/2006/picture">
+                  <pic:nvPicPr>
+                    <pic:cNvPr id="0" name="Picture 3"/>
+                    <pic:cNvPicPr>
+                      <a:picLocks noChangeAspect="1" noChangeArrowheads="1"/>
+                    </pic:cNvPicPr>
+                  </pic:nvPicPr>
+                  <pic:blipFill>
+                    <a:blip r:embed="rId15" cstate="print">
+                      <a:extLst>
+                        <a:ext uri="{28A0092B-C50C-407E-A947-70E740481C1C}">
+                          <a14:useLocalDpi xmlns:a14="http://schemas.microsoft.com/office/drawing/2010/main" val="0"/>
+                        </a:ext>
+                      </a:extLst>
+                    </a:blip>
+                    <a:srcRect/>
+                    <a:stretch>
+                      <a:fillRect/>
+                    </a:stretch>
+                  </pic:blipFill>
+                  <pic:spPr bwMode="auto">
+                    <a:xfrm>
+                      <a:off x="0" y="0"/>
+                      <a:ext cx="2886710" cy="2167255"/>
+                    </a:xfrm>
+                    <a:prstGeom prst="rect">
+                      <a:avLst/>
+                    </a:prstGeom>
+                    <a:noFill/>
+                    <a:ln>
+                      <a:noFill/>
+                    </a:ln>
+                  </pic:spPr>
+                </pic:pic>
+              </a:graphicData>
+            </a:graphic>
+            <wp14:sizeRelH relativeFrom="margin">
+              <wp14:pctWidth>0</wp14:pctWidth>
+            </wp14:sizeRelH>
+            <wp14:sizeRelV relativeFrom="margin">
+              <wp14:pctHeight>0</wp14:pctHeight>
+            </wp14:sizeRelV>
+          </wp:anchor>
+        </w:drawing>
+      </w:r>
+      <w:r>
+        <w:rPr>
+          <w:noProof/>
+        </w:rPr>
+        <w:drawing>
+          <wp:anchor distT="0" distB="0" distL="114300" distR="114300" simplePos="0" relativeHeight="251663360" behindDoc="1" locked="0" layoutInCell="1" allowOverlap="1" wp14:anchorId="5FBC6E5E" wp14:editId="6B06C9A2">
+            <wp:simplePos x="0" y="0"/>
+            <wp:positionH relativeFrom="column">
+              <wp:posOffset>635</wp:posOffset>
+            </wp:positionH>
+            <wp:positionV relativeFrom="paragraph">
+              <wp:posOffset>2757805</wp:posOffset>
+            </wp:positionV>
+            <wp:extent cx="2888615" cy="2171700"/>
+            <wp:effectExtent l="0" t="0" r="6985" b="0"/>
+            <wp:wrapTight wrapText="bothSides">
+              <wp:wrapPolygon edited="0">
+                <wp:start x="0" y="0"/>
+                <wp:lineTo x="0" y="21411"/>
+                <wp:lineTo x="21510" y="21411"/>
+                <wp:lineTo x="21510" y="0"/>
+                <wp:lineTo x="0" y="0"/>
+              </wp:wrapPolygon>
+            </wp:wrapTight>
+            <wp:docPr id="11" name="Рисунок 11"/>
+            <wp:cNvGraphicFramePr>
+              <a:graphicFrameLocks xmlns:a="http://schemas.openxmlformats.org/drawingml/2006/main" noChangeAspect="1"/>
+            </wp:cNvGraphicFramePr>
+            <a:graphic xmlns:a="http://schemas.openxmlformats.org/drawingml/2006/main">
+              <a:graphicData uri="http://schemas.openxmlformats.org/drawingml/2006/picture">
+                <pic:pic xmlns:pic="http://schemas.openxmlformats.org/drawingml/2006/picture">
+                  <pic:nvPicPr>
+                    <pic:cNvPr id="0" name="Picture 4"/>
+                    <pic:cNvPicPr>
+                      <a:picLocks noChangeAspect="1" noChangeArrowheads="1"/>
+                    </pic:cNvPicPr>
+                  </pic:nvPicPr>
+                  <pic:blipFill>
+                    <a:blip r:embed="rId16" cstate="print">
+                      <a:extLst>
+                        <a:ext uri="{28A0092B-C50C-407E-A947-70E740481C1C}">
+                          <a14:useLocalDpi xmlns:a14="http://schemas.microsoft.com/office/drawing/2010/main" val="0"/>
+                        </a:ext>
+                      </a:extLst>
+                    </a:blip>
+                    <a:srcRect/>
+                    <a:stretch>
+                      <a:fillRect/>
+                    </a:stretch>
+                  </pic:blipFill>
+                  <pic:spPr bwMode="auto">
+                    <a:xfrm>
+                      <a:off x="0" y="0"/>
+                      <a:ext cx="2888615" cy="2171700"/>
+                    </a:xfrm>
+                    <a:prstGeom prst="rect">
+                      <a:avLst/>
+                    </a:prstGeom>
+                    <a:noFill/>
+                    <a:ln>
+                      <a:noFill/>
+                    </a:ln>
+                  </pic:spPr>
+                </pic:pic>
+              </a:graphicData>
+            </a:graphic>
+            <wp14:sizeRelH relativeFrom="margin">
+              <wp14:pctWidth>0</wp14:pctWidth>
+            </wp14:sizeRelH>
+            <wp14:sizeRelV relativeFrom="margin">
+              <wp14:pctHeight>0</wp14:pctHeight>
+            </wp14:sizeRelV>
+          </wp:anchor>
+        </w:drawing>
+      </w:r>
+      <w:r>
+        <w:rPr>
+          <w:rFonts w:asciiTheme="majorBidi" w:hAnsiTheme="majorBidi" w:cstheme="majorBidi"/>
+          <w:noProof/>
+          <w:lang w:val="ru-RU"/>
+        </w:rPr>
+        <w:t>Рисунок 6.</w:t>
+      </w:r>
+      <w:r>
+        <w:rPr>
+          <w:lang w:val="ru-RU"/>
+        </w:rPr>
+        <w:t xml:space="preserve"> </w:t>
+      </w:r>
+    </w:p>
+    <w:p>
+      <w:pPr>
+        <w:suppressAutoHyphens/>
+        <w:spacing w:line="276" w:lineRule="auto"/>
+        <w:rPr>
+          <w:rFonts w:asciiTheme="majorBidi" w:hAnsiTheme="majorBidi" w:cstheme="majorBidi"/>
+          <w:noProof/>
+          <w:lang w:val="ru-RU"/>
+        </w:rPr>
+      </w:pPr>
+      <w:r>
+        <w:rPr>
+          <w:noProof/>
+        </w:rPr>
+        <w:drawing>
+          <wp:anchor distT="0" distB="0" distL="114300" distR="114300" simplePos="0" relativeHeight="251665408" behindDoc="0" locked="0" layoutInCell="1" allowOverlap="1" wp14:anchorId="20C99C6D" wp14:editId="799DA052">
+            <wp:simplePos x="0" y="0"/>
+            <wp:positionH relativeFrom="column">
+              <wp:posOffset>635</wp:posOffset>
+            </wp:positionH>
+            <wp:positionV relativeFrom="paragraph">
+              <wp:posOffset>2491740</wp:posOffset>
+            </wp:positionV>
+            <wp:extent cx="2886710" cy="2171065"/>
+            <wp:effectExtent l="0" t="0" r="8890" b="635"/>
+            <wp:wrapSquare wrapText="bothSides"/>
+            <wp:docPr id="12" name="Рисунок 12"/>
+            <wp:cNvGraphicFramePr>
+              <a:graphicFrameLocks xmlns:a="http://schemas.openxmlformats.org/drawingml/2006/main" noChangeAspect="1"/>
+            </wp:cNvGraphicFramePr>
+            <a:graphic xmlns:a="http://schemas.openxmlformats.org/drawingml/2006/main">
+              <a:graphicData uri="http://schemas.openxmlformats.org/drawingml/2006/picture">
+                <pic:pic xmlns:pic="http://schemas.openxmlformats.org/drawingml/2006/picture">
+                  <pic:nvPicPr>
+                    <pic:cNvPr id="0" name="Picture 7"/>
+                    <pic:cNvPicPr>
+                      <a:picLocks noChangeAspect="1" noChangeArrowheads="1"/>
+                    </pic:cNvPicPr>
+                  </pic:nvPicPr>
+                  <pic:blipFill>
+                    <a:blip r:embed="rId17" cstate="print">
+                      <a:extLst>
+                        <a:ext uri="{28A0092B-C50C-407E-A947-70E740481C1C}">
+                          <a14:useLocalDpi xmlns:a14="http://schemas.microsoft.com/office/drawing/2010/main" val="0"/>
+                        </a:ext>
+                      </a:extLst>
+                    </a:blip>
+                    <a:srcRect/>
+                    <a:stretch>
+                      <a:fillRect/>
+                    </a:stretch>
+                  </pic:blipFill>
+                  <pic:spPr bwMode="auto">
+                    <a:xfrm>
+                      <a:off x="0" y="0"/>
+                      <a:ext cx="2886710" cy="2171065"/>
+                    </a:xfrm>
+                    <a:prstGeom prst="rect">
+                      <a:avLst/>
+                    </a:prstGeom>
+                    <a:noFill/>
+                    <a:ln>
+                      <a:noFill/>
+                    </a:ln>
+                  </pic:spPr>
+                </pic:pic>
+              </a:graphicData>
+            </a:graphic>
+            <wp14:sizeRelH relativeFrom="margin">
+              <wp14:pctWidth>0</wp14:pctWidth>
+            </wp14:sizeRelH>
+            <wp14:sizeRelV relativeFrom="margin">
+              <wp14:pctHeight>0</wp14:pctHeight>
+            </wp14:sizeRelV>
+          </wp:anchor>
+        </w:drawing>
+      </w:r>
+      <w:r>
+        <w:rPr>
+          <w:noProof/>
+        </w:rPr>
+        <w:drawing>
+          <wp:anchor distT="0" distB="0" distL="114300" distR="114300" simplePos="0" relativeHeight="251664384" behindDoc="0" locked="0" layoutInCell="1" allowOverlap="1" wp14:anchorId="2D2C8A7D" wp14:editId="5455C619">
+            <wp:simplePos x="0" y="0"/>
+            <wp:positionH relativeFrom="column">
+              <wp:posOffset>2940050</wp:posOffset>
+            </wp:positionH>
+            <wp:positionV relativeFrom="paragraph">
+              <wp:posOffset>2491740</wp:posOffset>
+            </wp:positionV>
+            <wp:extent cx="2886710" cy="2168525"/>
+            <wp:effectExtent l="0" t="0" r="8890" b="3175"/>
+            <wp:wrapSquare wrapText="bothSides"/>
+            <wp:docPr id="13" name="Рисунок 13"/>
+            <wp:cNvGraphicFramePr>
+              <a:graphicFrameLocks xmlns:a="http://schemas.openxmlformats.org/drawingml/2006/main" noChangeAspect="1"/>
+            </wp:cNvGraphicFramePr>
+            <a:graphic xmlns:a="http://schemas.openxmlformats.org/drawingml/2006/main">
+              <a:graphicData uri="http://schemas.openxmlformats.org/drawingml/2006/picture">
+                <pic:pic xmlns:pic="http://schemas.openxmlformats.org/drawingml/2006/picture">
+                  <pic:nvPicPr>
+                    <pic:cNvPr id="0" name="Picture 8"/>
+                    <pic:cNvPicPr>
+                      <a:picLocks noChangeAspect="1" noChangeArrowheads="1"/>
+                    </pic:cNvPicPr>
+                  </pic:nvPicPr>
+                  <pic:blipFill>
+                    <a:blip r:embed="rId18" cstate="print">
+                      <a:extLst>
+                        <a:ext uri="{28A0092B-C50C-407E-A947-70E740481C1C}">
+                          <a14:useLocalDpi xmlns:a14="http://schemas.microsoft.com/office/drawing/2010/main" val="0"/>
+                        </a:ext>
+                      </a:extLst>
+                    </a:blip>
+                    <a:srcRect/>
+                    <a:stretch>
+                      <a:fillRect/>
+                    </a:stretch>
+                  </pic:blipFill>
+                  <pic:spPr bwMode="auto">
+                    <a:xfrm>
+                      <a:off x="0" y="0"/>
+                      <a:ext cx="2886710" cy="2168525"/>
+                    </a:xfrm>
+                    <a:prstGeom prst="rect">
+                      <a:avLst/>
+                    </a:prstGeom>
+                    <a:noFill/>
+                    <a:ln>
+                      <a:noFill/>
+                    </a:ln>
+                  </pic:spPr>
+                </pic:pic>
+              </a:graphicData>
+            </a:graphic>
+            <wp14:sizeRelH relativeFrom="margin">
+              <wp14:pctWidth>0</wp14:pctWidth>
+            </wp14:sizeRelH>
+            <wp14:sizeRelV relativeFrom="margin">
+              <wp14:pctHeight>0</wp14:pctHeight>
+            </wp14:sizeRelV>
+          </wp:anchor>
+        </w:drawing>
+      </w:r>
+      <w:r>
+        <w:rPr>
+          <w:rFonts w:asciiTheme="majorBidi" w:hAnsiTheme="majorBidi" w:cstheme="majorBidi"/>
+          <w:noProof/>
+          <w:lang w:val="ru-RU"/>
+        </w:rPr>
+        <w:t>(</w:t>
+      </w:r>
+      <w:r>
+        <w:rPr>
+          <w:rFonts w:asciiTheme="majorBidi" w:hAnsiTheme="majorBidi" w:cstheme="majorBidi"/>
+          <w:noProof/>
+          <w:lang w:val="ru-RU"/>
+        </w:rPr>
+        <w:t>а</w:t>
+      </w:r>
+      <w:r>
+        <w:rPr>
+          <w:rFonts w:asciiTheme="majorBidi" w:hAnsiTheme="majorBidi" w:cstheme="majorBidi"/>
+          <w:noProof/>
+          <w:lang w:val="ru-RU"/>
+        </w:rPr>
+        <w:t>)</w:t>
+      </w:r>
+    </w:p>
+    <w:p>
+      <w:pPr>
+        <w:suppressAutoHyphens/>
+        <w:spacing w:line="276" w:lineRule="auto"/>
+        <w:rPr>
+          <w:rFonts w:asciiTheme="majorBidi" w:hAnsiTheme="majorBidi" w:cstheme="majorBidi"/>
+          <w:noProof/>
+          <w:lang w:val="ru-RU"/>
+        </w:rPr>
+      </w:pPr>
+    </w:p>
+    <w:p>
+      <w:pPr>
+        <w:suppressAutoHyphens/>
+        <w:spacing w:line="276" w:lineRule="auto"/>
+        <w:rPr>
+          <w:rFonts w:asciiTheme="majorBidi" w:hAnsiTheme="majorBidi" w:cstheme="majorBidi"/>
+          <w:noProof/>
+          <w:lang w:val="ru-RU"/>
+        </w:rPr>
+      </w:pPr>
+      <w:r>
+        <w:rPr>
+          <w:rFonts w:asciiTheme="majorBidi" w:hAnsiTheme="majorBidi" w:cstheme="majorBidi"/>
+          <w:noProof/>
+          <w:lang w:val="ru-RU"/>
+        </w:rPr>
+        <w:t>(б)</w:t>
+      </w:r>
+    </w:p>
+    <w:p>
+      <w:pPr>
+        <w:suppressAutoHyphens/>
+        <w:spacing w:line="276" w:lineRule="auto"/>
+        <w:rPr>
+          <w:rFonts w:asciiTheme="majorBidi" w:hAnsiTheme="majorBidi" w:cstheme="majorBidi"/>
+          <w:noProof/>
+          <w:lang w:val="ru-RU"/>
+        </w:rPr>
+      </w:pPr>
+    </w:p>
+    <w:p>
+      <w:pPr>
+        <w:suppressAutoHyphens/>
+        <w:spacing w:line="276" w:lineRule="auto"/>
+        <w:rPr>
+          <w:rFonts w:asciiTheme="majorBidi" w:hAnsiTheme="majorBidi" w:cstheme="majorBidi"/>
+          <w:noProof/>
+          <w:lang w:val="ru-RU"/>
+        </w:rPr>
+      </w:pPr>
+    </w:p>
+    <w:p>
+      <w:pPr>
+        <w:suppressAutoHyphens/>
+        <w:spacing w:line="276" w:lineRule="auto"/>
+        <w:rPr>
+          <w:rFonts w:asciiTheme="majorBidi" w:hAnsiTheme="majorBidi" w:cstheme="majorBidi"/>
+          <w:noProof/>
+          <w:lang w:val="ru-RU"/>
+        </w:rPr>
+      </w:pPr>
+    </w:p>
+    <w:p>
+      <w:pPr>
+        <w:suppressAutoHyphens/>
+        <w:spacing w:line="276" w:lineRule="auto"/>
+        <w:rPr>
+          <w:rFonts w:asciiTheme="majorBidi" w:hAnsiTheme="majorBidi" w:cstheme="majorBidi"/>
+          <w:noProof/>
+          <w:lang w:val="ru-RU"/>
+        </w:rPr>
+      </w:pPr>
+    </w:p>
+    <w:p>
+      <w:pPr>
+        <w:suppressAutoHyphens/>
+        <w:spacing w:line="276" w:lineRule="auto"/>
+        <w:rPr>
           <w:rFonts w:asciiTheme="majorBidi" w:hAnsiTheme="majorBidi" w:cstheme="majorBidi"/>
           <w:noProof/>
           <w:lang w:val="ru-RU"/>
@@ -5958,13 +7441,188 @@
         </w:rPr>
         <w:lastRenderedPageBreak/>
         <w:drawing>
-          <wp:anchor distT="0" distB="0" distL="114300" distR="114300" simplePos="0" relativeHeight="251661312" behindDoc="0" locked="0" layoutInCell="1" allowOverlap="1" wp14:anchorId="188D5F1A" wp14:editId="693908C3">
+          <wp:anchor distT="0" distB="0" distL="114300" distR="114300" simplePos="0" relativeHeight="251667456" behindDoc="0" locked="0" layoutInCell="1" allowOverlap="1" wp14:anchorId="6A7C286A" wp14:editId="56F56A74">
             <wp:simplePos x="0" y="0"/>
             <wp:positionH relativeFrom="column">
-              <wp:posOffset>-3175</wp:posOffset>
+              <wp:posOffset>2912110</wp:posOffset>
             </wp:positionH>
             <wp:positionV relativeFrom="paragraph">
-              <wp:posOffset>198755</wp:posOffset>
+              <wp:posOffset>0</wp:posOffset>
+            </wp:positionV>
+            <wp:extent cx="2886710" cy="2170430"/>
+            <wp:effectExtent l="0" t="0" r="8890" b="1270"/>
+            <wp:wrapSquare wrapText="bothSides"/>
+            <wp:docPr id="14" name="Рисунок 14"/>
+            <wp:cNvGraphicFramePr>
+              <a:graphicFrameLocks xmlns:a="http://schemas.openxmlformats.org/drawingml/2006/main" noChangeAspect="1"/>
+            </wp:cNvGraphicFramePr>
+            <a:graphic xmlns:a="http://schemas.openxmlformats.org/drawingml/2006/main">
+              <a:graphicData uri="http://schemas.openxmlformats.org/drawingml/2006/picture">
+                <pic:pic xmlns:pic="http://schemas.openxmlformats.org/drawingml/2006/picture">
+                  <pic:nvPicPr>
+                    <pic:cNvPr id="0" name="Picture 11"/>
+                    <pic:cNvPicPr>
+                      <a:picLocks noChangeAspect="1" noChangeArrowheads="1"/>
+                    </pic:cNvPicPr>
+                  </pic:nvPicPr>
+                  <pic:blipFill>
+                    <a:blip r:embed="rId19" cstate="print">
+                      <a:extLst>
+                        <a:ext uri="{28A0092B-C50C-407E-A947-70E740481C1C}">
+                          <a14:useLocalDpi xmlns:a14="http://schemas.microsoft.com/office/drawing/2010/main" val="0"/>
+                        </a:ext>
+                      </a:extLst>
+                    </a:blip>
+                    <a:srcRect/>
+                    <a:stretch>
+                      <a:fillRect/>
+                    </a:stretch>
+                  </pic:blipFill>
+                  <pic:spPr bwMode="auto">
+                    <a:xfrm>
+                      <a:off x="0" y="0"/>
+                      <a:ext cx="2886710" cy="2170430"/>
+                    </a:xfrm>
+                    <a:prstGeom prst="rect">
+                      <a:avLst/>
+                    </a:prstGeom>
+                    <a:noFill/>
+                    <a:ln>
+                      <a:noFill/>
+                    </a:ln>
+                  </pic:spPr>
+                </pic:pic>
+              </a:graphicData>
+            </a:graphic>
+            <wp14:sizeRelH relativeFrom="margin">
+              <wp14:pctWidth>0</wp14:pctWidth>
+            </wp14:sizeRelH>
+            <wp14:sizeRelV relativeFrom="margin">
+              <wp14:pctHeight>0</wp14:pctHeight>
+            </wp14:sizeRelV>
+          </wp:anchor>
+        </w:drawing>
+      </w:r>
+      <w:r>
+        <w:rPr>
+          <w:noProof/>
+        </w:rPr>
+        <w:drawing>
+          <wp:anchor distT="0" distB="0" distL="114300" distR="114300" simplePos="0" relativeHeight="251666432" behindDoc="0" locked="0" layoutInCell="1" allowOverlap="1" wp14:anchorId="3C6ADBB9" wp14:editId="78FF4250">
+            <wp:simplePos x="0" y="0"/>
+            <wp:positionH relativeFrom="column">
+              <wp:posOffset>-1905</wp:posOffset>
+            </wp:positionH>
+            <wp:positionV relativeFrom="paragraph">
+              <wp:posOffset>134</wp:posOffset>
+            </wp:positionV>
+            <wp:extent cx="2886710" cy="2167890"/>
+            <wp:effectExtent l="0" t="0" r="8890" b="3810"/>
+            <wp:wrapSquare wrapText="bothSides"/>
+            <wp:docPr id="15" name="Рисунок 15"/>
+            <wp:cNvGraphicFramePr>
+              <a:graphicFrameLocks xmlns:a="http://schemas.openxmlformats.org/drawingml/2006/main" noChangeAspect="1"/>
+            </wp:cNvGraphicFramePr>
+            <a:graphic xmlns:a="http://schemas.openxmlformats.org/drawingml/2006/main">
+              <a:graphicData uri="http://schemas.openxmlformats.org/drawingml/2006/picture">
+                <pic:pic xmlns:pic="http://schemas.openxmlformats.org/drawingml/2006/picture">
+                  <pic:nvPicPr>
+                    <pic:cNvPr id="0" name="Picture 12"/>
+                    <pic:cNvPicPr>
+                      <a:picLocks noChangeAspect="1" noChangeArrowheads="1"/>
+                    </pic:cNvPicPr>
+                  </pic:nvPicPr>
+                  <pic:blipFill>
+                    <a:blip r:embed="rId20" cstate="print">
+                      <a:extLst>
+                        <a:ext uri="{28A0092B-C50C-407E-A947-70E740481C1C}">
+                          <a14:useLocalDpi xmlns:a14="http://schemas.microsoft.com/office/drawing/2010/main" val="0"/>
+                        </a:ext>
+                      </a:extLst>
+                    </a:blip>
+                    <a:srcRect/>
+                    <a:stretch>
+                      <a:fillRect/>
+                    </a:stretch>
+                  </pic:blipFill>
+                  <pic:spPr bwMode="auto">
+                    <a:xfrm>
+                      <a:off x="0" y="0"/>
+                      <a:ext cx="2886710" cy="2167890"/>
+                    </a:xfrm>
+                    <a:prstGeom prst="rect">
+                      <a:avLst/>
+                    </a:prstGeom>
+                    <a:noFill/>
+                    <a:ln>
+                      <a:noFill/>
+                    </a:ln>
+                  </pic:spPr>
+                </pic:pic>
+              </a:graphicData>
+            </a:graphic>
+            <wp14:sizeRelH relativeFrom="margin">
+              <wp14:pctWidth>0</wp14:pctWidth>
+            </wp14:sizeRelH>
+            <wp14:sizeRelV relativeFrom="margin">
+              <wp14:pctHeight>0</wp14:pctHeight>
+            </wp14:sizeRelV>
+          </wp:anchor>
+        </w:drawing>
+      </w:r>
+    </w:p>
+    <w:p>
+      <w:pPr>
+        <w:suppressAutoHyphens/>
+        <w:spacing w:line="276" w:lineRule="auto"/>
+        <w:rPr>
+          <w:rFonts w:asciiTheme="majorBidi" w:hAnsiTheme="majorBidi" w:cstheme="majorBidi"/>
+          <w:noProof/>
+          <w:lang w:val="ru-RU"/>
+        </w:rPr>
+      </w:pPr>
+      <w:r>
+        <w:rPr>
+          <w:rFonts w:asciiTheme="majorBidi" w:hAnsiTheme="majorBidi" w:cstheme="majorBidi"/>
+          <w:noProof/>
+          <w:lang w:val="ru-RU"/>
+        </w:rPr>
+        <w:t>(в)</w:t>
+      </w:r>
+    </w:p>
+    <w:p>
+      <w:pPr>
+        <w:suppressAutoHyphens/>
+        <w:spacing w:line="276" w:lineRule="auto"/>
+        <w:rPr>
+          <w:rFonts w:asciiTheme="majorBidi" w:hAnsiTheme="majorBidi" w:cstheme="majorBidi"/>
+          <w:noProof/>
+          <w:lang w:val="en-US"/>
+        </w:rPr>
+      </w:pPr>
+    </w:p>
+    <w:p>
+      <w:pPr>
+        <w:suppressAutoHyphens/>
+        <w:spacing w:line="276" w:lineRule="auto"/>
+        <w:rPr>
+          <w:rFonts w:asciiTheme="majorBidi" w:hAnsiTheme="majorBidi" w:cstheme="majorBidi"/>
+          <w:noProof/>
+          <w:lang w:val="ru-RU"/>
+        </w:rPr>
+      </w:pPr>
+      <w:r>
+        <w:rPr>
+          <w:noProof/>
+        </w:rPr>
+        <w:drawing>
+          <wp:anchor distT="0" distB="0" distL="114300" distR="114300" simplePos="0" relativeHeight="251661312" behindDoc="0" locked="0" layoutInCell="1" allowOverlap="1" wp14:anchorId="188D5F1A" wp14:editId="5B4B20BB">
+            <wp:simplePos x="0" y="0"/>
+            <wp:positionH relativeFrom="column">
+              <wp:posOffset>702</wp:posOffset>
+            </wp:positionH>
+            <wp:positionV relativeFrom="paragraph">
+              <wp:posOffset>295242</wp:posOffset>
             </wp:positionV>
             <wp:extent cx="4073525" cy="2465070"/>
             <wp:effectExtent l="0" t="0" r="3175" b="0"/>
@@ -5983,7 +7641,7 @@
                     </pic:cNvPicPr>
                   </pic:nvPicPr>
                   <pic:blipFill>
-                    <a:blip r:embed="rId15" cstate="print">
+                    <a:blip r:embed="rId21" cstate="print">
                       <a:extLst>
                         <a:ext uri="{28A0092B-C50C-407E-A947-70E740481C1C}">
                           <a14:useLocalDpi xmlns:a14="http://schemas.microsoft.com/office/drawing/2010/main" val="0"/>
@@ -6026,14 +7684,27 @@
           <w:noProof/>
           <w:lang w:val="ru-RU"/>
         </w:rPr>
-        <w:t>Рисунок 6.</w:t>
-      </w:r>
-      <w:r>
-        <w:t xml:space="preserve"> </w:t>
+        <w:t xml:space="preserve">Рисунок </w:t>
+      </w:r>
+      <w:r>
+        <w:rPr>
+          <w:rFonts w:asciiTheme="majorBidi" w:hAnsiTheme="majorBidi" w:cstheme="majorBidi"/>
+          <w:noProof/>
+          <w:lang w:val="ru-RU"/>
+        </w:rPr>
+        <w:t>7</w:t>
+      </w:r>
+      <w:r>
+        <w:rPr>
+          <w:rFonts w:asciiTheme="majorBidi" w:hAnsiTheme="majorBidi" w:cstheme="majorBidi"/>
+          <w:noProof/>
+          <w:lang w:val="ru-RU"/>
+        </w:rPr>
+        <w:t>.</w:t>
       </w:r>
     </w:p>
     <w:sectPr>
-      <w:headerReference w:type="default" r:id="rId16"/>
+      <w:headerReference w:type="default" r:id="rId22"/>
       <w:pgSz w:w="11900" w:h="16840" w:code="1"/>
       <w:pgMar w:top="1134" w:right="1361" w:bottom="1134" w:left="1361" w:header="1644" w:footer="1985" w:gutter="0"/>
       <w:pgNumType w:start="1"/>
@@ -6047,7 +7718,7 @@
 </file>
 
 <file path=word/endnotes.xml><?xml version="1.0" encoding="utf-8"?>
-<w:endnotes xmlns:wpc="http://schemas.microsoft.com/office/word/2010/wordprocessingCanvas" xmlns:cx="http://schemas.microsoft.com/office/drawing/2014/chartex" xmlns:cx1="http://schemas.microsoft.com/office/drawing/2015/9/8/chartex" xmlns:cx2="http://schemas.microsoft.com/office/drawing/2015/10/21/chartex" xmlns:cx3="http://schemas.microsoft.com/office/drawing/2016/5/9/chartex" xmlns:cx4="http://schemas.microsoft.com/office/drawing/2016/5/10/chartex" xmlns:cx5="http://schemas.microsoft.com/office/drawing/2016/5/11/chartex" xmlns:cx6="http://schemas.microsoft.com/office/drawing/2016/5/12/chartex" xmlns:cx7="http://schemas.microsoft.com/office/drawing/2016/5/13/chartex" xmlns:cx8="http://schemas.microsoft.com/office/drawing/2016/5/14/chartex" xmlns:mc="http://schemas.openxmlformats.org/markup-compatibility/2006" xmlns:aink="http://schemas.microsoft.com/office/drawing/2016/ink" xmlns:am3d="http://schemas.microsoft.com/office/drawing/2017/model3d" xmlns:o="urn:schemas-microsoft-com:office:office" xmlns:oel="http://schemas.microsoft.com/office/2019/extlst" xmlns:r="http://schemas.openxmlformats.org/officeDocument/2006/relationships" xmlns:m="http://schemas.openxmlformats.org/officeDocument/2006/math" xmlns:v="urn:schemas-microsoft-com:vml" xmlns:wp14="http://schemas.microsoft.com/office/word/2010/wordprocessingDrawing" xmlns:wp="http://schemas.openxmlformats.org/drawingml/2006/wordprocessingDrawing" xmlns:w10="urn:schemas-microsoft-com:office:word" xmlns:w="http://schemas.openxmlformats.org/wordprocessingml/2006/main" xmlns:w14="http://schemas.microsoft.com/office/word/2010/wordml" xmlns:w15="http://schemas.microsoft.com/office/word/2012/wordml" xmlns:w16cex="http://schemas.microsoft.com/office/word/2018/wordml/cex" xmlns:w16cid="http://schemas.microsoft.com/office/word/2016/wordml/cid" xmlns:w16="http://schemas.microsoft.com/office/word/2018/wordml" xmlns:w16sdtdh="http://schemas.microsoft.com/office/word/2020/wordml/sdtdatahash" xmlns:w16se="http://schemas.microsoft.com/office/word/2015/wordml/symex" xmlns:wpg="http://schemas.microsoft.com/office/word/2010/wordprocessingGroup" xmlns:wpi="http://schemas.microsoft.com/office/word/2010/wordprocessingInk" xmlns:wne="http://schemas.microsoft.com/office/word/2006/wordml" xmlns:wps="http://schemas.microsoft.com/office/word/2010/wordprocessingShape" mc:Ignorable="w14 w15 w16se w16cid w16 w16cex w16sdtdh wp14">
+<w:endnotes xmlns:wpc="http://schemas.microsoft.com/office/word/2010/wordprocessingCanvas" xmlns:cx="http://schemas.microsoft.com/office/drawing/2014/chartex" xmlns:cx1="http://schemas.microsoft.com/office/drawing/2015/9/8/chartex" xmlns:cx2="http://schemas.microsoft.com/office/drawing/2015/10/21/chartex" xmlns:cx3="http://schemas.microsoft.com/office/drawing/2016/5/9/chartex" xmlns:cx4="http://schemas.microsoft.com/office/drawing/2016/5/10/chartex" xmlns:cx5="http://schemas.microsoft.com/office/drawing/2016/5/11/chartex" xmlns:cx6="http://schemas.microsoft.com/office/drawing/2016/5/12/chartex" xmlns:cx7="http://schemas.microsoft.com/office/drawing/2016/5/13/chartex" xmlns:cx8="http://schemas.microsoft.com/office/drawing/2016/5/14/chartex" xmlns:mc="http://schemas.openxmlformats.org/markup-compatibility/2006" xmlns:aink="http://schemas.microsoft.com/office/drawing/2016/ink" xmlns:am3d="http://schemas.microsoft.com/office/drawing/2017/model3d" xmlns:o="urn:schemas-microsoft-com:office:office" xmlns:r="http://schemas.openxmlformats.org/officeDocument/2006/relationships" xmlns:m="http://schemas.openxmlformats.org/officeDocument/2006/math" xmlns:v="urn:schemas-microsoft-com:vml" xmlns:wp14="http://schemas.microsoft.com/office/word/2010/wordprocessingDrawing" xmlns:wp="http://schemas.openxmlformats.org/drawingml/2006/wordprocessingDrawing" xmlns:w10="urn:schemas-microsoft-com:office:word" xmlns:w="http://schemas.openxmlformats.org/wordprocessingml/2006/main" xmlns:w14="http://schemas.microsoft.com/office/word/2010/wordml" xmlns:w15="http://schemas.microsoft.com/office/word/2012/wordml" xmlns:w16cex="http://schemas.microsoft.com/office/word/2018/wordml/cex" xmlns:w16cid="http://schemas.microsoft.com/office/word/2016/wordml/cid" xmlns:w16="http://schemas.microsoft.com/office/word/2018/wordml" xmlns:w16sdtdh="http://schemas.microsoft.com/office/word/2020/wordml/sdtdatahash" xmlns:w16se="http://schemas.microsoft.com/office/word/2015/wordml/symex" xmlns:wpg="http://schemas.microsoft.com/office/word/2010/wordprocessingGroup" xmlns:wpi="http://schemas.microsoft.com/office/word/2010/wordprocessingInk" xmlns:wne="http://schemas.microsoft.com/office/word/2006/wordml" xmlns:wps="http://schemas.microsoft.com/office/word/2010/wordprocessingShape" mc:Ignorable="w14 w15 w16se w16cid w16 w16cex w16sdtdh wp14">
   <w:endnote w:type="separator" w:id="-1">
     <w:p>
       <w:r>
@@ -6066,7 +7737,7 @@
 </file>
 
 <file path=word/footnotes.xml><?xml version="1.0" encoding="utf-8"?>
-<w:footnotes xmlns:wpc="http://schemas.microsoft.com/office/word/2010/wordprocessingCanvas" xmlns:cx="http://schemas.microsoft.com/office/drawing/2014/chartex" xmlns:cx1="http://schemas.microsoft.com/office/drawing/2015/9/8/chartex" xmlns:cx2="http://schemas.microsoft.com/office/drawing/2015/10/21/chartex" xmlns:cx3="http://schemas.microsoft.com/office/drawing/2016/5/9/chartex" xmlns:cx4="http://schemas.microsoft.com/office/drawing/2016/5/10/chartex" xmlns:cx5="http://schemas.microsoft.com/office/drawing/2016/5/11/chartex" xmlns:cx6="http://schemas.microsoft.com/office/drawing/2016/5/12/chartex" xmlns:cx7="http://schemas.microsoft.com/office/drawing/2016/5/13/chartex" xmlns:cx8="http://schemas.microsoft.com/office/drawing/2016/5/14/chartex" xmlns:mc="http://schemas.openxmlformats.org/markup-compatibility/2006" xmlns:aink="http://schemas.microsoft.com/office/drawing/2016/ink" xmlns:am3d="http://schemas.microsoft.com/office/drawing/2017/model3d" xmlns:o="urn:schemas-microsoft-com:office:office" xmlns:oel="http://schemas.microsoft.com/office/2019/extlst" xmlns:r="http://schemas.openxmlformats.org/officeDocument/2006/relationships" xmlns:m="http://schemas.openxmlformats.org/officeDocument/2006/math" xmlns:v="urn:schemas-microsoft-com:vml" xmlns:wp14="http://schemas.microsoft.com/office/word/2010/wordprocessingDrawing" xmlns:wp="http://schemas.openxmlformats.org/drawingml/2006/wordprocessingDrawing" xmlns:w10="urn:schemas-microsoft-com:office:word" xmlns:w="http://schemas.openxmlformats.org/wordprocessingml/2006/main" xmlns:w14="http://schemas.microsoft.com/office/word/2010/wordml" xmlns:w15="http://schemas.microsoft.com/office/word/2012/wordml" xmlns:w16cex="http://schemas.microsoft.com/office/word/2018/wordml/cex" xmlns:w16cid="http://schemas.microsoft.com/office/word/2016/wordml/cid" xmlns:w16="http://schemas.microsoft.com/office/word/2018/wordml" xmlns:w16sdtdh="http://schemas.microsoft.com/office/word/2020/wordml/sdtdatahash" xmlns:w16se="http://schemas.microsoft.com/office/word/2015/wordml/symex" xmlns:wpg="http://schemas.microsoft.com/office/word/2010/wordprocessingGroup" xmlns:wpi="http://schemas.microsoft.com/office/word/2010/wordprocessingInk" xmlns:wne="http://schemas.microsoft.com/office/word/2006/wordml" xmlns:wps="http://schemas.microsoft.com/office/word/2010/wordprocessingShape" mc:Ignorable="w14 w15 w16se w16cid w16 w16cex w16sdtdh wp14">
+<w:footnotes xmlns:wpc="http://schemas.microsoft.com/office/word/2010/wordprocessingCanvas" xmlns:cx="http://schemas.microsoft.com/office/drawing/2014/chartex" xmlns:cx1="http://schemas.microsoft.com/office/drawing/2015/9/8/chartex" xmlns:cx2="http://schemas.microsoft.com/office/drawing/2015/10/21/chartex" xmlns:cx3="http://schemas.microsoft.com/office/drawing/2016/5/9/chartex" xmlns:cx4="http://schemas.microsoft.com/office/drawing/2016/5/10/chartex" xmlns:cx5="http://schemas.microsoft.com/office/drawing/2016/5/11/chartex" xmlns:cx6="http://schemas.microsoft.com/office/drawing/2016/5/12/chartex" xmlns:cx7="http://schemas.microsoft.com/office/drawing/2016/5/13/chartex" xmlns:cx8="http://schemas.microsoft.com/office/drawing/2016/5/14/chartex" xmlns:mc="http://schemas.openxmlformats.org/markup-compatibility/2006" xmlns:aink="http://schemas.microsoft.com/office/drawing/2016/ink" xmlns:am3d="http://schemas.microsoft.com/office/drawing/2017/model3d" xmlns:o="urn:schemas-microsoft-com:office:office" xmlns:r="http://schemas.openxmlformats.org/officeDocument/2006/relationships" xmlns:m="http://schemas.openxmlformats.org/officeDocument/2006/math" xmlns:v="urn:schemas-microsoft-com:vml" xmlns:wp14="http://schemas.microsoft.com/office/word/2010/wordprocessingDrawing" xmlns:wp="http://schemas.openxmlformats.org/drawingml/2006/wordprocessingDrawing" xmlns:w10="urn:schemas-microsoft-com:office:word" xmlns:w="http://schemas.openxmlformats.org/wordprocessingml/2006/main" xmlns:w14="http://schemas.microsoft.com/office/word/2010/wordml" xmlns:w15="http://schemas.microsoft.com/office/word/2012/wordml" xmlns:w16cex="http://schemas.microsoft.com/office/word/2018/wordml/cex" xmlns:w16cid="http://schemas.microsoft.com/office/word/2016/wordml/cid" xmlns:w16="http://schemas.microsoft.com/office/word/2018/wordml" xmlns:w16sdtdh="http://schemas.microsoft.com/office/word/2020/wordml/sdtdatahash" xmlns:w16se="http://schemas.microsoft.com/office/word/2015/wordml/symex" xmlns:wpg="http://schemas.microsoft.com/office/word/2010/wordprocessingGroup" xmlns:wpi="http://schemas.microsoft.com/office/word/2010/wordprocessingInk" xmlns:wne="http://schemas.microsoft.com/office/word/2006/wordml" xmlns:wps="http://schemas.microsoft.com/office/word/2010/wordprocessingShape" mc:Ignorable="w14 w15 w16se w16cid w16 w16cex w16sdtdh wp14">
   <w:footnote w:type="separator" w:id="-1">
     <w:p>
       <w:r>
@@ -6085,7 +7756,7 @@
 </file>
 
 <file path=word/header1.xml><?xml version="1.0" encoding="utf-8"?>
-<w:hdr xmlns:wpc="http://schemas.microsoft.com/office/word/2010/wordprocessingCanvas" xmlns:cx="http://schemas.microsoft.com/office/drawing/2014/chartex" xmlns:cx1="http://schemas.microsoft.com/office/drawing/2015/9/8/chartex" xmlns:cx2="http://schemas.microsoft.com/office/drawing/2015/10/21/chartex" xmlns:cx3="http://schemas.microsoft.com/office/drawing/2016/5/9/chartex" xmlns:cx4="http://schemas.microsoft.com/office/drawing/2016/5/10/chartex" xmlns:cx5="http://schemas.microsoft.com/office/drawing/2016/5/11/chartex" xmlns:cx6="http://schemas.microsoft.com/office/drawing/2016/5/12/chartex" xmlns:cx7="http://schemas.microsoft.com/office/drawing/2016/5/13/chartex" xmlns:cx8="http://schemas.microsoft.com/office/drawing/2016/5/14/chartex" xmlns:mc="http://schemas.openxmlformats.org/markup-compatibility/2006" xmlns:aink="http://schemas.microsoft.com/office/drawing/2016/ink" xmlns:am3d="http://schemas.microsoft.com/office/drawing/2017/model3d" xmlns:o="urn:schemas-microsoft-com:office:office" xmlns:oel="http://schemas.microsoft.com/office/2019/extlst" xmlns:r="http://schemas.openxmlformats.org/officeDocument/2006/relationships" xmlns:m="http://schemas.openxmlformats.org/officeDocument/2006/math" xmlns:v="urn:schemas-microsoft-com:vml" xmlns:wp14="http://schemas.microsoft.com/office/word/2010/wordprocessingDrawing" xmlns:wp="http://schemas.openxmlformats.org/drawingml/2006/wordprocessingDrawing" xmlns:w10="urn:schemas-microsoft-com:office:word" xmlns:w="http://schemas.openxmlformats.org/wordprocessingml/2006/main" xmlns:w14="http://schemas.microsoft.com/office/word/2010/wordml" xmlns:w15="http://schemas.microsoft.com/office/word/2012/wordml" xmlns:w16cex="http://schemas.microsoft.com/office/word/2018/wordml/cex" xmlns:w16cid="http://schemas.microsoft.com/office/word/2016/wordml/cid" xmlns:w16="http://schemas.microsoft.com/office/word/2018/wordml" xmlns:w16sdtdh="http://schemas.microsoft.com/office/word/2020/wordml/sdtdatahash" xmlns:w16se="http://schemas.microsoft.com/office/word/2015/wordml/symex" xmlns:wpg="http://schemas.microsoft.com/office/word/2010/wordprocessingGroup" xmlns:wpi="http://schemas.microsoft.com/office/word/2010/wordprocessingInk" xmlns:wne="http://schemas.microsoft.com/office/word/2006/wordml" xmlns:wps="http://schemas.microsoft.com/office/word/2010/wordprocessingShape" mc:Ignorable="w14 w15 w16se w16cid w16 w16cex w16sdtdh wp14">
+<w:hdr xmlns:wpc="http://schemas.microsoft.com/office/word/2010/wordprocessingCanvas" xmlns:cx="http://schemas.microsoft.com/office/drawing/2014/chartex" xmlns:cx1="http://schemas.microsoft.com/office/drawing/2015/9/8/chartex" xmlns:cx2="http://schemas.microsoft.com/office/drawing/2015/10/21/chartex" xmlns:cx3="http://schemas.microsoft.com/office/drawing/2016/5/9/chartex" xmlns:cx4="http://schemas.microsoft.com/office/drawing/2016/5/10/chartex" xmlns:cx5="http://schemas.microsoft.com/office/drawing/2016/5/11/chartex" xmlns:cx6="http://schemas.microsoft.com/office/drawing/2016/5/12/chartex" xmlns:cx7="http://schemas.microsoft.com/office/drawing/2016/5/13/chartex" xmlns:cx8="http://schemas.microsoft.com/office/drawing/2016/5/14/chartex" xmlns:mc="http://schemas.openxmlformats.org/markup-compatibility/2006" xmlns:aink="http://schemas.microsoft.com/office/drawing/2016/ink" xmlns:am3d="http://schemas.microsoft.com/office/drawing/2017/model3d" xmlns:o="urn:schemas-microsoft-com:office:office" xmlns:r="http://schemas.openxmlformats.org/officeDocument/2006/relationships" xmlns:m="http://schemas.openxmlformats.org/officeDocument/2006/math" xmlns:v="urn:schemas-microsoft-com:vml" xmlns:wp14="http://schemas.microsoft.com/office/word/2010/wordprocessingDrawing" xmlns:wp="http://schemas.openxmlformats.org/drawingml/2006/wordprocessingDrawing" xmlns:w10="urn:schemas-microsoft-com:office:word" xmlns:w="http://schemas.openxmlformats.org/wordprocessingml/2006/main" xmlns:w14="http://schemas.microsoft.com/office/word/2010/wordml" xmlns:w15="http://schemas.microsoft.com/office/word/2012/wordml" xmlns:w16cex="http://schemas.microsoft.com/office/word/2018/wordml/cex" xmlns:w16cid="http://schemas.microsoft.com/office/word/2016/wordml/cid" xmlns:w16="http://schemas.microsoft.com/office/word/2018/wordml" xmlns:w16sdtdh="http://schemas.microsoft.com/office/word/2020/wordml/sdtdatahash" xmlns:w16se="http://schemas.microsoft.com/office/word/2015/wordml/symex" xmlns:wpg="http://schemas.microsoft.com/office/word/2010/wordprocessingGroup" xmlns:wpi="http://schemas.microsoft.com/office/word/2010/wordprocessingInk" xmlns:wne="http://schemas.microsoft.com/office/word/2006/wordml" xmlns:wps="http://schemas.microsoft.com/office/word/2010/wordprocessingShape" mc:Ignorable="w14 w15 w16se w16cid w16 w16cex w16sdtdh wp14">
   <w:p>
     <w:pPr>
       <w:pStyle w:val="a8"/>
@@ -6099,7 +7770,7 @@
 </file>
 
 <file path=word/numbering.xml><?xml version="1.0" encoding="utf-8"?>
-<w:numbering xmlns:wpc="http://schemas.microsoft.com/office/word/2010/wordprocessingCanvas" xmlns:cx="http://schemas.microsoft.com/office/drawing/2014/chartex" xmlns:cx1="http://schemas.microsoft.com/office/drawing/2015/9/8/chartex" xmlns:cx2="http://schemas.microsoft.com/office/drawing/2015/10/21/chartex" xmlns:cx3="http://schemas.microsoft.com/office/drawing/2016/5/9/chartex" xmlns:cx4="http://schemas.microsoft.com/office/drawing/2016/5/10/chartex" xmlns:cx5="http://schemas.microsoft.com/office/drawing/2016/5/11/chartex" xmlns:cx6="http://schemas.microsoft.com/office/drawing/2016/5/12/chartex" xmlns:cx7="http://schemas.microsoft.com/office/drawing/2016/5/13/chartex" xmlns:cx8="http://schemas.microsoft.com/office/drawing/2016/5/14/chartex" xmlns:mc="http://schemas.openxmlformats.org/markup-compatibility/2006" xmlns:aink="http://schemas.microsoft.com/office/drawing/2016/ink" xmlns:am3d="http://schemas.microsoft.com/office/drawing/2017/model3d" xmlns:o="urn:schemas-microsoft-com:office:office" xmlns:oel="http://schemas.microsoft.com/office/2019/extlst" xmlns:r="http://schemas.openxmlformats.org/officeDocument/2006/relationships" xmlns:m="http://schemas.openxmlformats.org/officeDocument/2006/math" xmlns:v="urn:schemas-microsoft-com:vml" xmlns:wp14="http://schemas.microsoft.com/office/word/2010/wordprocessingDrawing" xmlns:wp="http://schemas.openxmlformats.org/drawingml/2006/wordprocessingDrawing" xmlns:w10="urn:schemas-microsoft-com:office:word" xmlns:w="http://schemas.openxmlformats.org/wordprocessingml/2006/main" xmlns:w14="http://schemas.microsoft.com/office/word/2010/wordml" xmlns:w15="http://schemas.microsoft.com/office/word/2012/wordml" xmlns:w16cex="http://schemas.microsoft.com/office/word/2018/wordml/cex" xmlns:w16cid="http://schemas.microsoft.com/office/word/2016/wordml/cid" xmlns:w16="http://schemas.microsoft.com/office/word/2018/wordml" xmlns:w16sdtdh="http://schemas.microsoft.com/office/word/2020/wordml/sdtdatahash" xmlns:w16se="http://schemas.microsoft.com/office/word/2015/wordml/symex" xmlns:wpg="http://schemas.microsoft.com/office/word/2010/wordprocessingGroup" xmlns:wpi="http://schemas.microsoft.com/office/word/2010/wordprocessingInk" xmlns:wne="http://schemas.microsoft.com/office/word/2006/wordml" xmlns:wps="http://schemas.microsoft.com/office/word/2010/wordprocessingShape" mc:Ignorable="w14 w15 w16se w16cid w16 w16cex w16sdtdh wp14">
+<w:numbering xmlns:wpc="http://schemas.microsoft.com/office/word/2010/wordprocessingCanvas" xmlns:cx="http://schemas.microsoft.com/office/drawing/2014/chartex" xmlns:cx1="http://schemas.microsoft.com/office/drawing/2015/9/8/chartex" xmlns:cx2="http://schemas.microsoft.com/office/drawing/2015/10/21/chartex" xmlns:cx3="http://schemas.microsoft.com/office/drawing/2016/5/9/chartex" xmlns:cx4="http://schemas.microsoft.com/office/drawing/2016/5/10/chartex" xmlns:cx5="http://schemas.microsoft.com/office/drawing/2016/5/11/chartex" xmlns:cx6="http://schemas.microsoft.com/office/drawing/2016/5/12/chartex" xmlns:cx7="http://schemas.microsoft.com/office/drawing/2016/5/13/chartex" xmlns:cx8="http://schemas.microsoft.com/office/drawing/2016/5/14/chartex" xmlns:mc="http://schemas.openxmlformats.org/markup-compatibility/2006" xmlns:aink="http://schemas.microsoft.com/office/drawing/2016/ink" xmlns:am3d="http://schemas.microsoft.com/office/drawing/2017/model3d" xmlns:o="urn:schemas-microsoft-com:office:office" xmlns:r="http://schemas.openxmlformats.org/officeDocument/2006/relationships" xmlns:m="http://schemas.openxmlformats.org/officeDocument/2006/math" xmlns:v="urn:schemas-microsoft-com:vml" xmlns:wp14="http://schemas.microsoft.com/office/word/2010/wordprocessingDrawing" xmlns:wp="http://schemas.openxmlformats.org/drawingml/2006/wordprocessingDrawing" xmlns:w10="urn:schemas-microsoft-com:office:word" xmlns:w="http://schemas.openxmlformats.org/wordprocessingml/2006/main" xmlns:w14="http://schemas.microsoft.com/office/word/2010/wordml" xmlns:w15="http://schemas.microsoft.com/office/word/2012/wordml" xmlns:w16cex="http://schemas.microsoft.com/office/word/2018/wordml/cex" xmlns:w16cid="http://schemas.microsoft.com/office/word/2016/wordml/cid" xmlns:w16="http://schemas.microsoft.com/office/word/2018/wordml" xmlns:w16sdtdh="http://schemas.microsoft.com/office/word/2020/wordml/sdtdatahash" xmlns:w16se="http://schemas.microsoft.com/office/word/2015/wordml/symex" xmlns:wpg="http://schemas.microsoft.com/office/word/2010/wordprocessingGroup" xmlns:wpi="http://schemas.microsoft.com/office/word/2010/wordprocessingInk" xmlns:wne="http://schemas.microsoft.com/office/word/2006/wordml" xmlns:wps="http://schemas.microsoft.com/office/word/2010/wordprocessingShape" mc:Ignorable="w14 w15 w16se w16cid w16 w16cex w16sdtdh wp14">
   <w:abstractNum w:abstractNumId="0" w15:restartNumberingAfterBreak="0">
     <w:nsid w:val="674758AB"/>
     <w:multiLevelType w:val="hybridMultilevel"/>
@@ -6189,7 +7860,7 @@
       </w:pPr>
     </w:lvl>
   </w:abstractNum>
-  <w:num w:numId="1" w16cid:durableId="2019767098">
+  <w:num w:numId="1">
     <w:abstractNumId w:val="0"/>
   </w:num>
 </w:numbering>

</xml_diff>